<commit_message>
Update manuscript: numbered sections, dataset excerpts in the supplement
</commit_message>
<xml_diff>
--- a/manuscript/Supplementary_material.docx
+++ b/manuscript/Supplementary_material.docx
@@ -33,16 +33,27 @@
       <w:r>
         <w:rPr>
           <w:rFonts w:asciiTheme="majorBidi" w:hAnsiTheme="majorBidi" w:cstheme="majorBidi"/>
+          <w:b/>
+          <w:bCs/>
           <w:sz w:val="21"/>
           <w:szCs w:val="21"/>
         </w:rPr>
-        <w:t xml:space="preserve">This document accompanies the manuscript “Isolating the Contribution of Deep Neural Networks in Hybrid Scan-Based MPPT Controllers Under Partial Shading”. It contains the statistical-robustness, design-ablation, boost-converter and sensor-noise/quantization studies summarized in the section “Robustness studies” of the main text. Table and figure numbers without the prefix S refer to the main text.</w:t>
+        <w:t xml:space="preserve">Article:</w:t>
+      </w:r>
+      <w:r>
+        <w:rPr>
+          <w:rFonts w:asciiTheme="majorBidi" w:hAnsiTheme="majorBidi" w:cstheme="majorBidi"/>
+          <w:sz w:val="21"/>
+          <w:szCs w:val="21"/>
+        </w:rPr>
+        <w:t xml:space="preserve"> Isolating the Contribution of Deep Neural Networks in Hybrid Scan-Based MPPT Controllers Under Partial Shading</w:t>
       </w:r>
     </w:p>
     <w:p>
       <w:pPr>
-        <w:keepNext/>
-        <w:spacing w:before="200" w:after="80"/>
+        <w:spacing w:after="80" w:line="252" w:lineRule="auto"/>
+        <w:ind w:firstLine="284"/>
+        <w:jc w:val="both"/>
       </w:pPr>
       <w:r>
         <w:rPr>
@@ -52,22 +63,2887 @@
           <w:sz w:val="21"/>
           <w:szCs w:val="21"/>
         </w:rPr>
-        <w:t xml:space="preserve">Statistical robustness</w:t>
+        <w:t xml:space="preserve">Journal:</w:t>
       </w:r>
-    </w:p>
-    <w:p>
-      <w:pPr>
-        <w:spacing w:after="80" w:line="252" w:lineRule="auto"/>
-        <w:ind w:firstLine="284"/>
-        <w:jc w:val="both"/>
-      </w:pPr>
       <w:r>
         <w:rPr>
           <w:rFonts w:asciiTheme="majorBidi" w:hAnsiTheme="majorBidi" w:cstheme="majorBidi"/>
           <w:sz w:val="21"/>
           <w:szCs w:val="21"/>
         </w:rPr>
-        <w:t xml:space="preserve">To separate real differences from seed noise, the scenario suites were repeated with 10 scenario seeds (which vary the cloud-noise stream, the step instant and the cloud phase), and the stage-1 DNN was retrained with five seeds (paired with the scenario seed modulo 5). Table S1 gives the mean ± standard deviation and Table S2 the paired Wilcoxon signed-rank tests; with only ten pairs, a difference can reach p &lt; 0.05 only if its sign is consistent across the seeds, so small but consistent differences are flagged even when they are practically irrelevant. The seed means differ slightly from the single deterministic runs of Table 11 (for example 99.36% against 99.32% for the hybrid on shading).</w:t>
+        <w:t xml:space="preserve"> The Journal of Supercomputing</w:t>
+      </w:r>
+    </w:p>
+    <w:p>
+      <w:pPr>
+        <w:spacing w:after="80" w:line="252" w:lineRule="auto"/>
+        <w:ind w:firstLine="284"/>
+        <w:jc w:val="both"/>
+      </w:pPr>
+      <w:r>
+        <w:rPr>
+          <w:rFonts w:asciiTheme="majorBidi" w:hAnsiTheme="majorBidi" w:cstheme="majorBidi"/>
+          <w:b/>
+          <w:bCs/>
+          <w:sz w:val="21"/>
+          <w:szCs w:val="21"/>
+        </w:rPr>
+        <w:t xml:space="preserve">Authors:</w:t>
+      </w:r>
+      <w:r>
+        <w:rPr>
+          <w:rFonts w:asciiTheme="majorBidi" w:hAnsiTheme="majorBidi" w:cstheme="majorBidi"/>
+          <w:sz w:val="21"/>
+          <w:szCs w:val="21"/>
+        </w:rPr>
+        <w:t xml:space="preserve"> Waleed Hameed and Kamil Dimililer</w:t>
+      </w:r>
+    </w:p>
+    <w:p>
+      <w:pPr>
+        <w:spacing w:after="80" w:line="252" w:lineRule="auto"/>
+        <w:ind w:firstLine="284"/>
+        <w:jc w:val="both"/>
+      </w:pPr>
+      <w:r>
+        <w:rPr>
+          <w:rFonts w:asciiTheme="majorBidi" w:hAnsiTheme="majorBidi" w:cstheme="majorBidi"/>
+          <w:b/>
+          <w:bCs/>
+          <w:sz w:val="21"/>
+          <w:szCs w:val="21"/>
+        </w:rPr>
+        <w:t xml:space="preserve">Corresponding author:</w:t>
+      </w:r>
+      <w:r>
+        <w:rPr>
+          <w:rFonts w:asciiTheme="majorBidi" w:hAnsiTheme="majorBidi" w:cstheme="majorBidi"/>
+          <w:sz w:val="21"/>
+          <w:szCs w:val="21"/>
+        </w:rPr>
+        <w:t xml:space="preserve"> Waleed Hameed, Department of Electrical Engineering Technologies, Al-Huda University College, Ramadi, Al Anbar, Iraq; waleed.hameed@uoalhuda.edu.iq</w:t>
+      </w:r>
+    </w:p>
+    <w:p>
+      <w:pPr>
+        <w:spacing w:after="80" w:line="252" w:lineRule="auto"/>
+        <w:ind w:firstLine="284"/>
+        <w:jc w:val="both"/>
+      </w:pPr>
+      <w:r>
+        <w:rPr>
+          <w:rFonts w:asciiTheme="majorBidi" w:hAnsiTheme="majorBidi" w:cstheme="majorBidi"/>
+          <w:sz w:val="21"/>
+          <w:szCs w:val="21"/>
+        </w:rPr>
+        <w:t xml:space="preserve">This document accompanies the article. It contains dataset excerpts and the statistical-robustness, design-ablation, boost-converter and sensor-noise/quantization studies summarized in Section 4.7 of the main text. Table and figure numbers without the prefix S refer to the main text.</w:t>
+      </w:r>
+    </w:p>
+    <w:p>
+      <w:pPr>
+        <w:keepNext/>
+        <w:spacing w:before="200" w:after="80"/>
+      </w:pPr>
+      <w:r>
+        <w:rPr>
+          <w:rFonts w:asciiTheme="majorBidi" w:hAnsiTheme="majorBidi" w:cstheme="majorBidi"/>
+          <w:b/>
+          <w:bCs/>
+          <w:sz w:val="21"/>
+          <w:szCs w:val="21"/>
+        </w:rPr>
+        <w:t xml:space="preserve">S1 Dataset excerpts</w:t>
+      </w:r>
+    </w:p>
+    <w:p>
+      <w:pPr>
+        <w:spacing w:before="60" w:after="140" w:line="240" w:lineRule="auto"/>
+        <w:jc w:val="both"/>
+      </w:pPr>
+      <w:r>
+        <w:rPr>
+          <w:rFonts w:asciiTheme="majorBidi" w:hAnsiTheme="majorBidi" w:cstheme="majorBidi"/>
+          <w:sz w:val="18"/>
+          <w:szCs w:val="18"/>
+        </w:rPr>
+        <w:t xml:space="preserve">Table S1 shows twelve rows of the PVGIS-SARAH3 hourly series used in the study and the module quantities computed from them, and Table S2 shows one partially shaded sample as the stage-1 DNN receives it.</w:t>
+      </w:r>
+    </w:p>
+    <w:p>
+      <w:pPr>
+        <w:keepNext/>
+        <w:spacing w:before="60" w:after="140" w:line="240" w:lineRule="auto"/>
+        <w:jc w:val="both"/>
+      </w:pPr>
+      <w:r>
+        <w:rPr>
+          <w:rFonts w:asciiTheme="majorBidi" w:hAnsiTheme="majorBidi" w:cstheme="majorBidi"/>
+          <w:b/>
+          <w:bCs/>
+          <w:sz w:val="18"/>
+          <w:szCs w:val="18"/>
+        </w:rPr>
+        <w:t xml:space="preserve">Table S1</w:t>
+      </w:r>
+      <w:r>
+        <w:rPr>
+          <w:rFonts w:asciiTheme="majorBidi" w:hAnsiTheme="majorBidi" w:cstheme="majorBidi"/>
+          <w:sz w:val="18"/>
+          <w:szCs w:val="18"/>
+        </w:rPr>
+        <w:t xml:space="preserve"> Excerpt of the PVGIS-SARAH3 hourly series (Ramadi, 24 June 2019, first 12 non-zero hours) and the module quantities computed from it. </w:t>
+      </w:r>
+      <w:r>
+        <w:rPr>
+          <w:rFonts w:asciiTheme="majorBidi" w:hAnsiTheme="majorBidi" w:cstheme="majorBidi"/>
+          <w:sz w:val="18"/>
+          <w:szCs w:val="18"/>
+        </w:rPr>
+        <w:t xml:space="preserve">T</w:t>
+      </w:r>
+      <w:r>
+        <w:rPr>
+          <w:rFonts w:asciiTheme="majorBidi" w:hAnsiTheme="majorBidi" w:cstheme="majorBidi"/>
+          <w:sz w:val="18"/>
+          <w:szCs w:val="18"/>
+          <w:vertAlign w:val="subscript"/>
+        </w:rPr>
+        <w:t xml:space="preserve">cell</w:t>
+      </w:r>
+      <w:r>
+        <w:rPr>
+          <w:rFonts w:asciiTheme="majorBidi" w:hAnsiTheme="majorBidi" w:cstheme="majorBidi"/>
+          <w:sz w:val="18"/>
+          <w:szCs w:val="18"/>
+        </w:rPr>
+        <w:t xml:space="preserve"> is the cell temperature from the NOCT relation, and </w:t>
+      </w:r>
+      <w:r>
+        <w:rPr>
+          <w:rFonts w:asciiTheme="majorBidi" w:hAnsiTheme="majorBidi" w:cstheme="majorBidi"/>
+          <w:sz w:val="18"/>
+          <w:szCs w:val="18"/>
+        </w:rPr>
+        <w:t xml:space="preserve">V</w:t>
+      </w:r>
+      <w:r>
+        <w:rPr>
+          <w:rFonts w:asciiTheme="majorBidi" w:hAnsiTheme="majorBidi" w:cstheme="majorBidi"/>
+          <w:sz w:val="18"/>
+          <w:szCs w:val="18"/>
+          <w:vertAlign w:val="subscript"/>
+        </w:rPr>
+        <w:t xml:space="preserve">mpp</w:t>
+      </w:r>
+      <w:r>
+        <w:rPr>
+          <w:rFonts w:asciiTheme="majorBidi" w:hAnsiTheme="majorBidi" w:cstheme="majorBidi"/>
+          <w:sz w:val="18"/>
+          <w:szCs w:val="18"/>
+        </w:rPr>
+        <w:t xml:space="preserve"> and </w:t>
+      </w:r>
+      <w:r>
+        <w:rPr>
+          <w:rFonts w:asciiTheme="majorBidi" w:hAnsiTheme="majorBidi" w:cstheme="majorBidi"/>
+          <w:sz w:val="18"/>
+          <w:szCs w:val="18"/>
+        </w:rPr>
+        <w:t xml:space="preserve">P</w:t>
+      </w:r>
+      <w:r>
+        <w:rPr>
+          <w:rFonts w:asciiTheme="majorBidi" w:hAnsiTheme="majorBidi" w:cstheme="majorBidi"/>
+          <w:sz w:val="18"/>
+          <w:szCs w:val="18"/>
+          <w:vertAlign w:val="subscript"/>
+        </w:rPr>
+        <w:t xml:space="preserve">mpp</w:t>
+      </w:r>
+      <w:r>
+        <w:rPr>
+          <w:rFonts w:asciiTheme="majorBidi" w:hAnsiTheme="majorBidi" w:cstheme="majorBidi"/>
+          <w:sz w:val="18"/>
+          <w:szCs w:val="18"/>
+        </w:rPr>
+        <w:t xml:space="preserve"> are the maximum-power voltage and power of the single-diode model at that G and </w:t>
+      </w:r>
+      <w:r>
+        <w:rPr>
+          <w:rFonts w:asciiTheme="majorBidi" w:hAnsiTheme="majorBidi" w:cstheme="majorBidi"/>
+          <w:sz w:val="18"/>
+          <w:szCs w:val="18"/>
+        </w:rPr>
+        <w:t xml:space="preserve">T</w:t>
+      </w:r>
+      <w:r>
+        <w:rPr>
+          <w:rFonts w:asciiTheme="majorBidi" w:hAnsiTheme="majorBidi" w:cstheme="majorBidi"/>
+          <w:sz w:val="18"/>
+          <w:szCs w:val="18"/>
+          <w:vertAlign w:val="subscript"/>
+        </w:rPr>
+        <w:t xml:space="preserve">cell</w:t>
+      </w:r>
+      <w:r>
+        <w:rPr>
+          <w:rFonts w:asciiTheme="majorBidi" w:hAnsiTheme="majorBidi" w:cstheme="majorBidi"/>
+          <w:sz w:val="18"/>
+          <w:szCs w:val="18"/>
+        </w:rPr>
+        <w:t xml:space="preserve">.</w:t>
+      </w:r>
+    </w:p>
+    <w:tbl>
+      <w:tblPr>
+        <w:tblW w:w="8497" w:type="dxa"/>
+        <w:jc w:val="center"/>
+        <w:tblBorders>
+          <w:top w:val="single" w:sz="8" w:space="0" w:color="000000"/>
+          <w:bottom w:val="single" w:sz="8" w:space="0" w:color="000000"/>
+          <w:insideH w:val="single" w:sz="2" w:space="0" w:color="BFBFBF"/>
+        </w:tblBorders>
+        <w:tblLayout w:type="fixed"/>
+        <w:tblCellMar>
+          <w:left w:w="60" w:type="dxa"/>
+          <w:right w:w="60" w:type="dxa"/>
+        </w:tblCellMar>
+      </w:tblPr>
+      <w:tblGrid>
+        <w:gridCol w:w="2441"/>
+        <w:gridCol w:w="931"/>
+        <w:gridCol w:w="1224"/>
+        <w:gridCol w:w="1405"/>
+        <w:gridCol w:w="1224"/>
+        <w:gridCol w:w="1272"/>
+      </w:tblGrid>
+      <w:tr>
+        <w:trPr>
+          <w:tblHeader/>
+        </w:trPr>
+        <w:tc>
+          <w:tcPr>
+            <w:tcW w:w="2441" w:type="dxa"/>
+            <w:shd w:val="clear" w:color="auto" w:fill="F2F2F2"/>
+            <w:vAlign w:val="center"/>
+          </w:tcPr>
+          <w:p>
+            <w:pPr>
+              <w:spacing w:before="20" w:after="20" w:line="240" w:lineRule="auto"/>
+              <w:jc w:val="left"/>
+            </w:pPr>
+            <w:r>
+              <w:rPr>
+                <w:rFonts w:asciiTheme="majorBidi" w:hAnsiTheme="majorBidi" w:cstheme="majorBidi"/>
+                <w:b/>
+                <w:bCs/>
+                <w:sz w:val="17"/>
+                <w:szCs w:val="17"/>
+              </w:rPr>
+              <w:t xml:space="preserve">Time (UTC)</w:t>
+            </w:r>
+          </w:p>
+        </w:tc>
+        <w:tc>
+          <w:tcPr>
+            <w:tcW w:w="931" w:type="dxa"/>
+            <w:shd w:val="clear" w:color="auto" w:fill="F2F2F2"/>
+            <w:vAlign w:val="center"/>
+          </w:tcPr>
+          <w:p>
+            <w:pPr>
+              <w:spacing w:before="20" w:after="20" w:line="240" w:lineRule="auto"/>
+              <w:jc w:val="center"/>
+            </w:pPr>
+            <w:r>
+              <w:rPr>
+                <w:rFonts w:asciiTheme="majorBidi" w:hAnsiTheme="majorBidi" w:cstheme="majorBidi"/>
+                <w:b/>
+                <w:bCs/>
+                <w:sz w:val="17"/>
+                <w:szCs w:val="17"/>
+              </w:rPr>
+              <w:t xml:space="preserve">G (W/m²)</w:t>
+            </w:r>
+          </w:p>
+        </w:tc>
+        <w:tc>
+          <w:tcPr>
+            <w:tcW w:w="1224" w:type="dxa"/>
+            <w:shd w:val="clear" w:color="auto" w:fill="F2F2F2"/>
+            <w:vAlign w:val="center"/>
+          </w:tcPr>
+          <w:p>
+            <w:pPr>
+              <w:spacing w:before="20" w:after="20" w:line="240" w:lineRule="auto"/>
+              <w:jc w:val="center"/>
+            </w:pPr>
+            <w:r>
+              <w:rPr>
+                <w:rFonts w:asciiTheme="majorBidi" w:hAnsiTheme="majorBidi" w:cstheme="majorBidi"/>
+                <w:b/>
+                <w:bCs/>
+                <w:sz w:val="17"/>
+                <w:szCs w:val="17"/>
+              </w:rPr>
+              <w:t xml:space="preserve">T</w:t>
+            </w:r>
+            <w:r>
+              <w:rPr>
+                <w:rFonts w:asciiTheme="majorBidi" w:hAnsiTheme="majorBidi" w:cstheme="majorBidi"/>
+                <w:b/>
+                <w:bCs/>
+                <w:sz w:val="17"/>
+                <w:szCs w:val="17"/>
+                <w:vertAlign w:val="subscript"/>
+              </w:rPr>
+              <w:t xml:space="preserve">2m</w:t>
+            </w:r>
+            <w:r>
+              <w:rPr>
+                <w:rFonts w:asciiTheme="majorBidi" w:hAnsiTheme="majorBidi" w:cstheme="majorBidi"/>
+                <w:b/>
+                <w:bCs/>
+                <w:sz w:val="17"/>
+                <w:szCs w:val="17"/>
+              </w:rPr>
+              <w:t xml:space="preserve"> (°C)</w:t>
+            </w:r>
+          </w:p>
+        </w:tc>
+        <w:tc>
+          <w:tcPr>
+            <w:tcW w:w="1405" w:type="dxa"/>
+            <w:shd w:val="clear" w:color="auto" w:fill="F2F2F2"/>
+            <w:vAlign w:val="center"/>
+          </w:tcPr>
+          <w:p>
+            <w:pPr>
+              <w:spacing w:before="20" w:after="20" w:line="240" w:lineRule="auto"/>
+              <w:jc w:val="center"/>
+            </w:pPr>
+            <w:r>
+              <w:rPr>
+                <w:rFonts w:asciiTheme="majorBidi" w:hAnsiTheme="majorBidi" w:cstheme="majorBidi"/>
+                <w:b/>
+                <w:bCs/>
+                <w:sz w:val="17"/>
+                <w:szCs w:val="17"/>
+              </w:rPr>
+              <w:t xml:space="preserve">T</w:t>
+            </w:r>
+            <w:r>
+              <w:rPr>
+                <w:rFonts w:asciiTheme="majorBidi" w:hAnsiTheme="majorBidi" w:cstheme="majorBidi"/>
+                <w:b/>
+                <w:bCs/>
+                <w:sz w:val="17"/>
+                <w:szCs w:val="17"/>
+                <w:vertAlign w:val="subscript"/>
+              </w:rPr>
+              <w:t xml:space="preserve">cell</w:t>
+            </w:r>
+            <w:r>
+              <w:rPr>
+                <w:rFonts w:asciiTheme="majorBidi" w:hAnsiTheme="majorBidi" w:cstheme="majorBidi"/>
+                <w:b/>
+                <w:bCs/>
+                <w:sz w:val="17"/>
+                <w:szCs w:val="17"/>
+              </w:rPr>
+              <w:t xml:space="preserve"> (°C)</w:t>
+            </w:r>
+          </w:p>
+        </w:tc>
+        <w:tc>
+          <w:tcPr>
+            <w:tcW w:w="1224" w:type="dxa"/>
+            <w:shd w:val="clear" w:color="auto" w:fill="F2F2F2"/>
+            <w:vAlign w:val="center"/>
+          </w:tcPr>
+          <w:p>
+            <w:pPr>
+              <w:spacing w:before="20" w:after="20" w:line="240" w:lineRule="auto"/>
+              <w:jc w:val="center"/>
+            </w:pPr>
+            <w:r>
+              <w:rPr>
+                <w:rFonts w:asciiTheme="majorBidi" w:hAnsiTheme="majorBidi" w:cstheme="majorBidi"/>
+                <w:b/>
+                <w:bCs/>
+                <w:sz w:val="17"/>
+                <w:szCs w:val="17"/>
+              </w:rPr>
+              <w:t xml:space="preserve">V</w:t>
+            </w:r>
+            <w:r>
+              <w:rPr>
+                <w:rFonts w:asciiTheme="majorBidi" w:hAnsiTheme="majorBidi" w:cstheme="majorBidi"/>
+                <w:b/>
+                <w:bCs/>
+                <w:sz w:val="17"/>
+                <w:szCs w:val="17"/>
+                <w:vertAlign w:val="subscript"/>
+              </w:rPr>
+              <w:t xml:space="preserve">mpp</w:t>
+            </w:r>
+            <w:r>
+              <w:rPr>
+                <w:rFonts w:asciiTheme="majorBidi" w:hAnsiTheme="majorBidi" w:cstheme="majorBidi"/>
+                <w:b/>
+                <w:bCs/>
+                <w:sz w:val="17"/>
+                <w:szCs w:val="17"/>
+              </w:rPr>
+              <w:t xml:space="preserve"> (V)</w:t>
+            </w:r>
+          </w:p>
+        </w:tc>
+        <w:tc>
+          <w:tcPr>
+            <w:tcW w:w="1272" w:type="dxa"/>
+            <w:shd w:val="clear" w:color="auto" w:fill="F2F2F2"/>
+            <w:vAlign w:val="center"/>
+          </w:tcPr>
+          <w:p>
+            <w:pPr>
+              <w:spacing w:before="20" w:after="20" w:line="240" w:lineRule="auto"/>
+              <w:jc w:val="center"/>
+            </w:pPr>
+            <w:r>
+              <w:rPr>
+                <w:rFonts w:asciiTheme="majorBidi" w:hAnsiTheme="majorBidi" w:cstheme="majorBidi"/>
+                <w:b/>
+                <w:bCs/>
+                <w:sz w:val="17"/>
+                <w:szCs w:val="17"/>
+              </w:rPr>
+              <w:t xml:space="preserve">P</w:t>
+            </w:r>
+            <w:r>
+              <w:rPr>
+                <w:rFonts w:asciiTheme="majorBidi" w:hAnsiTheme="majorBidi" w:cstheme="majorBidi"/>
+                <w:b/>
+                <w:bCs/>
+                <w:sz w:val="17"/>
+                <w:szCs w:val="17"/>
+                <w:vertAlign w:val="subscript"/>
+              </w:rPr>
+              <w:t xml:space="preserve">mpp</w:t>
+            </w:r>
+            <w:r>
+              <w:rPr>
+                <w:rFonts w:asciiTheme="majorBidi" w:hAnsiTheme="majorBidi" w:cstheme="majorBidi"/>
+                <w:b/>
+                <w:bCs/>
+                <w:sz w:val="17"/>
+                <w:szCs w:val="17"/>
+              </w:rPr>
+              <w:t xml:space="preserve"> (W)</w:t>
+            </w:r>
+          </w:p>
+        </w:tc>
+      </w:tr>
+      <w:tr>
+        <w:trPr/>
+        <w:tc>
+          <w:tcPr>
+            <w:tcW w:w="2441" w:type="dxa"/>
+            <w:vAlign w:val="center"/>
+          </w:tcPr>
+          <w:p>
+            <w:pPr>
+              <w:spacing w:before="20" w:after="20" w:line="240" w:lineRule="auto"/>
+              <w:jc w:val="left"/>
+            </w:pPr>
+            <w:r>
+              <w:rPr>
+                <w:rFonts w:asciiTheme="majorBidi" w:hAnsiTheme="majorBidi" w:cstheme="majorBidi"/>
+                <w:sz w:val="17"/>
+                <w:szCs w:val="17"/>
+              </w:rPr>
+              <w:t xml:space="preserve">2019-06-24 03:09</w:t>
+            </w:r>
+          </w:p>
+        </w:tc>
+        <w:tc>
+          <w:tcPr>
+            <w:tcW w:w="931" w:type="dxa"/>
+            <w:vAlign w:val="center"/>
+          </w:tcPr>
+          <w:p>
+            <w:pPr>
+              <w:spacing w:before="20" w:after="20" w:line="240" w:lineRule="auto"/>
+              <w:jc w:val="center"/>
+            </w:pPr>
+            <w:r>
+              <w:rPr>
+                <w:rFonts w:asciiTheme="majorBidi" w:hAnsiTheme="majorBidi" w:cstheme="majorBidi"/>
+                <w:sz w:val="17"/>
+                <w:szCs w:val="17"/>
+              </w:rPr>
+              <w:t xml:space="preserve">162</w:t>
+            </w:r>
+          </w:p>
+        </w:tc>
+        <w:tc>
+          <w:tcPr>
+            <w:tcW w:w="1224" w:type="dxa"/>
+            <w:vAlign w:val="center"/>
+          </w:tcPr>
+          <w:p>
+            <w:pPr>
+              <w:spacing w:before="20" w:after="20" w:line="240" w:lineRule="auto"/>
+              <w:jc w:val="center"/>
+            </w:pPr>
+            <w:r>
+              <w:rPr>
+                <w:rFonts w:asciiTheme="majorBidi" w:hAnsiTheme="majorBidi" w:cstheme="majorBidi"/>
+                <w:sz w:val="17"/>
+                <w:szCs w:val="17"/>
+              </w:rPr>
+              <w:t xml:space="preserve">29.06</w:t>
+            </w:r>
+          </w:p>
+        </w:tc>
+        <w:tc>
+          <w:tcPr>
+            <w:tcW w:w="1405" w:type="dxa"/>
+            <w:vAlign w:val="center"/>
+          </w:tcPr>
+          <w:p>
+            <w:pPr>
+              <w:spacing w:before="20" w:after="20" w:line="240" w:lineRule="auto"/>
+              <w:jc w:val="center"/>
+            </w:pPr>
+            <w:r>
+              <w:rPr>
+                <w:rFonts w:asciiTheme="majorBidi" w:hAnsiTheme="majorBidi" w:cstheme="majorBidi"/>
+                <w:sz w:val="17"/>
+                <w:szCs w:val="17"/>
+              </w:rPr>
+              <w:t xml:space="preserve">34.12</w:t>
+            </w:r>
+          </w:p>
+        </w:tc>
+        <w:tc>
+          <w:tcPr>
+            <w:tcW w:w="1224" w:type="dxa"/>
+            <w:vAlign w:val="center"/>
+          </w:tcPr>
+          <w:p>
+            <w:pPr>
+              <w:spacing w:before="20" w:after="20" w:line="240" w:lineRule="auto"/>
+              <w:jc w:val="center"/>
+            </w:pPr>
+            <w:r>
+              <w:rPr>
+                <w:rFonts w:asciiTheme="majorBidi" w:hAnsiTheme="majorBidi" w:cstheme="majorBidi"/>
+                <w:sz w:val="17"/>
+                <w:szCs w:val="17"/>
+              </w:rPr>
+              <w:t xml:space="preserve">23.89</w:t>
+            </w:r>
+          </w:p>
+        </w:tc>
+        <w:tc>
+          <w:tcPr>
+            <w:tcW w:w="1272" w:type="dxa"/>
+            <w:vAlign w:val="center"/>
+          </w:tcPr>
+          <w:p>
+            <w:pPr>
+              <w:spacing w:before="20" w:after="20" w:line="240" w:lineRule="auto"/>
+              <w:jc w:val="center"/>
+            </w:pPr>
+            <w:r>
+              <w:rPr>
+                <w:rFonts w:asciiTheme="majorBidi" w:hAnsiTheme="majorBidi" w:cstheme="majorBidi"/>
+                <w:sz w:val="17"/>
+                <w:szCs w:val="17"/>
+              </w:rPr>
+              <w:t xml:space="preserve">35.62</w:t>
+            </w:r>
+          </w:p>
+        </w:tc>
+      </w:tr>
+      <w:tr>
+        <w:trPr/>
+        <w:tc>
+          <w:tcPr>
+            <w:tcW w:w="2441" w:type="dxa"/>
+            <w:vAlign w:val="center"/>
+          </w:tcPr>
+          <w:p>
+            <w:pPr>
+              <w:spacing w:before="20" w:after="20" w:line="240" w:lineRule="auto"/>
+              <w:jc w:val="left"/>
+            </w:pPr>
+            <w:r>
+              <w:rPr>
+                <w:rFonts w:asciiTheme="majorBidi" w:hAnsiTheme="majorBidi" w:cstheme="majorBidi"/>
+                <w:sz w:val="17"/>
+                <w:szCs w:val="17"/>
+              </w:rPr>
+              <w:t xml:space="preserve">2019-06-24 04:09</w:t>
+            </w:r>
+          </w:p>
+        </w:tc>
+        <w:tc>
+          <w:tcPr>
+            <w:tcW w:w="931" w:type="dxa"/>
+            <w:vAlign w:val="center"/>
+          </w:tcPr>
+          <w:p>
+            <w:pPr>
+              <w:spacing w:before="20" w:after="20" w:line="240" w:lineRule="auto"/>
+              <w:jc w:val="center"/>
+            </w:pPr>
+            <w:r>
+              <w:rPr>
+                <w:rFonts w:asciiTheme="majorBidi" w:hAnsiTheme="majorBidi" w:cstheme="majorBidi"/>
+                <w:sz w:val="17"/>
+                <w:szCs w:val="17"/>
+              </w:rPr>
+              <w:t xml:space="preserve">378</w:t>
+            </w:r>
+          </w:p>
+        </w:tc>
+        <w:tc>
+          <w:tcPr>
+            <w:tcW w:w="1224" w:type="dxa"/>
+            <w:vAlign w:val="center"/>
+          </w:tcPr>
+          <w:p>
+            <w:pPr>
+              <w:spacing w:before="20" w:after="20" w:line="240" w:lineRule="auto"/>
+              <w:jc w:val="center"/>
+            </w:pPr>
+            <w:r>
+              <w:rPr>
+                <w:rFonts w:asciiTheme="majorBidi" w:hAnsiTheme="majorBidi" w:cstheme="majorBidi"/>
+                <w:sz w:val="17"/>
+                <w:szCs w:val="17"/>
+              </w:rPr>
+              <w:t xml:space="preserve">31.02</w:t>
+            </w:r>
+          </w:p>
+        </w:tc>
+        <w:tc>
+          <w:tcPr>
+            <w:tcW w:w="1405" w:type="dxa"/>
+            <w:vAlign w:val="center"/>
+          </w:tcPr>
+          <w:p>
+            <w:pPr>
+              <w:spacing w:before="20" w:after="20" w:line="240" w:lineRule="auto"/>
+              <w:jc w:val="center"/>
+            </w:pPr>
+            <w:r>
+              <w:rPr>
+                <w:rFonts w:asciiTheme="majorBidi" w:hAnsiTheme="majorBidi" w:cstheme="majorBidi"/>
+                <w:sz w:val="17"/>
+                <w:szCs w:val="17"/>
+              </w:rPr>
+              <w:t xml:space="preserve">42.83</w:t>
+            </w:r>
+          </w:p>
+        </w:tc>
+        <w:tc>
+          <w:tcPr>
+            <w:tcW w:w="1224" w:type="dxa"/>
+            <w:vAlign w:val="center"/>
+          </w:tcPr>
+          <w:p>
+            <w:pPr>
+              <w:spacing w:before="20" w:after="20" w:line="240" w:lineRule="auto"/>
+              <w:jc w:val="center"/>
+            </w:pPr>
+            <w:r>
+              <w:rPr>
+                <w:rFonts w:asciiTheme="majorBidi" w:hAnsiTheme="majorBidi" w:cstheme="majorBidi"/>
+                <w:sz w:val="17"/>
+                <w:szCs w:val="17"/>
+              </w:rPr>
+              <w:t xml:space="preserve">23.92</w:t>
+            </w:r>
+          </w:p>
+        </w:tc>
+        <w:tc>
+          <w:tcPr>
+            <w:tcW w:w="1272" w:type="dxa"/>
+            <w:vAlign w:val="center"/>
+          </w:tcPr>
+          <w:p>
+            <w:pPr>
+              <w:spacing w:before="20" w:after="20" w:line="240" w:lineRule="auto"/>
+              <w:jc w:val="center"/>
+            </w:pPr>
+            <w:r>
+              <w:rPr>
+                <w:rFonts w:asciiTheme="majorBidi" w:hAnsiTheme="majorBidi" w:cstheme="majorBidi"/>
+                <w:sz w:val="17"/>
+                <w:szCs w:val="17"/>
+              </w:rPr>
+              <w:t xml:space="preserve">83.40</w:t>
+            </w:r>
+          </w:p>
+        </w:tc>
+      </w:tr>
+      <w:tr>
+        <w:trPr/>
+        <w:tc>
+          <w:tcPr>
+            <w:tcW w:w="2441" w:type="dxa"/>
+            <w:vAlign w:val="center"/>
+          </w:tcPr>
+          <w:p>
+            <w:pPr>
+              <w:spacing w:before="20" w:after="20" w:line="240" w:lineRule="auto"/>
+              <w:jc w:val="left"/>
+            </w:pPr>
+            <w:r>
+              <w:rPr>
+                <w:rFonts w:asciiTheme="majorBidi" w:hAnsiTheme="majorBidi" w:cstheme="majorBidi"/>
+                <w:sz w:val="17"/>
+                <w:szCs w:val="17"/>
+              </w:rPr>
+              <w:t xml:space="preserve">2019-06-24 05:09</w:t>
+            </w:r>
+          </w:p>
+        </w:tc>
+        <w:tc>
+          <w:tcPr>
+            <w:tcW w:w="931" w:type="dxa"/>
+            <w:vAlign w:val="center"/>
+          </w:tcPr>
+          <w:p>
+            <w:pPr>
+              <w:spacing w:before="20" w:after="20" w:line="240" w:lineRule="auto"/>
+              <w:jc w:val="center"/>
+            </w:pPr>
+            <w:r>
+              <w:rPr>
+                <w:rFonts w:asciiTheme="majorBidi" w:hAnsiTheme="majorBidi" w:cstheme="majorBidi"/>
+                <w:sz w:val="17"/>
+                <w:szCs w:val="17"/>
+              </w:rPr>
+              <w:t xml:space="preserve">589</w:t>
+            </w:r>
+          </w:p>
+        </w:tc>
+        <w:tc>
+          <w:tcPr>
+            <w:tcW w:w="1224" w:type="dxa"/>
+            <w:vAlign w:val="center"/>
+          </w:tcPr>
+          <w:p>
+            <w:pPr>
+              <w:spacing w:before="20" w:after="20" w:line="240" w:lineRule="auto"/>
+              <w:jc w:val="center"/>
+            </w:pPr>
+            <w:r>
+              <w:rPr>
+                <w:rFonts w:asciiTheme="majorBidi" w:hAnsiTheme="majorBidi" w:cstheme="majorBidi"/>
+                <w:sz w:val="17"/>
+                <w:szCs w:val="17"/>
+              </w:rPr>
+              <w:t xml:space="preserve">33.71</w:t>
+            </w:r>
+          </w:p>
+        </w:tc>
+        <w:tc>
+          <w:tcPr>
+            <w:tcW w:w="1405" w:type="dxa"/>
+            <w:vAlign w:val="center"/>
+          </w:tcPr>
+          <w:p>
+            <w:pPr>
+              <w:spacing w:before="20" w:after="20" w:line="240" w:lineRule="auto"/>
+              <w:jc w:val="center"/>
+            </w:pPr>
+            <w:r>
+              <w:rPr>
+                <w:rFonts w:asciiTheme="majorBidi" w:hAnsiTheme="majorBidi" w:cstheme="majorBidi"/>
+                <w:sz w:val="17"/>
+                <w:szCs w:val="17"/>
+              </w:rPr>
+              <w:t xml:space="preserve">52.12</w:t>
+            </w:r>
+          </w:p>
+        </w:tc>
+        <w:tc>
+          <w:tcPr>
+            <w:tcW w:w="1224" w:type="dxa"/>
+            <w:vAlign w:val="center"/>
+          </w:tcPr>
+          <w:p>
+            <w:pPr>
+              <w:spacing w:before="20" w:after="20" w:line="240" w:lineRule="auto"/>
+              <w:jc w:val="center"/>
+            </w:pPr>
+            <w:r>
+              <w:rPr>
+                <w:rFonts w:asciiTheme="majorBidi" w:hAnsiTheme="majorBidi" w:cstheme="majorBidi"/>
+                <w:sz w:val="17"/>
+                <w:szCs w:val="17"/>
+              </w:rPr>
+              <w:t xml:space="preserve">23.29</w:t>
+            </w:r>
+          </w:p>
+        </w:tc>
+        <w:tc>
+          <w:tcPr>
+            <w:tcW w:w="1272" w:type="dxa"/>
+            <w:vAlign w:val="center"/>
+          </w:tcPr>
+          <w:p>
+            <w:pPr>
+              <w:spacing w:before="20" w:after="20" w:line="240" w:lineRule="auto"/>
+              <w:jc w:val="center"/>
+            </w:pPr>
+            <w:r>
+              <w:rPr>
+                <w:rFonts w:asciiTheme="majorBidi" w:hAnsiTheme="majorBidi" w:cstheme="majorBidi"/>
+                <w:sz w:val="17"/>
+                <w:szCs w:val="17"/>
+              </w:rPr>
+              <w:t xml:space="preserve">126.57</w:t>
+            </w:r>
+          </w:p>
+        </w:tc>
+      </w:tr>
+      <w:tr>
+        <w:trPr/>
+        <w:tc>
+          <w:tcPr>
+            <w:tcW w:w="2441" w:type="dxa"/>
+            <w:vAlign w:val="center"/>
+          </w:tcPr>
+          <w:p>
+            <w:pPr>
+              <w:spacing w:before="20" w:after="20" w:line="240" w:lineRule="auto"/>
+              <w:jc w:val="left"/>
+            </w:pPr>
+            <w:r>
+              <w:rPr>
+                <w:rFonts w:asciiTheme="majorBidi" w:hAnsiTheme="majorBidi" w:cstheme="majorBidi"/>
+                <w:sz w:val="17"/>
+                <w:szCs w:val="17"/>
+              </w:rPr>
+              <w:t xml:space="preserve">2019-06-24 06:09</w:t>
+            </w:r>
+          </w:p>
+        </w:tc>
+        <w:tc>
+          <w:tcPr>
+            <w:tcW w:w="931" w:type="dxa"/>
+            <w:vAlign w:val="center"/>
+          </w:tcPr>
+          <w:p>
+            <w:pPr>
+              <w:spacing w:before="20" w:after="20" w:line="240" w:lineRule="auto"/>
+              <w:jc w:val="center"/>
+            </w:pPr>
+            <w:r>
+              <w:rPr>
+                <w:rFonts w:asciiTheme="majorBidi" w:hAnsiTheme="majorBidi" w:cstheme="majorBidi"/>
+                <w:sz w:val="17"/>
+                <w:szCs w:val="17"/>
+              </w:rPr>
+              <w:t xml:space="preserve">777</w:t>
+            </w:r>
+          </w:p>
+        </w:tc>
+        <w:tc>
+          <w:tcPr>
+            <w:tcW w:w="1224" w:type="dxa"/>
+            <w:vAlign w:val="center"/>
+          </w:tcPr>
+          <w:p>
+            <w:pPr>
+              <w:spacing w:before="20" w:after="20" w:line="240" w:lineRule="auto"/>
+              <w:jc w:val="center"/>
+            </w:pPr>
+            <w:r>
+              <w:rPr>
+                <w:rFonts w:asciiTheme="majorBidi" w:hAnsiTheme="majorBidi" w:cstheme="majorBidi"/>
+                <w:sz w:val="17"/>
+                <w:szCs w:val="17"/>
+              </w:rPr>
+              <w:t xml:space="preserve">36.11</w:t>
+            </w:r>
+          </w:p>
+        </w:tc>
+        <w:tc>
+          <w:tcPr>
+            <w:tcW w:w="1405" w:type="dxa"/>
+            <w:vAlign w:val="center"/>
+          </w:tcPr>
+          <w:p>
+            <w:pPr>
+              <w:spacing w:before="20" w:after="20" w:line="240" w:lineRule="auto"/>
+              <w:jc w:val="center"/>
+            </w:pPr>
+            <w:r>
+              <w:rPr>
+                <w:rFonts w:asciiTheme="majorBidi" w:hAnsiTheme="majorBidi" w:cstheme="majorBidi"/>
+                <w:sz w:val="17"/>
+                <w:szCs w:val="17"/>
+              </w:rPr>
+              <w:t xml:space="preserve">60.39</w:t>
+            </w:r>
+          </w:p>
+        </w:tc>
+        <w:tc>
+          <w:tcPr>
+            <w:tcW w:w="1224" w:type="dxa"/>
+            <w:vAlign w:val="center"/>
+          </w:tcPr>
+          <w:p>
+            <w:pPr>
+              <w:spacing w:before="20" w:after="20" w:line="240" w:lineRule="auto"/>
+              <w:jc w:val="center"/>
+            </w:pPr>
+            <w:r>
+              <w:rPr>
+                <w:rFonts w:asciiTheme="majorBidi" w:hAnsiTheme="majorBidi" w:cstheme="majorBidi"/>
+                <w:sz w:val="17"/>
+                <w:szCs w:val="17"/>
+              </w:rPr>
+              <w:t xml:space="preserve">22.56</w:t>
+            </w:r>
+          </w:p>
+        </w:tc>
+        <w:tc>
+          <w:tcPr>
+            <w:tcW w:w="1272" w:type="dxa"/>
+            <w:vAlign w:val="center"/>
+          </w:tcPr>
+          <w:p>
+            <w:pPr>
+              <w:spacing w:before="20" w:after="20" w:line="240" w:lineRule="auto"/>
+              <w:jc w:val="center"/>
+            </w:pPr>
+            <w:r>
+              <w:rPr>
+                <w:rFonts w:asciiTheme="majorBidi" w:hAnsiTheme="majorBidi" w:cstheme="majorBidi"/>
+                <w:sz w:val="17"/>
+                <w:szCs w:val="17"/>
+              </w:rPr>
+              <w:t xml:space="preserve">161.65</w:t>
+            </w:r>
+          </w:p>
+        </w:tc>
+      </w:tr>
+      <w:tr>
+        <w:trPr/>
+        <w:tc>
+          <w:tcPr>
+            <w:tcW w:w="2441" w:type="dxa"/>
+            <w:vAlign w:val="center"/>
+          </w:tcPr>
+          <w:p>
+            <w:pPr>
+              <w:spacing w:before="20" w:after="20" w:line="240" w:lineRule="auto"/>
+              <w:jc w:val="left"/>
+            </w:pPr>
+            <w:r>
+              <w:rPr>
+                <w:rFonts w:asciiTheme="majorBidi" w:hAnsiTheme="majorBidi" w:cstheme="majorBidi"/>
+                <w:sz w:val="17"/>
+                <w:szCs w:val="17"/>
+              </w:rPr>
+              <w:t xml:space="preserve">2019-06-24 07:09</w:t>
+            </w:r>
+          </w:p>
+        </w:tc>
+        <w:tc>
+          <w:tcPr>
+            <w:tcW w:w="931" w:type="dxa"/>
+            <w:vAlign w:val="center"/>
+          </w:tcPr>
+          <w:p>
+            <w:pPr>
+              <w:spacing w:before="20" w:after="20" w:line="240" w:lineRule="auto"/>
+              <w:jc w:val="center"/>
+            </w:pPr>
+            <w:r>
+              <w:rPr>
+                <w:rFonts w:asciiTheme="majorBidi" w:hAnsiTheme="majorBidi" w:cstheme="majorBidi"/>
+                <w:sz w:val="17"/>
+                <w:szCs w:val="17"/>
+              </w:rPr>
+              <w:t xml:space="preserve">923</w:t>
+            </w:r>
+          </w:p>
+        </w:tc>
+        <w:tc>
+          <w:tcPr>
+            <w:tcW w:w="1224" w:type="dxa"/>
+            <w:vAlign w:val="center"/>
+          </w:tcPr>
+          <w:p>
+            <w:pPr>
+              <w:spacing w:before="20" w:after="20" w:line="240" w:lineRule="auto"/>
+              <w:jc w:val="center"/>
+            </w:pPr>
+            <w:r>
+              <w:rPr>
+                <w:rFonts w:asciiTheme="majorBidi" w:hAnsiTheme="majorBidi" w:cstheme="majorBidi"/>
+                <w:sz w:val="17"/>
+                <w:szCs w:val="17"/>
+              </w:rPr>
+              <w:t xml:space="preserve">38.94</w:t>
+            </w:r>
+          </w:p>
+        </w:tc>
+        <w:tc>
+          <w:tcPr>
+            <w:tcW w:w="1405" w:type="dxa"/>
+            <w:vAlign w:val="center"/>
+          </w:tcPr>
+          <w:p>
+            <w:pPr>
+              <w:spacing w:before="20" w:after="20" w:line="240" w:lineRule="auto"/>
+              <w:jc w:val="center"/>
+            </w:pPr>
+            <w:r>
+              <w:rPr>
+                <w:rFonts w:asciiTheme="majorBidi" w:hAnsiTheme="majorBidi" w:cstheme="majorBidi"/>
+                <w:sz w:val="17"/>
+                <w:szCs w:val="17"/>
+              </w:rPr>
+              <w:t xml:space="preserve">67.78</w:t>
+            </w:r>
+          </w:p>
+        </w:tc>
+        <w:tc>
+          <w:tcPr>
+            <w:tcW w:w="1224" w:type="dxa"/>
+            <w:vAlign w:val="center"/>
+          </w:tcPr>
+          <w:p>
+            <w:pPr>
+              <w:spacing w:before="20" w:after="20" w:line="240" w:lineRule="auto"/>
+              <w:jc w:val="center"/>
+            </w:pPr>
+            <w:r>
+              <w:rPr>
+                <w:rFonts w:asciiTheme="majorBidi" w:hAnsiTheme="majorBidi" w:cstheme="majorBidi"/>
+                <w:sz w:val="17"/>
+                <w:szCs w:val="17"/>
+              </w:rPr>
+              <w:t xml:space="preserve">21.84</w:t>
+            </w:r>
+          </w:p>
+        </w:tc>
+        <w:tc>
+          <w:tcPr>
+            <w:tcW w:w="1272" w:type="dxa"/>
+            <w:vAlign w:val="center"/>
+          </w:tcPr>
+          <w:p>
+            <w:pPr>
+              <w:spacing w:before="20" w:after="20" w:line="240" w:lineRule="auto"/>
+              <w:jc w:val="center"/>
+            </w:pPr>
+            <w:r>
+              <w:rPr>
+                <w:rFonts w:asciiTheme="majorBidi" w:hAnsiTheme="majorBidi" w:cstheme="majorBidi"/>
+                <w:sz w:val="17"/>
+                <w:szCs w:val="17"/>
+              </w:rPr>
+              <w:t xml:space="preserve">185.63</w:t>
+            </w:r>
+          </w:p>
+        </w:tc>
+      </w:tr>
+      <w:tr>
+        <w:trPr/>
+        <w:tc>
+          <w:tcPr>
+            <w:tcW w:w="2441" w:type="dxa"/>
+            <w:vAlign w:val="center"/>
+          </w:tcPr>
+          <w:p>
+            <w:pPr>
+              <w:spacing w:before="20" w:after="20" w:line="240" w:lineRule="auto"/>
+              <w:jc w:val="left"/>
+            </w:pPr>
+            <w:r>
+              <w:rPr>
+                <w:rFonts w:asciiTheme="majorBidi" w:hAnsiTheme="majorBidi" w:cstheme="majorBidi"/>
+                <w:sz w:val="17"/>
+                <w:szCs w:val="17"/>
+              </w:rPr>
+              <w:t xml:space="preserve">2019-06-24 08:09</w:t>
+            </w:r>
+          </w:p>
+        </w:tc>
+        <w:tc>
+          <w:tcPr>
+            <w:tcW w:w="931" w:type="dxa"/>
+            <w:vAlign w:val="center"/>
+          </w:tcPr>
+          <w:p>
+            <w:pPr>
+              <w:spacing w:before="20" w:after="20" w:line="240" w:lineRule="auto"/>
+              <w:jc w:val="center"/>
+            </w:pPr>
+            <w:r>
+              <w:rPr>
+                <w:rFonts w:asciiTheme="majorBidi" w:hAnsiTheme="majorBidi" w:cstheme="majorBidi"/>
+                <w:sz w:val="17"/>
+                <w:szCs w:val="17"/>
+              </w:rPr>
+              <w:t xml:space="preserve">1018</w:t>
+            </w:r>
+          </w:p>
+        </w:tc>
+        <w:tc>
+          <w:tcPr>
+            <w:tcW w:w="1224" w:type="dxa"/>
+            <w:vAlign w:val="center"/>
+          </w:tcPr>
+          <w:p>
+            <w:pPr>
+              <w:spacing w:before="20" w:after="20" w:line="240" w:lineRule="auto"/>
+              <w:jc w:val="center"/>
+            </w:pPr>
+            <w:r>
+              <w:rPr>
+                <w:rFonts w:asciiTheme="majorBidi" w:hAnsiTheme="majorBidi" w:cstheme="majorBidi"/>
+                <w:sz w:val="17"/>
+                <w:szCs w:val="17"/>
+              </w:rPr>
+              <w:t xml:space="preserve">40.67</w:t>
+            </w:r>
+          </w:p>
+        </w:tc>
+        <w:tc>
+          <w:tcPr>
+            <w:tcW w:w="1405" w:type="dxa"/>
+            <w:vAlign w:val="center"/>
+          </w:tcPr>
+          <w:p>
+            <w:pPr>
+              <w:spacing w:before="20" w:after="20" w:line="240" w:lineRule="auto"/>
+              <w:jc w:val="center"/>
+            </w:pPr>
+            <w:r>
+              <w:rPr>
+                <w:rFonts w:asciiTheme="majorBidi" w:hAnsiTheme="majorBidi" w:cstheme="majorBidi"/>
+                <w:sz w:val="17"/>
+                <w:szCs w:val="17"/>
+              </w:rPr>
+              <w:t xml:space="preserve">72.48</w:t>
+            </w:r>
+          </w:p>
+        </w:tc>
+        <w:tc>
+          <w:tcPr>
+            <w:tcW w:w="1224" w:type="dxa"/>
+            <w:vAlign w:val="center"/>
+          </w:tcPr>
+          <w:p>
+            <w:pPr>
+              <w:spacing w:before="20" w:after="20" w:line="240" w:lineRule="auto"/>
+              <w:jc w:val="center"/>
+            </w:pPr>
+            <w:r>
+              <w:rPr>
+                <w:rFonts w:asciiTheme="majorBidi" w:hAnsiTheme="majorBidi" w:cstheme="majorBidi"/>
+                <w:sz w:val="17"/>
+                <w:szCs w:val="17"/>
+              </w:rPr>
+              <w:t xml:space="preserve">21.36</w:t>
+            </w:r>
+          </w:p>
+        </w:tc>
+        <w:tc>
+          <w:tcPr>
+            <w:tcW w:w="1272" w:type="dxa"/>
+            <w:vAlign w:val="center"/>
+          </w:tcPr>
+          <w:p>
+            <w:pPr>
+              <w:spacing w:before="20" w:after="20" w:line="240" w:lineRule="auto"/>
+              <w:jc w:val="center"/>
+            </w:pPr>
+            <w:r>
+              <w:rPr>
+                <w:rFonts w:asciiTheme="majorBidi" w:hAnsiTheme="majorBidi" w:cstheme="majorBidi"/>
+                <w:sz w:val="17"/>
+                <w:szCs w:val="17"/>
+              </w:rPr>
+              <w:t xml:space="preserve">200.07</w:t>
+            </w:r>
+          </w:p>
+        </w:tc>
+      </w:tr>
+      <w:tr>
+        <w:trPr/>
+        <w:tc>
+          <w:tcPr>
+            <w:tcW w:w="2441" w:type="dxa"/>
+            <w:vAlign w:val="center"/>
+          </w:tcPr>
+          <w:p>
+            <w:pPr>
+              <w:spacing w:before="20" w:after="20" w:line="240" w:lineRule="auto"/>
+              <w:jc w:val="left"/>
+            </w:pPr>
+            <w:r>
+              <w:rPr>
+                <w:rFonts w:asciiTheme="majorBidi" w:hAnsiTheme="majorBidi" w:cstheme="majorBidi"/>
+                <w:sz w:val="17"/>
+                <w:szCs w:val="17"/>
+              </w:rPr>
+              <w:t xml:space="preserve">2019-06-24 09:09</w:t>
+            </w:r>
+          </w:p>
+        </w:tc>
+        <w:tc>
+          <w:tcPr>
+            <w:tcW w:w="931" w:type="dxa"/>
+            <w:vAlign w:val="center"/>
+          </w:tcPr>
+          <w:p>
+            <w:pPr>
+              <w:spacing w:before="20" w:after="20" w:line="240" w:lineRule="auto"/>
+              <w:jc w:val="center"/>
+            </w:pPr>
+            <w:r>
+              <w:rPr>
+                <w:rFonts w:asciiTheme="majorBidi" w:hAnsiTheme="majorBidi" w:cstheme="majorBidi"/>
+                <w:sz w:val="17"/>
+                <w:szCs w:val="17"/>
+              </w:rPr>
+              <w:t xml:space="preserve">1051</w:t>
+            </w:r>
+          </w:p>
+        </w:tc>
+        <w:tc>
+          <w:tcPr>
+            <w:tcW w:w="1224" w:type="dxa"/>
+            <w:vAlign w:val="center"/>
+          </w:tcPr>
+          <w:p>
+            <w:pPr>
+              <w:spacing w:before="20" w:after="20" w:line="240" w:lineRule="auto"/>
+              <w:jc w:val="center"/>
+            </w:pPr>
+            <w:r>
+              <w:rPr>
+                <w:rFonts w:asciiTheme="majorBidi" w:hAnsiTheme="majorBidi" w:cstheme="majorBidi"/>
+                <w:sz w:val="17"/>
+                <w:szCs w:val="17"/>
+              </w:rPr>
+              <w:t xml:space="preserve">41.74</w:t>
+            </w:r>
+          </w:p>
+        </w:tc>
+        <w:tc>
+          <w:tcPr>
+            <w:tcW w:w="1405" w:type="dxa"/>
+            <w:vAlign w:val="center"/>
+          </w:tcPr>
+          <w:p>
+            <w:pPr>
+              <w:spacing w:before="20" w:after="20" w:line="240" w:lineRule="auto"/>
+              <w:jc w:val="center"/>
+            </w:pPr>
+            <w:r>
+              <w:rPr>
+                <w:rFonts w:asciiTheme="majorBidi" w:hAnsiTheme="majorBidi" w:cstheme="majorBidi"/>
+                <w:sz w:val="17"/>
+                <w:szCs w:val="17"/>
+              </w:rPr>
+              <w:t xml:space="preserve">74.58</w:t>
+            </w:r>
+          </w:p>
+        </w:tc>
+        <w:tc>
+          <w:tcPr>
+            <w:tcW w:w="1224" w:type="dxa"/>
+            <w:vAlign w:val="center"/>
+          </w:tcPr>
+          <w:p>
+            <w:pPr>
+              <w:spacing w:before="20" w:after="20" w:line="240" w:lineRule="auto"/>
+              <w:jc w:val="center"/>
+            </w:pPr>
+            <w:r>
+              <w:rPr>
+                <w:rFonts w:asciiTheme="majorBidi" w:hAnsiTheme="majorBidi" w:cstheme="majorBidi"/>
+                <w:sz w:val="17"/>
+                <w:szCs w:val="17"/>
+              </w:rPr>
+              <w:t xml:space="preserve">21.15</w:t>
+            </w:r>
+          </w:p>
+        </w:tc>
+        <w:tc>
+          <w:tcPr>
+            <w:tcW w:w="1272" w:type="dxa"/>
+            <w:vAlign w:val="center"/>
+          </w:tcPr>
+          <w:p>
+            <w:pPr>
+              <w:spacing w:before="20" w:after="20" w:line="240" w:lineRule="auto"/>
+              <w:jc w:val="center"/>
+            </w:pPr>
+            <w:r>
+              <w:rPr>
+                <w:rFonts w:asciiTheme="majorBidi" w:hAnsiTheme="majorBidi" w:cstheme="majorBidi"/>
+                <w:sz w:val="17"/>
+                <w:szCs w:val="17"/>
+              </w:rPr>
+              <w:t xml:space="preserve">204.34</w:t>
+            </w:r>
+          </w:p>
+        </w:tc>
+      </w:tr>
+      <w:tr>
+        <w:trPr/>
+        <w:tc>
+          <w:tcPr>
+            <w:tcW w:w="2441" w:type="dxa"/>
+            <w:vAlign w:val="center"/>
+          </w:tcPr>
+          <w:p>
+            <w:pPr>
+              <w:spacing w:before="20" w:after="20" w:line="240" w:lineRule="auto"/>
+              <w:jc w:val="left"/>
+            </w:pPr>
+            <w:r>
+              <w:rPr>
+                <w:rFonts w:asciiTheme="majorBidi" w:hAnsiTheme="majorBidi" w:cstheme="majorBidi"/>
+                <w:sz w:val="17"/>
+                <w:szCs w:val="17"/>
+              </w:rPr>
+              <w:t xml:space="preserve">2019-06-24 10:09</w:t>
+            </w:r>
+          </w:p>
+        </w:tc>
+        <w:tc>
+          <w:tcPr>
+            <w:tcW w:w="931" w:type="dxa"/>
+            <w:vAlign w:val="center"/>
+          </w:tcPr>
+          <w:p>
+            <w:pPr>
+              <w:spacing w:before="20" w:after="20" w:line="240" w:lineRule="auto"/>
+              <w:jc w:val="center"/>
+            </w:pPr>
+            <w:r>
+              <w:rPr>
+                <w:rFonts w:asciiTheme="majorBidi" w:hAnsiTheme="majorBidi" w:cstheme="majorBidi"/>
+                <w:sz w:val="17"/>
+                <w:szCs w:val="17"/>
+              </w:rPr>
+              <w:t xml:space="preserve">1022</w:t>
+            </w:r>
+          </w:p>
+        </w:tc>
+        <w:tc>
+          <w:tcPr>
+            <w:tcW w:w="1224" w:type="dxa"/>
+            <w:vAlign w:val="center"/>
+          </w:tcPr>
+          <w:p>
+            <w:pPr>
+              <w:spacing w:before="20" w:after="20" w:line="240" w:lineRule="auto"/>
+              <w:jc w:val="center"/>
+            </w:pPr>
+            <w:r>
+              <w:rPr>
+                <w:rFonts w:asciiTheme="majorBidi" w:hAnsiTheme="majorBidi" w:cstheme="majorBidi"/>
+                <w:sz w:val="17"/>
+                <w:szCs w:val="17"/>
+              </w:rPr>
+              <w:t xml:space="preserve">42.57</w:t>
+            </w:r>
+          </w:p>
+        </w:tc>
+        <w:tc>
+          <w:tcPr>
+            <w:tcW w:w="1405" w:type="dxa"/>
+            <w:vAlign w:val="center"/>
+          </w:tcPr>
+          <w:p>
+            <w:pPr>
+              <w:spacing w:before="20" w:after="20" w:line="240" w:lineRule="auto"/>
+              <w:jc w:val="center"/>
+            </w:pPr>
+            <w:r>
+              <w:rPr>
+                <w:rFonts w:asciiTheme="majorBidi" w:hAnsiTheme="majorBidi" w:cstheme="majorBidi"/>
+                <w:sz w:val="17"/>
+                <w:szCs w:val="17"/>
+              </w:rPr>
+              <w:t xml:space="preserve">74.51</w:t>
+            </w:r>
+          </w:p>
+        </w:tc>
+        <w:tc>
+          <w:tcPr>
+            <w:tcW w:w="1224" w:type="dxa"/>
+            <w:vAlign w:val="center"/>
+          </w:tcPr>
+          <w:p>
+            <w:pPr>
+              <w:spacing w:before="20" w:after="20" w:line="240" w:lineRule="auto"/>
+              <w:jc w:val="center"/>
+            </w:pPr>
+            <w:r>
+              <w:rPr>
+                <w:rFonts w:asciiTheme="majorBidi" w:hAnsiTheme="majorBidi" w:cstheme="majorBidi"/>
+                <w:sz w:val="17"/>
+                <w:szCs w:val="17"/>
+              </w:rPr>
+              <w:t xml:space="preserve">21.14</w:t>
+            </w:r>
+          </w:p>
+        </w:tc>
+        <w:tc>
+          <w:tcPr>
+            <w:tcW w:w="1272" w:type="dxa"/>
+            <w:vAlign w:val="center"/>
+          </w:tcPr>
+          <w:p>
+            <w:pPr>
+              <w:spacing w:before="20" w:after="20" w:line="240" w:lineRule="auto"/>
+              <w:jc w:val="center"/>
+            </w:pPr>
+            <w:r>
+              <w:rPr>
+                <w:rFonts w:asciiTheme="majorBidi" w:hAnsiTheme="majorBidi" w:cstheme="majorBidi"/>
+                <w:sz w:val="17"/>
+                <w:szCs w:val="17"/>
+              </w:rPr>
+              <w:t xml:space="preserve">198.73</w:t>
+            </w:r>
+          </w:p>
+        </w:tc>
+      </w:tr>
+      <w:tr>
+        <w:trPr/>
+        <w:tc>
+          <w:tcPr>
+            <w:tcW w:w="2441" w:type="dxa"/>
+            <w:vAlign w:val="center"/>
+          </w:tcPr>
+          <w:p>
+            <w:pPr>
+              <w:spacing w:before="20" w:after="20" w:line="240" w:lineRule="auto"/>
+              <w:jc w:val="left"/>
+            </w:pPr>
+            <w:r>
+              <w:rPr>
+                <w:rFonts w:asciiTheme="majorBidi" w:hAnsiTheme="majorBidi" w:cstheme="majorBidi"/>
+                <w:sz w:val="17"/>
+                <w:szCs w:val="17"/>
+              </w:rPr>
+              <w:t xml:space="preserve">2019-06-24 11:09</w:t>
+            </w:r>
+          </w:p>
+        </w:tc>
+        <w:tc>
+          <w:tcPr>
+            <w:tcW w:w="931" w:type="dxa"/>
+            <w:vAlign w:val="center"/>
+          </w:tcPr>
+          <w:p>
+            <w:pPr>
+              <w:spacing w:before="20" w:after="20" w:line="240" w:lineRule="auto"/>
+              <w:jc w:val="center"/>
+            </w:pPr>
+            <w:r>
+              <w:rPr>
+                <w:rFonts w:asciiTheme="majorBidi" w:hAnsiTheme="majorBidi" w:cstheme="majorBidi"/>
+                <w:sz w:val="17"/>
+                <w:szCs w:val="17"/>
+              </w:rPr>
+              <w:t xml:space="preserve">915</w:t>
+            </w:r>
+          </w:p>
+        </w:tc>
+        <w:tc>
+          <w:tcPr>
+            <w:tcW w:w="1224" w:type="dxa"/>
+            <w:vAlign w:val="center"/>
+          </w:tcPr>
+          <w:p>
+            <w:pPr>
+              <w:spacing w:before="20" w:after="20" w:line="240" w:lineRule="auto"/>
+              <w:jc w:val="center"/>
+            </w:pPr>
+            <w:r>
+              <w:rPr>
+                <w:rFonts w:asciiTheme="majorBidi" w:hAnsiTheme="majorBidi" w:cstheme="majorBidi"/>
+                <w:sz w:val="17"/>
+                <w:szCs w:val="17"/>
+              </w:rPr>
+              <w:t xml:space="preserve">43.19</w:t>
+            </w:r>
+          </w:p>
+        </w:tc>
+        <w:tc>
+          <w:tcPr>
+            <w:tcW w:w="1405" w:type="dxa"/>
+            <w:vAlign w:val="center"/>
+          </w:tcPr>
+          <w:p>
+            <w:pPr>
+              <w:spacing w:before="20" w:after="20" w:line="240" w:lineRule="auto"/>
+              <w:jc w:val="center"/>
+            </w:pPr>
+            <w:r>
+              <w:rPr>
+                <w:rFonts w:asciiTheme="majorBidi" w:hAnsiTheme="majorBidi" w:cstheme="majorBidi"/>
+                <w:sz w:val="17"/>
+                <w:szCs w:val="17"/>
+              </w:rPr>
+              <w:t xml:space="preserve">71.78</w:t>
+            </w:r>
+          </w:p>
+        </w:tc>
+        <w:tc>
+          <w:tcPr>
+            <w:tcW w:w="1224" w:type="dxa"/>
+            <w:vAlign w:val="center"/>
+          </w:tcPr>
+          <w:p>
+            <w:pPr>
+              <w:spacing w:before="20" w:after="20" w:line="240" w:lineRule="auto"/>
+              <w:jc w:val="center"/>
+            </w:pPr>
+            <w:r>
+              <w:rPr>
+                <w:rFonts w:asciiTheme="majorBidi" w:hAnsiTheme="majorBidi" w:cstheme="majorBidi"/>
+                <w:sz w:val="17"/>
+                <w:szCs w:val="17"/>
+              </w:rPr>
+              <w:t xml:space="preserve">21.39</w:t>
+            </w:r>
+          </w:p>
+        </w:tc>
+        <w:tc>
+          <w:tcPr>
+            <w:tcW w:w="1272" w:type="dxa"/>
+            <w:vAlign w:val="center"/>
+          </w:tcPr>
+          <w:p>
+            <w:pPr>
+              <w:spacing w:before="20" w:after="20" w:line="240" w:lineRule="auto"/>
+              <w:jc w:val="center"/>
+            </w:pPr>
+            <w:r>
+              <w:rPr>
+                <w:rFonts w:asciiTheme="majorBidi" w:hAnsiTheme="majorBidi" w:cstheme="majorBidi"/>
+                <w:sz w:val="17"/>
+                <w:szCs w:val="17"/>
+              </w:rPr>
+              <w:t xml:space="preserve">180.21</w:t>
+            </w:r>
+          </w:p>
+        </w:tc>
+      </w:tr>
+      <w:tr>
+        <w:trPr/>
+        <w:tc>
+          <w:tcPr>
+            <w:tcW w:w="2441" w:type="dxa"/>
+            <w:vAlign w:val="center"/>
+          </w:tcPr>
+          <w:p>
+            <w:pPr>
+              <w:spacing w:before="20" w:after="20" w:line="240" w:lineRule="auto"/>
+              <w:jc w:val="left"/>
+            </w:pPr>
+            <w:r>
+              <w:rPr>
+                <w:rFonts w:asciiTheme="majorBidi" w:hAnsiTheme="majorBidi" w:cstheme="majorBidi"/>
+                <w:sz w:val="17"/>
+                <w:szCs w:val="17"/>
+              </w:rPr>
+              <w:t xml:space="preserve">2019-06-24 12:09</w:t>
+            </w:r>
+          </w:p>
+        </w:tc>
+        <w:tc>
+          <w:tcPr>
+            <w:tcW w:w="931" w:type="dxa"/>
+            <w:vAlign w:val="center"/>
+          </w:tcPr>
+          <w:p>
+            <w:pPr>
+              <w:spacing w:before="20" w:after="20" w:line="240" w:lineRule="auto"/>
+              <w:jc w:val="center"/>
+            </w:pPr>
+            <w:r>
+              <w:rPr>
+                <w:rFonts w:asciiTheme="majorBidi" w:hAnsiTheme="majorBidi" w:cstheme="majorBidi"/>
+                <w:sz w:val="17"/>
+                <w:szCs w:val="17"/>
+              </w:rPr>
+              <w:t xml:space="preserve">757</w:t>
+            </w:r>
+          </w:p>
+        </w:tc>
+        <w:tc>
+          <w:tcPr>
+            <w:tcW w:w="1224" w:type="dxa"/>
+            <w:vAlign w:val="center"/>
+          </w:tcPr>
+          <w:p>
+            <w:pPr>
+              <w:spacing w:before="20" w:after="20" w:line="240" w:lineRule="auto"/>
+              <w:jc w:val="center"/>
+            </w:pPr>
+            <w:r>
+              <w:rPr>
+                <w:rFonts w:asciiTheme="majorBidi" w:hAnsiTheme="majorBidi" w:cstheme="majorBidi"/>
+                <w:sz w:val="17"/>
+                <w:szCs w:val="17"/>
+              </w:rPr>
+              <w:t xml:space="preserve">43.53</w:t>
+            </w:r>
+          </w:p>
+        </w:tc>
+        <w:tc>
+          <w:tcPr>
+            <w:tcW w:w="1405" w:type="dxa"/>
+            <w:vAlign w:val="center"/>
+          </w:tcPr>
+          <w:p>
+            <w:pPr>
+              <w:spacing w:before="20" w:after="20" w:line="240" w:lineRule="auto"/>
+              <w:jc w:val="center"/>
+            </w:pPr>
+            <w:r>
+              <w:rPr>
+                <w:rFonts w:asciiTheme="majorBidi" w:hAnsiTheme="majorBidi" w:cstheme="majorBidi"/>
+                <w:sz w:val="17"/>
+                <w:szCs w:val="17"/>
+              </w:rPr>
+              <w:t xml:space="preserve">67.19</w:t>
+            </w:r>
+          </w:p>
+        </w:tc>
+        <w:tc>
+          <w:tcPr>
+            <w:tcW w:w="1224" w:type="dxa"/>
+            <w:vAlign w:val="center"/>
+          </w:tcPr>
+          <w:p>
+            <w:pPr>
+              <w:spacing w:before="20" w:after="20" w:line="240" w:lineRule="auto"/>
+              <w:jc w:val="center"/>
+            </w:pPr>
+            <w:r>
+              <w:rPr>
+                <w:rFonts w:asciiTheme="majorBidi" w:hAnsiTheme="majorBidi" w:cstheme="majorBidi"/>
+                <w:sz w:val="17"/>
+                <w:szCs w:val="17"/>
+              </w:rPr>
+              <w:t xml:space="preserve">21.79</w:t>
+            </w:r>
+          </w:p>
+        </w:tc>
+        <w:tc>
+          <w:tcPr>
+            <w:tcW w:w="1272" w:type="dxa"/>
+            <w:vAlign w:val="center"/>
+          </w:tcPr>
+          <w:p>
+            <w:pPr>
+              <w:spacing w:before="20" w:after="20" w:line="240" w:lineRule="auto"/>
+              <w:jc w:val="center"/>
+            </w:pPr>
+            <w:r>
+              <w:rPr>
+                <w:rFonts w:asciiTheme="majorBidi" w:hAnsiTheme="majorBidi" w:cstheme="majorBidi"/>
+                <w:sz w:val="17"/>
+                <w:szCs w:val="17"/>
+              </w:rPr>
+              <w:t xml:space="preserve">152.04</w:t>
+            </w:r>
+          </w:p>
+        </w:tc>
+      </w:tr>
+      <w:tr>
+        <w:trPr/>
+        <w:tc>
+          <w:tcPr>
+            <w:tcW w:w="2441" w:type="dxa"/>
+            <w:vAlign w:val="center"/>
+          </w:tcPr>
+          <w:p>
+            <w:pPr>
+              <w:spacing w:before="20" w:after="20" w:line="240" w:lineRule="auto"/>
+              <w:jc w:val="left"/>
+            </w:pPr>
+            <w:r>
+              <w:rPr>
+                <w:rFonts w:asciiTheme="majorBidi" w:hAnsiTheme="majorBidi" w:cstheme="majorBidi"/>
+                <w:sz w:val="17"/>
+                <w:szCs w:val="17"/>
+              </w:rPr>
+              <w:t xml:space="preserve">2019-06-24 13:09</w:t>
+            </w:r>
+          </w:p>
+        </w:tc>
+        <w:tc>
+          <w:tcPr>
+            <w:tcW w:w="931" w:type="dxa"/>
+            <w:vAlign w:val="center"/>
+          </w:tcPr>
+          <w:p>
+            <w:pPr>
+              <w:spacing w:before="20" w:after="20" w:line="240" w:lineRule="auto"/>
+              <w:jc w:val="center"/>
+            </w:pPr>
+            <w:r>
+              <w:rPr>
+                <w:rFonts w:asciiTheme="majorBidi" w:hAnsiTheme="majorBidi" w:cstheme="majorBidi"/>
+                <w:sz w:val="17"/>
+                <w:szCs w:val="17"/>
+              </w:rPr>
+              <w:t xml:space="preserve">584</w:t>
+            </w:r>
+          </w:p>
+        </w:tc>
+        <w:tc>
+          <w:tcPr>
+            <w:tcW w:w="1224" w:type="dxa"/>
+            <w:vAlign w:val="center"/>
+          </w:tcPr>
+          <w:p>
+            <w:pPr>
+              <w:spacing w:before="20" w:after="20" w:line="240" w:lineRule="auto"/>
+              <w:jc w:val="center"/>
+            </w:pPr>
+            <w:r>
+              <w:rPr>
+                <w:rFonts w:asciiTheme="majorBidi" w:hAnsiTheme="majorBidi" w:cstheme="majorBidi"/>
+                <w:sz w:val="17"/>
+                <w:szCs w:val="17"/>
+              </w:rPr>
+              <w:t xml:space="preserve">43.56</w:t>
+            </w:r>
+          </w:p>
+        </w:tc>
+        <w:tc>
+          <w:tcPr>
+            <w:tcW w:w="1405" w:type="dxa"/>
+            <w:vAlign w:val="center"/>
+          </w:tcPr>
+          <w:p>
+            <w:pPr>
+              <w:spacing w:before="20" w:after="20" w:line="240" w:lineRule="auto"/>
+              <w:jc w:val="center"/>
+            </w:pPr>
+            <w:r>
+              <w:rPr>
+                <w:rFonts w:asciiTheme="majorBidi" w:hAnsiTheme="majorBidi" w:cstheme="majorBidi"/>
+                <w:sz w:val="17"/>
+                <w:szCs w:val="17"/>
+              </w:rPr>
+              <w:t xml:space="preserve">61.81</w:t>
+            </w:r>
+          </w:p>
+        </w:tc>
+        <w:tc>
+          <w:tcPr>
+            <w:tcW w:w="1224" w:type="dxa"/>
+            <w:vAlign w:val="center"/>
+          </w:tcPr>
+          <w:p>
+            <w:pPr>
+              <w:spacing w:before="20" w:after="20" w:line="240" w:lineRule="auto"/>
+              <w:jc w:val="center"/>
+            </w:pPr>
+            <w:r>
+              <w:rPr>
+                <w:rFonts w:asciiTheme="majorBidi" w:hAnsiTheme="majorBidi" w:cstheme="majorBidi"/>
+                <w:sz w:val="17"/>
+                <w:szCs w:val="17"/>
+              </w:rPr>
+              <w:t xml:space="preserve">22.18</w:t>
+            </w:r>
+          </w:p>
+        </w:tc>
+        <w:tc>
+          <w:tcPr>
+            <w:tcW w:w="1272" w:type="dxa"/>
+            <w:vAlign w:val="center"/>
+          </w:tcPr>
+          <w:p>
+            <w:pPr>
+              <w:spacing w:before="20" w:after="20" w:line="240" w:lineRule="auto"/>
+              <w:jc w:val="center"/>
+            </w:pPr>
+            <w:r>
+              <w:rPr>
+                <w:rFonts w:asciiTheme="majorBidi" w:hAnsiTheme="majorBidi" w:cstheme="majorBidi"/>
+                <w:sz w:val="17"/>
+                <w:szCs w:val="17"/>
+              </w:rPr>
+              <w:t xml:space="preserve">119.52</w:t>
+            </w:r>
+          </w:p>
+        </w:tc>
+      </w:tr>
+      <w:tr>
+        <w:trPr/>
+        <w:tc>
+          <w:tcPr>
+            <w:tcW w:w="2441" w:type="dxa"/>
+            <w:vAlign w:val="center"/>
+          </w:tcPr>
+          <w:p>
+            <w:pPr>
+              <w:spacing w:before="20" w:after="20" w:line="240" w:lineRule="auto"/>
+              <w:jc w:val="left"/>
+            </w:pPr>
+            <w:r>
+              <w:rPr>
+                <w:rFonts w:asciiTheme="majorBidi" w:hAnsiTheme="majorBidi" w:cstheme="majorBidi"/>
+                <w:sz w:val="17"/>
+                <w:szCs w:val="17"/>
+              </w:rPr>
+              <w:t xml:space="preserve">2019-06-24 14:09</w:t>
+            </w:r>
+          </w:p>
+        </w:tc>
+        <w:tc>
+          <w:tcPr>
+            <w:tcW w:w="931" w:type="dxa"/>
+            <w:vAlign w:val="center"/>
+          </w:tcPr>
+          <w:p>
+            <w:pPr>
+              <w:spacing w:before="20" w:after="20" w:line="240" w:lineRule="auto"/>
+              <w:jc w:val="center"/>
+            </w:pPr>
+            <w:r>
+              <w:rPr>
+                <w:rFonts w:asciiTheme="majorBidi" w:hAnsiTheme="majorBidi" w:cstheme="majorBidi"/>
+                <w:sz w:val="17"/>
+                <w:szCs w:val="17"/>
+              </w:rPr>
+              <w:t xml:space="preserve">365</w:t>
+            </w:r>
+          </w:p>
+        </w:tc>
+        <w:tc>
+          <w:tcPr>
+            <w:tcW w:w="1224" w:type="dxa"/>
+            <w:vAlign w:val="center"/>
+          </w:tcPr>
+          <w:p>
+            <w:pPr>
+              <w:spacing w:before="20" w:after="20" w:line="240" w:lineRule="auto"/>
+              <w:jc w:val="center"/>
+            </w:pPr>
+            <w:r>
+              <w:rPr>
+                <w:rFonts w:asciiTheme="majorBidi" w:hAnsiTheme="majorBidi" w:cstheme="majorBidi"/>
+                <w:sz w:val="17"/>
+                <w:szCs w:val="17"/>
+              </w:rPr>
+              <w:t xml:space="preserve">43.24</w:t>
+            </w:r>
+          </w:p>
+        </w:tc>
+        <w:tc>
+          <w:tcPr>
+            <w:tcW w:w="1405" w:type="dxa"/>
+            <w:vAlign w:val="center"/>
+          </w:tcPr>
+          <w:p>
+            <w:pPr>
+              <w:spacing w:before="20" w:after="20" w:line="240" w:lineRule="auto"/>
+              <w:jc w:val="center"/>
+            </w:pPr>
+            <w:r>
+              <w:rPr>
+                <w:rFonts w:asciiTheme="majorBidi" w:hAnsiTheme="majorBidi" w:cstheme="majorBidi"/>
+                <w:sz w:val="17"/>
+                <w:szCs w:val="17"/>
+              </w:rPr>
+              <w:t xml:space="preserve">54.65</w:t>
+            </w:r>
+          </w:p>
+        </w:tc>
+        <w:tc>
+          <w:tcPr>
+            <w:tcW w:w="1224" w:type="dxa"/>
+            <w:vAlign w:val="center"/>
+          </w:tcPr>
+          <w:p>
+            <w:pPr>
+              <w:spacing w:before="20" w:after="20" w:line="240" w:lineRule="auto"/>
+              <w:jc w:val="center"/>
+            </w:pPr>
+            <w:r>
+              <w:rPr>
+                <w:rFonts w:asciiTheme="majorBidi" w:hAnsiTheme="majorBidi" w:cstheme="majorBidi"/>
+                <w:sz w:val="17"/>
+                <w:szCs w:val="17"/>
+              </w:rPr>
+              <w:t xml:space="preserve">22.51</w:t>
+            </w:r>
+          </w:p>
+        </w:tc>
+        <w:tc>
+          <w:tcPr>
+            <w:tcW w:w="1272" w:type="dxa"/>
+            <w:vAlign w:val="center"/>
+          </w:tcPr>
+          <w:p>
+            <w:pPr>
+              <w:spacing w:before="20" w:after="20" w:line="240" w:lineRule="auto"/>
+              <w:jc w:val="center"/>
+            </w:pPr>
+            <w:r>
+              <w:rPr>
+                <w:rFonts w:asciiTheme="majorBidi" w:hAnsiTheme="majorBidi" w:cstheme="majorBidi"/>
+                <w:sz w:val="17"/>
+                <w:szCs w:val="17"/>
+              </w:rPr>
+              <w:t xml:space="preserve">75.80</w:t>
+            </w:r>
+          </w:p>
+        </w:tc>
+      </w:tr>
+    </w:tbl>
+    <w:p>
+      <w:pPr>
+        <w:spacing w:after="120"/>
+      </w:pPr>
+    </w:p>
+    <w:p>
+      <w:pPr>
+        <w:keepNext/>
+        <w:spacing w:before="60" w:after="140" w:line="240" w:lineRule="auto"/>
+        <w:jc w:val="both"/>
+      </w:pPr>
+      <w:r>
+        <w:rPr>
+          <w:rFonts w:asciiTheme="majorBidi" w:hAnsiTheme="majorBidi" w:cstheme="majorBidi"/>
+          <w:b/>
+          <w:bCs/>
+          <w:sz w:val="18"/>
+          <w:szCs w:val="18"/>
+        </w:rPr>
+        <w:t xml:space="preserve">Table S2</w:t>
+      </w:r>
+      <w:r>
+        <w:rPr>
+          <w:rFonts w:asciiTheme="majorBidi" w:hAnsiTheme="majorBidi" w:cstheme="majorBidi"/>
+          <w:sz w:val="18"/>
+          <w:szCs w:val="18"/>
+        </w:rPr>
+        <w:t xml:space="preserve"> One partially shaded sample (nominal plant, test-year conditions: </w:t>
+      </w:r>
+      <w:r>
+        <w:rPr>
+          <w:rFonts w:asciiTheme="majorBidi" w:hAnsiTheme="majorBidi" w:cstheme="majorBidi"/>
+          <w:sz w:val="18"/>
+          <w:szCs w:val="18"/>
+        </w:rPr>
+        <w:t xml:space="preserve">G</w:t>
+      </w:r>
+      <w:r>
+        <w:rPr>
+          <w:rFonts w:asciiTheme="majorBidi" w:hAnsiTheme="majorBidi" w:cstheme="majorBidi"/>
+          <w:sz w:val="18"/>
+          <w:szCs w:val="18"/>
+          <w:vertAlign w:val="subscript"/>
+        </w:rPr>
+        <w:t xml:space="preserve">in</w:t>
+      </w:r>
+      <w:r>
+        <w:rPr>
+          <w:rFonts w:asciiTheme="majorBidi" w:hAnsiTheme="majorBidi" w:cstheme="majorBidi"/>
+          <w:sz w:val="18"/>
+          <w:szCs w:val="18"/>
+        </w:rPr>
+        <w:t xml:space="preserve"> = 93 W/m², T = 19.2 °C, true global-maximum voltage </w:t>
+      </w:r>
+      <w:r>
+        <w:rPr>
+          <w:rFonts w:asciiTheme="majorBidi" w:hAnsiTheme="majorBidi" w:cstheme="majorBidi"/>
+          <w:sz w:val="18"/>
+          <w:szCs w:val="18"/>
+        </w:rPr>
+        <w:t xml:space="preserve">V</w:t>
+      </w:r>
+      <w:r>
+        <w:rPr>
+          <w:rFonts w:asciiTheme="majorBidi" w:hAnsiTheme="majorBidi" w:cstheme="majorBidi"/>
+          <w:sz w:val="18"/>
+          <w:szCs w:val="18"/>
+          <w:vertAlign w:val="subscript"/>
+        </w:rPr>
+        <w:t xml:space="preserve">gmpp</w:t>
+      </w:r>
+      <w:r>
+        <w:rPr>
+          <w:rFonts w:asciiTheme="majorBidi" w:hAnsiTheme="majorBidi" w:cstheme="majorBidi"/>
+          <w:sz w:val="18"/>
+          <w:szCs w:val="18"/>
+        </w:rPr>
+        <w:t xml:space="preserve"> = 15.88 V). The 14 currents </w:t>
+      </w:r>
+      <w:r>
+        <w:rPr>
+          <w:rFonts w:asciiTheme="majorBidi" w:hAnsiTheme="majorBidi" w:cstheme="majorBidi"/>
+          <w:sz w:val="18"/>
+          <w:szCs w:val="18"/>
+        </w:rPr>
+        <w:t xml:space="preserve">I</w:t>
+      </w:r>
+      <w:r>
+        <w:rPr>
+          <w:rFonts w:asciiTheme="majorBidi" w:hAnsiTheme="majorBidi" w:cstheme="majorBidi"/>
+          <w:sz w:val="18"/>
+          <w:szCs w:val="18"/>
+          <w:vertAlign w:val="subscript"/>
+        </w:rPr>
+        <w:t xml:space="preserve">k</w:t>
+      </w:r>
+      <w:r>
+        <w:rPr>
+          <w:rFonts w:asciiTheme="majorBidi" w:hAnsiTheme="majorBidi" w:cstheme="majorBidi"/>
+          <w:sz w:val="18"/>
+          <w:szCs w:val="18"/>
+        </w:rPr>
+        <w:t xml:space="preserve"> measured at the probe voltages </w:t>
+      </w:r>
+      <w:r>
+        <w:rPr>
+          <w:rFonts w:asciiTheme="majorBidi" w:hAnsiTheme="majorBidi" w:cstheme="majorBidi"/>
+          <w:sz w:val="18"/>
+          <w:szCs w:val="18"/>
+        </w:rPr>
+        <w:t xml:space="preserve">V</w:t>
+      </w:r>
+      <w:r>
+        <w:rPr>
+          <w:rFonts w:asciiTheme="majorBidi" w:hAnsiTheme="majorBidi" w:cstheme="majorBidi"/>
+          <w:sz w:val="18"/>
+          <w:szCs w:val="18"/>
+          <w:vertAlign w:val="subscript"/>
+        </w:rPr>
+        <w:t xml:space="preserve">k</w:t>
+      </w:r>
+      <w:r>
+        <w:rPr>
+          <w:rFonts w:asciiTheme="majorBidi" w:hAnsiTheme="majorBidi" w:cstheme="majorBidi"/>
+          <w:sz w:val="18"/>
+          <w:szCs w:val="18"/>
+        </w:rPr>
+        <w:t xml:space="preserve"> form the input of the DNN together with </w:t>
+      </w:r>
+      <w:r>
+        <w:rPr>
+          <w:rFonts w:asciiTheme="majorBidi" w:hAnsiTheme="majorBidi" w:cstheme="majorBidi"/>
+          <w:sz w:val="18"/>
+          <w:szCs w:val="18"/>
+        </w:rPr>
+        <w:t xml:space="preserve">G</w:t>
+      </w:r>
+      <w:r>
+        <w:rPr>
+          <w:rFonts w:asciiTheme="majorBidi" w:hAnsiTheme="majorBidi" w:cstheme="majorBidi"/>
+          <w:sz w:val="18"/>
+          <w:szCs w:val="18"/>
+          <w:vertAlign w:val="subscript"/>
+        </w:rPr>
+        <w:t xml:space="preserve">in</w:t>
+      </w:r>
+      <w:r>
+        <w:rPr>
+          <w:rFonts w:asciiTheme="majorBidi" w:hAnsiTheme="majorBidi" w:cstheme="majorBidi"/>
+          <w:sz w:val="18"/>
+          <w:szCs w:val="18"/>
+        </w:rPr>
+        <w:t xml:space="preserve"> and T.</w:t>
+      </w:r>
+    </w:p>
+    <w:tbl>
+      <w:tblPr>
+        <w:tblW w:w="8491" w:type="dxa"/>
+        <w:jc w:val="center"/>
+        <w:tblBorders>
+          <w:top w:val="single" w:sz="8" w:space="0" w:color="000000"/>
+          <w:bottom w:val="single" w:sz="8" w:space="0" w:color="000000"/>
+          <w:insideH w:val="single" w:sz="2" w:space="0" w:color="BFBFBF"/>
+        </w:tblBorders>
+        <w:tblLayout w:type="fixed"/>
+        <w:tblCellMar>
+          <w:left w:w="60" w:type="dxa"/>
+          <w:right w:w="60" w:type="dxa"/>
+        </w:tblCellMar>
+      </w:tblPr>
+      <w:tblGrid>
+        <w:gridCol w:w="1113"/>
+        <w:gridCol w:w="527"/>
+        <w:gridCol w:w="527"/>
+        <w:gridCol w:w="527"/>
+        <w:gridCol w:w="527"/>
+        <w:gridCol w:w="527"/>
+        <w:gridCol w:w="527"/>
+        <w:gridCol w:w="527"/>
+        <w:gridCol w:w="527"/>
+        <w:gridCol w:w="527"/>
+        <w:gridCol w:w="527"/>
+        <w:gridCol w:w="527"/>
+        <w:gridCol w:w="527"/>
+        <w:gridCol w:w="527"/>
+        <w:gridCol w:w="527"/>
+      </w:tblGrid>
+      <w:tr>
+        <w:trPr>
+          <w:tblHeader/>
+        </w:trPr>
+        <w:tc>
+          <w:tcPr>
+            <w:tcW w:w="1113" w:type="dxa"/>
+            <w:shd w:val="clear" w:color="auto" w:fill="F2F2F2"/>
+            <w:vAlign w:val="center"/>
+          </w:tcPr>
+          <w:p>
+            <w:pPr>
+              <w:spacing w:before="20" w:after="20" w:line="240" w:lineRule="auto"/>
+              <w:jc w:val="left"/>
+            </w:pPr>
+            <w:r>
+              <w:rPr>
+                <w:rFonts w:asciiTheme="majorBidi" w:hAnsiTheme="majorBidi" w:cstheme="majorBidi"/>
+                <w:b/>
+                <w:bCs/>
+                <w:sz w:val="16"/>
+                <w:szCs w:val="16"/>
+              </w:rPr>
+              <w:t xml:space="preserve">Probe </w:t>
+            </w:r>
+            <w:r>
+              <w:rPr>
+                <w:rFonts w:asciiTheme="majorBidi" w:hAnsiTheme="majorBidi" w:cstheme="majorBidi"/>
+                <w:b/>
+                <w:bCs/>
+                <w:sz w:val="16"/>
+                <w:szCs w:val="16"/>
+              </w:rPr>
+              <w:t xml:space="preserve">V</w:t>
+            </w:r>
+            <w:r>
+              <w:rPr>
+                <w:rFonts w:asciiTheme="majorBidi" w:hAnsiTheme="majorBidi" w:cstheme="majorBidi"/>
+                <w:b/>
+                <w:bCs/>
+                <w:sz w:val="16"/>
+                <w:szCs w:val="16"/>
+                <w:vertAlign w:val="subscript"/>
+              </w:rPr>
+              <w:t xml:space="preserve">k</w:t>
+            </w:r>
+            <w:r>
+              <w:rPr>
+                <w:rFonts w:asciiTheme="majorBidi" w:hAnsiTheme="majorBidi" w:cstheme="majorBidi"/>
+                <w:b/>
+                <w:bCs/>
+                <w:sz w:val="16"/>
+                <w:szCs w:val="16"/>
+              </w:rPr>
+              <w:t xml:space="preserve"> (V)</w:t>
+            </w:r>
+          </w:p>
+        </w:tc>
+        <w:tc>
+          <w:tcPr>
+            <w:tcW w:w="527" w:type="dxa"/>
+            <w:shd w:val="clear" w:color="auto" w:fill="F2F2F2"/>
+            <w:vAlign w:val="center"/>
+          </w:tcPr>
+          <w:p>
+            <w:pPr>
+              <w:spacing w:before="20" w:after="20" w:line="240" w:lineRule="auto"/>
+              <w:jc w:val="center"/>
+            </w:pPr>
+            <w:r>
+              <w:rPr>
+                <w:rFonts w:asciiTheme="majorBidi" w:hAnsiTheme="majorBidi" w:cstheme="majorBidi"/>
+                <w:b/>
+                <w:bCs/>
+                <w:sz w:val="16"/>
+                <w:szCs w:val="16"/>
+              </w:rPr>
+              <w:t xml:space="preserve">8.00</w:t>
+            </w:r>
+          </w:p>
+        </w:tc>
+        <w:tc>
+          <w:tcPr>
+            <w:tcW w:w="527" w:type="dxa"/>
+            <w:shd w:val="clear" w:color="auto" w:fill="F2F2F2"/>
+            <w:vAlign w:val="center"/>
+          </w:tcPr>
+          <w:p>
+            <w:pPr>
+              <w:spacing w:before="20" w:after="20" w:line="240" w:lineRule="auto"/>
+              <w:jc w:val="center"/>
+            </w:pPr>
+            <w:r>
+              <w:rPr>
+                <w:rFonts w:asciiTheme="majorBidi" w:hAnsiTheme="majorBidi" w:cstheme="majorBidi"/>
+                <w:b/>
+                <w:bCs/>
+                <w:sz w:val="16"/>
+                <w:szCs w:val="16"/>
+              </w:rPr>
+              <w:t xml:space="preserve">10.08</w:t>
+            </w:r>
+          </w:p>
+        </w:tc>
+        <w:tc>
+          <w:tcPr>
+            <w:tcW w:w="527" w:type="dxa"/>
+            <w:shd w:val="clear" w:color="auto" w:fill="F2F2F2"/>
+            <w:vAlign w:val="center"/>
+          </w:tcPr>
+          <w:p>
+            <w:pPr>
+              <w:spacing w:before="20" w:after="20" w:line="240" w:lineRule="auto"/>
+              <w:jc w:val="center"/>
+            </w:pPr>
+            <w:r>
+              <w:rPr>
+                <w:rFonts w:asciiTheme="majorBidi" w:hAnsiTheme="majorBidi" w:cstheme="majorBidi"/>
+                <w:b/>
+                <w:bCs/>
+                <w:sz w:val="16"/>
+                <w:szCs w:val="16"/>
+              </w:rPr>
+              <w:t xml:space="preserve">12.15</w:t>
+            </w:r>
+          </w:p>
+        </w:tc>
+        <w:tc>
+          <w:tcPr>
+            <w:tcW w:w="527" w:type="dxa"/>
+            <w:shd w:val="clear" w:color="auto" w:fill="F2F2F2"/>
+            <w:vAlign w:val="center"/>
+          </w:tcPr>
+          <w:p>
+            <w:pPr>
+              <w:spacing w:before="20" w:after="20" w:line="240" w:lineRule="auto"/>
+              <w:jc w:val="center"/>
+            </w:pPr>
+            <w:r>
+              <w:rPr>
+                <w:rFonts w:asciiTheme="majorBidi" w:hAnsiTheme="majorBidi" w:cstheme="majorBidi"/>
+                <w:b/>
+                <w:bCs/>
+                <w:sz w:val="16"/>
+                <w:szCs w:val="16"/>
+              </w:rPr>
+              <w:t xml:space="preserve">14.23</w:t>
+            </w:r>
+          </w:p>
+        </w:tc>
+        <w:tc>
+          <w:tcPr>
+            <w:tcW w:w="527" w:type="dxa"/>
+            <w:shd w:val="clear" w:color="auto" w:fill="F2F2F2"/>
+            <w:vAlign w:val="center"/>
+          </w:tcPr>
+          <w:p>
+            <w:pPr>
+              <w:spacing w:before="20" w:after="20" w:line="240" w:lineRule="auto"/>
+              <w:jc w:val="center"/>
+            </w:pPr>
+            <w:r>
+              <w:rPr>
+                <w:rFonts w:asciiTheme="majorBidi" w:hAnsiTheme="majorBidi" w:cstheme="majorBidi"/>
+                <w:b/>
+                <w:bCs/>
+                <w:sz w:val="16"/>
+                <w:szCs w:val="16"/>
+              </w:rPr>
+              <w:t xml:space="preserve">16.31</w:t>
+            </w:r>
+          </w:p>
+        </w:tc>
+        <w:tc>
+          <w:tcPr>
+            <w:tcW w:w="527" w:type="dxa"/>
+            <w:shd w:val="clear" w:color="auto" w:fill="F2F2F2"/>
+            <w:vAlign w:val="center"/>
+          </w:tcPr>
+          <w:p>
+            <w:pPr>
+              <w:spacing w:before="20" w:after="20" w:line="240" w:lineRule="auto"/>
+              <w:jc w:val="center"/>
+            </w:pPr>
+            <w:r>
+              <w:rPr>
+                <w:rFonts w:asciiTheme="majorBidi" w:hAnsiTheme="majorBidi" w:cstheme="majorBidi"/>
+                <w:b/>
+                <w:bCs/>
+                <w:sz w:val="16"/>
+                <w:szCs w:val="16"/>
+              </w:rPr>
+              <w:t xml:space="preserve">18.38</w:t>
+            </w:r>
+          </w:p>
+        </w:tc>
+        <w:tc>
+          <w:tcPr>
+            <w:tcW w:w="527" w:type="dxa"/>
+            <w:shd w:val="clear" w:color="auto" w:fill="F2F2F2"/>
+            <w:vAlign w:val="center"/>
+          </w:tcPr>
+          <w:p>
+            <w:pPr>
+              <w:spacing w:before="20" w:after="20" w:line="240" w:lineRule="auto"/>
+              <w:jc w:val="center"/>
+            </w:pPr>
+            <w:r>
+              <w:rPr>
+                <w:rFonts w:asciiTheme="majorBidi" w:hAnsiTheme="majorBidi" w:cstheme="majorBidi"/>
+                <w:b/>
+                <w:bCs/>
+                <w:sz w:val="16"/>
+                <w:szCs w:val="16"/>
+              </w:rPr>
+              <w:t xml:space="preserve">20.46</w:t>
+            </w:r>
+          </w:p>
+        </w:tc>
+        <w:tc>
+          <w:tcPr>
+            <w:tcW w:w="527" w:type="dxa"/>
+            <w:shd w:val="clear" w:color="auto" w:fill="F2F2F2"/>
+            <w:vAlign w:val="center"/>
+          </w:tcPr>
+          <w:p>
+            <w:pPr>
+              <w:spacing w:before="20" w:after="20" w:line="240" w:lineRule="auto"/>
+              <w:jc w:val="center"/>
+            </w:pPr>
+            <w:r>
+              <w:rPr>
+                <w:rFonts w:asciiTheme="majorBidi" w:hAnsiTheme="majorBidi" w:cstheme="majorBidi"/>
+                <w:b/>
+                <w:bCs/>
+                <w:sz w:val="16"/>
+                <w:szCs w:val="16"/>
+              </w:rPr>
+              <w:t xml:space="preserve">22.54</w:t>
+            </w:r>
+          </w:p>
+        </w:tc>
+        <w:tc>
+          <w:tcPr>
+            <w:tcW w:w="527" w:type="dxa"/>
+            <w:shd w:val="clear" w:color="auto" w:fill="F2F2F2"/>
+            <w:vAlign w:val="center"/>
+          </w:tcPr>
+          <w:p>
+            <w:pPr>
+              <w:spacing w:before="20" w:after="20" w:line="240" w:lineRule="auto"/>
+              <w:jc w:val="center"/>
+            </w:pPr>
+            <w:r>
+              <w:rPr>
+                <w:rFonts w:asciiTheme="majorBidi" w:hAnsiTheme="majorBidi" w:cstheme="majorBidi"/>
+                <w:b/>
+                <w:bCs/>
+                <w:sz w:val="16"/>
+                <w:szCs w:val="16"/>
+              </w:rPr>
+              <w:t xml:space="preserve">24.62</w:t>
+            </w:r>
+          </w:p>
+        </w:tc>
+        <w:tc>
+          <w:tcPr>
+            <w:tcW w:w="527" w:type="dxa"/>
+            <w:shd w:val="clear" w:color="auto" w:fill="F2F2F2"/>
+            <w:vAlign w:val="center"/>
+          </w:tcPr>
+          <w:p>
+            <w:pPr>
+              <w:spacing w:before="20" w:after="20" w:line="240" w:lineRule="auto"/>
+              <w:jc w:val="center"/>
+            </w:pPr>
+            <w:r>
+              <w:rPr>
+                <w:rFonts w:asciiTheme="majorBidi" w:hAnsiTheme="majorBidi" w:cstheme="majorBidi"/>
+                <w:b/>
+                <w:bCs/>
+                <w:sz w:val="16"/>
+                <w:szCs w:val="16"/>
+              </w:rPr>
+              <w:t xml:space="preserve">26.69</w:t>
+            </w:r>
+          </w:p>
+        </w:tc>
+        <w:tc>
+          <w:tcPr>
+            <w:tcW w:w="527" w:type="dxa"/>
+            <w:shd w:val="clear" w:color="auto" w:fill="F2F2F2"/>
+            <w:vAlign w:val="center"/>
+          </w:tcPr>
+          <w:p>
+            <w:pPr>
+              <w:spacing w:before="20" w:after="20" w:line="240" w:lineRule="auto"/>
+              <w:jc w:val="center"/>
+            </w:pPr>
+            <w:r>
+              <w:rPr>
+                <w:rFonts w:asciiTheme="majorBidi" w:hAnsiTheme="majorBidi" w:cstheme="majorBidi"/>
+                <w:b/>
+                <w:bCs/>
+                <w:sz w:val="16"/>
+                <w:szCs w:val="16"/>
+              </w:rPr>
+              <w:t xml:space="preserve">28.77</w:t>
+            </w:r>
+          </w:p>
+        </w:tc>
+        <w:tc>
+          <w:tcPr>
+            <w:tcW w:w="527" w:type="dxa"/>
+            <w:shd w:val="clear" w:color="auto" w:fill="F2F2F2"/>
+            <w:vAlign w:val="center"/>
+          </w:tcPr>
+          <w:p>
+            <w:pPr>
+              <w:spacing w:before="20" w:after="20" w:line="240" w:lineRule="auto"/>
+              <w:jc w:val="center"/>
+            </w:pPr>
+            <w:r>
+              <w:rPr>
+                <w:rFonts w:asciiTheme="majorBidi" w:hAnsiTheme="majorBidi" w:cstheme="majorBidi"/>
+                <w:b/>
+                <w:bCs/>
+                <w:sz w:val="16"/>
+                <w:szCs w:val="16"/>
+              </w:rPr>
+              <w:t xml:space="preserve">30.85</w:t>
+            </w:r>
+          </w:p>
+        </w:tc>
+        <w:tc>
+          <w:tcPr>
+            <w:tcW w:w="527" w:type="dxa"/>
+            <w:shd w:val="clear" w:color="auto" w:fill="F2F2F2"/>
+            <w:vAlign w:val="center"/>
+          </w:tcPr>
+          <w:p>
+            <w:pPr>
+              <w:spacing w:before="20" w:after="20" w:line="240" w:lineRule="auto"/>
+              <w:jc w:val="center"/>
+            </w:pPr>
+            <w:r>
+              <w:rPr>
+                <w:rFonts w:asciiTheme="majorBidi" w:hAnsiTheme="majorBidi" w:cstheme="majorBidi"/>
+                <w:b/>
+                <w:bCs/>
+                <w:sz w:val="16"/>
+                <w:szCs w:val="16"/>
+              </w:rPr>
+              <w:t xml:space="preserve">32.92</w:t>
+            </w:r>
+          </w:p>
+        </w:tc>
+        <w:tc>
+          <w:tcPr>
+            <w:tcW w:w="527" w:type="dxa"/>
+            <w:shd w:val="clear" w:color="auto" w:fill="F2F2F2"/>
+            <w:vAlign w:val="center"/>
+          </w:tcPr>
+          <w:p>
+            <w:pPr>
+              <w:spacing w:before="20" w:after="20" w:line="240" w:lineRule="auto"/>
+              <w:jc w:val="center"/>
+            </w:pPr>
+            <w:r>
+              <w:rPr>
+                <w:rFonts w:asciiTheme="majorBidi" w:hAnsiTheme="majorBidi" w:cstheme="majorBidi"/>
+                <w:b/>
+                <w:bCs/>
+                <w:sz w:val="16"/>
+                <w:szCs w:val="16"/>
+              </w:rPr>
+              <w:t xml:space="preserve">35.00</w:t>
+            </w:r>
+          </w:p>
+        </w:tc>
+      </w:tr>
+      <w:tr>
+        <w:trPr/>
+        <w:tc>
+          <w:tcPr>
+            <w:tcW w:w="1113" w:type="dxa"/>
+            <w:vAlign w:val="center"/>
+          </w:tcPr>
+          <w:p>
+            <w:pPr>
+              <w:spacing w:before="20" w:after="20" w:line="240" w:lineRule="auto"/>
+              <w:jc w:val="left"/>
+            </w:pPr>
+            <w:r>
+              <w:rPr>
+                <w:rFonts w:asciiTheme="majorBidi" w:hAnsiTheme="majorBidi" w:cstheme="majorBidi"/>
+                <w:sz w:val="16"/>
+                <w:szCs w:val="16"/>
+              </w:rPr>
+              <w:t xml:space="preserve">I</w:t>
+            </w:r>
+            <w:r>
+              <w:rPr>
+                <w:rFonts w:asciiTheme="majorBidi" w:hAnsiTheme="majorBidi" w:cstheme="majorBidi"/>
+                <w:sz w:val="16"/>
+                <w:szCs w:val="16"/>
+                <w:vertAlign w:val="subscript"/>
+              </w:rPr>
+              <w:t xml:space="preserve">k</w:t>
+            </w:r>
+            <w:r>
+              <w:rPr>
+                <w:rFonts w:asciiTheme="majorBidi" w:hAnsiTheme="majorBidi" w:cstheme="majorBidi"/>
+                <w:sz w:val="16"/>
+                <w:szCs w:val="16"/>
+              </w:rPr>
+              <w:t xml:space="preserve"> (A)</w:t>
+            </w:r>
+          </w:p>
+        </w:tc>
+        <w:tc>
+          <w:tcPr>
+            <w:tcW w:w="527" w:type="dxa"/>
+            <w:vAlign w:val="center"/>
+          </w:tcPr>
+          <w:p>
+            <w:pPr>
+              <w:spacing w:before="20" w:after="20" w:line="240" w:lineRule="auto"/>
+              <w:jc w:val="center"/>
+            </w:pPr>
+            <w:r>
+              <w:rPr>
+                <w:rFonts w:asciiTheme="majorBidi" w:hAnsiTheme="majorBidi" w:cstheme="majorBidi"/>
+                <w:sz w:val="16"/>
+                <w:szCs w:val="16"/>
+              </w:rPr>
+              <w:t xml:space="preserve">1.140</w:t>
+            </w:r>
+          </w:p>
+        </w:tc>
+        <w:tc>
+          <w:tcPr>
+            <w:tcW w:w="527" w:type="dxa"/>
+            <w:vAlign w:val="center"/>
+          </w:tcPr>
+          <w:p>
+            <w:pPr>
+              <w:spacing w:before="20" w:after="20" w:line="240" w:lineRule="auto"/>
+              <w:jc w:val="center"/>
+            </w:pPr>
+            <w:r>
+              <w:rPr>
+                <w:rFonts w:asciiTheme="majorBidi" w:hAnsiTheme="majorBidi" w:cstheme="majorBidi"/>
+                <w:sz w:val="16"/>
+                <w:szCs w:val="16"/>
+              </w:rPr>
+              <w:t xml:space="preserve">1.139</w:t>
+            </w:r>
+          </w:p>
+        </w:tc>
+        <w:tc>
+          <w:tcPr>
+            <w:tcW w:w="527" w:type="dxa"/>
+            <w:vAlign w:val="center"/>
+          </w:tcPr>
+          <w:p>
+            <w:pPr>
+              <w:spacing w:before="20" w:after="20" w:line="240" w:lineRule="auto"/>
+              <w:jc w:val="center"/>
+            </w:pPr>
+            <w:r>
+              <w:rPr>
+                <w:rFonts w:asciiTheme="majorBidi" w:hAnsiTheme="majorBidi" w:cstheme="majorBidi"/>
+                <w:sz w:val="16"/>
+                <w:szCs w:val="16"/>
+              </w:rPr>
+              <w:t xml:space="preserve">1.136</w:t>
+            </w:r>
+          </w:p>
+        </w:tc>
+        <w:tc>
+          <w:tcPr>
+            <w:tcW w:w="527" w:type="dxa"/>
+            <w:vAlign w:val="center"/>
+          </w:tcPr>
+          <w:p>
+            <w:pPr>
+              <w:spacing w:before="20" w:after="20" w:line="240" w:lineRule="auto"/>
+              <w:jc w:val="center"/>
+            </w:pPr>
+            <w:r>
+              <w:rPr>
+                <w:rFonts w:asciiTheme="majorBidi" w:hAnsiTheme="majorBidi" w:cstheme="majorBidi"/>
+                <w:sz w:val="16"/>
+                <w:szCs w:val="16"/>
+              </w:rPr>
+              <w:t xml:space="preserve">1.121</w:t>
+            </w:r>
+          </w:p>
+        </w:tc>
+        <w:tc>
+          <w:tcPr>
+            <w:tcW w:w="527" w:type="dxa"/>
+            <w:vAlign w:val="center"/>
+          </w:tcPr>
+          <w:p>
+            <w:pPr>
+              <w:spacing w:before="20" w:after="20" w:line="240" w:lineRule="auto"/>
+              <w:jc w:val="center"/>
+            </w:pPr>
+            <w:r>
+              <w:rPr>
+                <w:rFonts w:asciiTheme="majorBidi" w:hAnsiTheme="majorBidi" w:cstheme="majorBidi"/>
+                <w:sz w:val="16"/>
+                <w:szCs w:val="16"/>
+              </w:rPr>
+              <w:t xml:space="preserve">1.028</w:t>
+            </w:r>
+          </w:p>
+        </w:tc>
+        <w:tc>
+          <w:tcPr>
+            <w:tcW w:w="527" w:type="dxa"/>
+            <w:vAlign w:val="center"/>
+          </w:tcPr>
+          <w:p>
+            <w:pPr>
+              <w:spacing w:before="20" w:after="20" w:line="240" w:lineRule="auto"/>
+              <w:jc w:val="center"/>
+            </w:pPr>
+            <w:r>
+              <w:rPr>
+                <w:rFonts w:asciiTheme="majorBidi" w:hAnsiTheme="majorBidi" w:cstheme="majorBidi"/>
+                <w:sz w:val="16"/>
+                <w:szCs w:val="16"/>
+              </w:rPr>
+              <w:t xml:space="preserve">0.463</w:t>
+            </w:r>
+          </w:p>
+        </w:tc>
+        <w:tc>
+          <w:tcPr>
+            <w:tcW w:w="527" w:type="dxa"/>
+            <w:vAlign w:val="center"/>
+          </w:tcPr>
+          <w:p>
+            <w:pPr>
+              <w:spacing w:before="20" w:after="20" w:line="240" w:lineRule="auto"/>
+              <w:jc w:val="center"/>
+            </w:pPr>
+            <w:r>
+              <w:rPr>
+                <w:rFonts w:asciiTheme="majorBidi" w:hAnsiTheme="majorBidi" w:cstheme="majorBidi"/>
+                <w:sz w:val="16"/>
+                <w:szCs w:val="16"/>
+              </w:rPr>
+              <w:t xml:space="preserve">0.456</w:t>
+            </w:r>
+          </w:p>
+        </w:tc>
+        <w:tc>
+          <w:tcPr>
+            <w:tcW w:w="527" w:type="dxa"/>
+            <w:vAlign w:val="center"/>
+          </w:tcPr>
+          <w:p>
+            <w:pPr>
+              <w:spacing w:before="20" w:after="20" w:line="240" w:lineRule="auto"/>
+              <w:jc w:val="center"/>
+            </w:pPr>
+            <w:r>
+              <w:rPr>
+                <w:rFonts w:asciiTheme="majorBidi" w:hAnsiTheme="majorBidi" w:cstheme="majorBidi"/>
+                <w:sz w:val="16"/>
+                <w:szCs w:val="16"/>
+              </w:rPr>
+              <w:t xml:space="preserve">0.455</w:t>
+            </w:r>
+          </w:p>
+        </w:tc>
+        <w:tc>
+          <w:tcPr>
+            <w:tcW w:w="527" w:type="dxa"/>
+            <w:vAlign w:val="center"/>
+          </w:tcPr>
+          <w:p>
+            <w:pPr>
+              <w:spacing w:before="20" w:after="20" w:line="240" w:lineRule="auto"/>
+              <w:jc w:val="center"/>
+            </w:pPr>
+            <w:r>
+              <w:rPr>
+                <w:rFonts w:asciiTheme="majorBidi" w:hAnsiTheme="majorBidi" w:cstheme="majorBidi"/>
+                <w:sz w:val="16"/>
+                <w:szCs w:val="16"/>
+              </w:rPr>
+              <w:t xml:space="preserve">0.454</w:t>
+            </w:r>
+          </w:p>
+        </w:tc>
+        <w:tc>
+          <w:tcPr>
+            <w:tcW w:w="527" w:type="dxa"/>
+            <w:vAlign w:val="center"/>
+          </w:tcPr>
+          <w:p>
+            <w:pPr>
+              <w:spacing w:before="20" w:after="20" w:line="240" w:lineRule="auto"/>
+              <w:jc w:val="center"/>
+            </w:pPr>
+            <w:r>
+              <w:rPr>
+                <w:rFonts w:asciiTheme="majorBidi" w:hAnsiTheme="majorBidi" w:cstheme="majorBidi"/>
+                <w:sz w:val="16"/>
+                <w:szCs w:val="16"/>
+              </w:rPr>
+              <w:t xml:space="preserve">0.439</w:t>
+            </w:r>
+          </w:p>
+        </w:tc>
+        <w:tc>
+          <w:tcPr>
+            <w:tcW w:w="527" w:type="dxa"/>
+            <w:vAlign w:val="center"/>
+          </w:tcPr>
+          <w:p>
+            <w:pPr>
+              <w:spacing w:before="20" w:after="20" w:line="240" w:lineRule="auto"/>
+              <w:jc w:val="center"/>
+            </w:pPr>
+            <w:r>
+              <w:rPr>
+                <w:rFonts w:asciiTheme="majorBidi" w:hAnsiTheme="majorBidi" w:cstheme="majorBidi"/>
+                <w:sz w:val="16"/>
+                <w:szCs w:val="16"/>
+              </w:rPr>
+              <w:t xml:space="preserve">0.147</w:t>
+            </w:r>
+          </w:p>
+        </w:tc>
+        <w:tc>
+          <w:tcPr>
+            <w:tcW w:w="527" w:type="dxa"/>
+            <w:vAlign w:val="center"/>
+          </w:tcPr>
+          <w:p>
+            <w:pPr>
+              <w:spacing w:before="20" w:after="20" w:line="240" w:lineRule="auto"/>
+              <w:jc w:val="center"/>
+            </w:pPr>
+            <w:r>
+              <w:rPr>
+                <w:rFonts w:asciiTheme="majorBidi" w:hAnsiTheme="majorBidi" w:cstheme="majorBidi"/>
+                <w:sz w:val="16"/>
+                <w:szCs w:val="16"/>
+              </w:rPr>
+              <w:t xml:space="preserve">0</w:t>
+            </w:r>
+          </w:p>
+        </w:tc>
+        <w:tc>
+          <w:tcPr>
+            <w:tcW w:w="527" w:type="dxa"/>
+            <w:vAlign w:val="center"/>
+          </w:tcPr>
+          <w:p>
+            <w:pPr>
+              <w:spacing w:before="20" w:after="20" w:line="240" w:lineRule="auto"/>
+              <w:jc w:val="center"/>
+            </w:pPr>
+            <w:r>
+              <w:rPr>
+                <w:rFonts w:asciiTheme="majorBidi" w:hAnsiTheme="majorBidi" w:cstheme="majorBidi"/>
+                <w:sz w:val="16"/>
+                <w:szCs w:val="16"/>
+              </w:rPr>
+              <w:t xml:space="preserve">0</w:t>
+            </w:r>
+          </w:p>
+        </w:tc>
+        <w:tc>
+          <w:tcPr>
+            <w:tcW w:w="527" w:type="dxa"/>
+            <w:vAlign w:val="center"/>
+          </w:tcPr>
+          <w:p>
+            <w:pPr>
+              <w:spacing w:before="20" w:after="20" w:line="240" w:lineRule="auto"/>
+              <w:jc w:val="center"/>
+            </w:pPr>
+            <w:r>
+              <w:rPr>
+                <w:rFonts w:asciiTheme="majorBidi" w:hAnsiTheme="majorBidi" w:cstheme="majorBidi"/>
+                <w:sz w:val="16"/>
+                <w:szCs w:val="16"/>
+              </w:rPr>
+              <w:t xml:space="preserve">0</w:t>
+            </w:r>
+          </w:p>
+        </w:tc>
+      </w:tr>
+    </w:tbl>
+    <w:p>
+      <w:pPr>
+        <w:spacing w:after="120"/>
+      </w:pPr>
+    </w:p>
+    <w:p>
+      <w:pPr>
+        <w:keepNext/>
+        <w:spacing w:before="200" w:after="80"/>
+      </w:pPr>
+      <w:r>
+        <w:rPr>
+          <w:rFonts w:asciiTheme="majorBidi" w:hAnsiTheme="majorBidi" w:cstheme="majorBidi"/>
+          <w:b/>
+          <w:bCs/>
+          <w:sz w:val="21"/>
+          <w:szCs w:val="21"/>
+        </w:rPr>
+        <w:t xml:space="preserve">S2 Statistical robustness</w:t>
+      </w:r>
+    </w:p>
+    <w:p>
+      <w:pPr>
+        <w:spacing w:after="80" w:line="252" w:lineRule="auto"/>
+        <w:ind w:firstLine="284"/>
+        <w:jc w:val="both"/>
+      </w:pPr>
+      <w:r>
+        <w:rPr>
+          <w:rFonts w:asciiTheme="majorBidi" w:hAnsiTheme="majorBidi" w:cstheme="majorBidi"/>
+          <w:sz w:val="21"/>
+          <w:szCs w:val="21"/>
+        </w:rPr>
+        <w:t xml:space="preserve">To separate real differences from seed noise, the scenario suites were repeated with 10 scenario seeds (which vary the cloud-noise stream, the step instant and the cloud phase), and the stage-1 DNN was retrained with five seeds (paired with the scenario seed modulo 5). Table S3 gives the mean ± standard deviation and Table S4 the paired Wilcoxon signed-rank tests; with only ten pairs, a difference can reach p &lt; 0.05 only if its sign is consistent across the seeds, so small but consistent differences are flagged even when they are practically irrelevant. The seed means differ slightly from the single deterministic runs of Table 11 (for example 99.36% against 99.32% for the hybrid on shading).</w:t>
       </w:r>
     </w:p>
     <w:p>
@@ -92,7 +2968,7 @@
           <w:sz w:val="21"/>
           <w:szCs w:val="21"/>
         </w:rPr>
-        <w:t xml:space="preserve">Table S2</w:t>
+        <w:t xml:space="preserve">Table S4</w:t>
       </w:r>
       <w:r>
         <w:rPr>
@@ -117,7 +2993,7 @@
           <w:sz w:val="18"/>
           <w:szCs w:val="18"/>
         </w:rPr>
-        <w:t xml:space="preserve">Table S1</w:t>
+        <w:t xml:space="preserve">Table S3</w:t>
       </w:r>
       <w:r>
         <w:rPr>
@@ -1625,7 +4501,7 @@
           <w:sz w:val="18"/>
           <w:szCs w:val="18"/>
         </w:rPr>
-        <w:t xml:space="preserve">Table S2</w:t>
+        <w:t xml:space="preserve">Table S4</w:t>
       </w:r>
       <w:r>
         <w:rPr>
@@ -3174,7 +6050,7 @@
           <w:sz w:val="21"/>
           <w:szCs w:val="21"/>
         </w:rPr>
-        <w:t xml:space="preserve">Design ablation of the stage-1 estimator</w:t>
+        <w:t xml:space="preserve">S3 Design ablation of the stage-1 estimator</w:t>
       </w:r>
     </w:p>
     <w:p>
@@ -3189,7 +6065,7 @@
           <w:sz w:val="21"/>
           <w:szCs w:val="21"/>
         </w:rPr>
-        <w:t xml:space="preserve">To test whether the network design matters, the stage-1 estimator was replaced by smaller and larger networks, by regularized variants, by a linear regressor on the same 16 inputs, and by a network that sees only G and T (Table S3). The architecture used in the other experiments was chosen a priori and was not tuned on the test years (there was no hyper-parameter search); the training years, the early-stopping years (2015–2016) and the test years (2019–2020) are disjoint. All neural variants with the 16 inputs end up within 0.02 points of each other in closed-loop shading efficiency (99.33–99.35%), although their offline RMSE ranges from 0.75 to 0.94 V and their size from 1,633 to 103,169 parameters; the differences are of the order of the seed-to-seed spread. A network with only 1,633 parameters and 1,568 multiply–accumulate operations therefore performs as well in the closed loop as the 27,009-parameter network. The information content of the scan, not the network capacity, is what matters. A linear regressor on the scan currents already reaches 97.79% (success 88.9%), and a network that sees only G and T, without the scan currents, falls to 80.18% with the success rate of P&amp;O (33.3%). This result shows that the benefit comes from the scan and that the DNN is one of several adequate estimators; a smaller network or a tree-based estimator would do equally well in this setting.</w:t>
+        <w:t xml:space="preserve">To test whether the network design matters, the stage-1 estimator was replaced by smaller and larger networks, by regularized variants, by a linear regressor on the same 16 inputs, and by a network that sees only G and T (Table S5). The architecture used in the other experiments was chosen a priori and was not tuned on the test years (there was no hyper-parameter search); the training years, the early-stopping years (2015–2016) and the test years (2019–2020) are disjoint. All neural variants with the 16 inputs end up within 0.02 points of each other in closed-loop shading efficiency (99.33–99.35%), although their offline RMSE ranges from 0.75 to 0.94 V and their size from 1,633 to 103,169 parameters; the differences are of the order of the seed-to-seed spread. A network with only 1,633 parameters and 1,568 multiply–accumulate operations therefore performs as well in the closed loop as the 27,009-parameter network. The information content of the scan, not the network capacity, is what matters. A linear regressor on the scan currents already reaches 97.79% (success 88.9%), and a network that sees only G and T, without the scan currents, falls to 80.18% with the success rate of P&amp;O (33.3%). This result shows that the benefit comes from the scan and that the DNN is one of several adequate estimators; a smaller network or a tree-based estimator would do equally well in this setting.</w:t>
       </w:r>
     </w:p>
     <w:p>
@@ -3206,7 +6082,7 @@
           <w:sz w:val="18"/>
           <w:szCs w:val="18"/>
         </w:rPr>
-        <w:t xml:space="preserve">Table S3</w:t>
+        <w:t xml:space="preserve">Table S5</w:t>
       </w:r>
       <w:r>
         <w:rPr>
@@ -5121,7 +7997,7 @@
           <w:sz w:val="21"/>
           <w:szCs w:val="21"/>
         </w:rPr>
-        <w:t xml:space="preserve">Boost-converter plant</w:t>
+        <w:t xml:space="preserve">S4 Boost-converter plant</w:t>
       </w:r>
     </w:p>
     <w:p>
@@ -5154,7 +8030,7 @@
           <w:sz w:val="21"/>
           <w:szCs w:val="21"/>
         </w:rPr>
-        <w:t xml:space="preserve"> shows the irradiance step on this plant, with power, PV voltage, duty cycle and inductor current. The averaged continuous-conduction model was compared with a switching-level model (PWM with 100 steps per period, diode with discontinuous-conduction clamp) driven by the same command sequence (Table S4). For the irradiance step and for the shading pattern outside the large scan jumps, the largest deviation is 0.049 V and 0.10% of the rated power. During the 14 large jumps of a scan (probe voltages up to 18 V away from the present voltage), the deviation reaches 1.45 V and 4.7% of the rated power because neither model has settled within the window, so the averaged model should not be trusted for the detailed shape of the scan transients. Both models were implemented in this study and were not compared with a hardware converter.</w:t>
+        <w:t xml:space="preserve"> shows the irradiance step on this plant, with power, PV voltage, duty cycle and inductor current. The averaged continuous-conduction model was compared with a switching-level model (PWM with 100 steps per period, diode with discontinuous-conduction clamp) driven by the same command sequence (Table S6). For the irradiance step and for the shading pattern outside the large scan jumps, the largest deviation is 0.049 V and 0.10% of the rated power. During the 14 large jumps of a scan (probe voltages up to 18 V away from the present voltage), the deviation reaches 1.45 V and 4.7% of the rated power because neither model has settled within the window, so the averaged model should not be trusted for the detailed shape of the scan transients. Both models were implemented in this study and were not compared with a hardware converter.</w:t>
       </w:r>
     </w:p>
     <w:p>
@@ -5171,7 +8047,7 @@
           <w:sz w:val="18"/>
           <w:szCs w:val="18"/>
         </w:rPr>
-        <w:t xml:space="preserve">Table S4</w:t>
+        <w:t xml:space="preserve">Table S6</w:t>
       </w:r>
       <w:r>
         <w:rPr>
@@ -5819,7 +8695,7 @@
           <w:sz w:val="21"/>
           <w:szCs w:val="21"/>
         </w:rPr>
-        <w:t xml:space="preserve">The converter dynamics change the efficiency of the controllers by little (Table S5). The largest change is −0.58 points, for the plain ANN under partial shading; P&amp;O and IncCond change by −0.13 and −0.14 points under shading and by −0.09 and −0.10 points on the comprehensive scenario, and the hybrid by −0.10 points on the comprehensive scenario and −0.004 points under shading. On the step, cloud and ramp scenarios no controller changes by more than 0.06 points. The ranking of the controllers is unchanged.</w:t>
+        <w:t xml:space="preserve">The converter dynamics change the efficiency of the controllers by little (Table S7). The largest change is −0.58 points, for the plain ANN under partial shading; P&amp;O and IncCond change by −0.13 and −0.14 points under shading and by −0.09 and −0.10 points on the comprehensive scenario, and the hybrid by −0.10 points on the comprehensive scenario and −0.004 points under shading. On the step, cloud and ramp scenarios no controller changes by more than 0.06 points. The ranking of the controllers is unchanged.</w:t>
       </w:r>
     </w:p>
     <w:p>
@@ -5836,7 +8712,7 @@
           <w:sz w:val="18"/>
           <w:szCs w:val="18"/>
         </w:rPr>
-        <w:t xml:space="preserve">Table S5</w:t>
+        <w:t xml:space="preserve">Table S7</w:t>
       </w:r>
       <w:r>
         <w:rPr>
@@ -7105,7 +9981,7 @@
           <w:sz w:val="21"/>
           <w:szCs w:val="21"/>
         </w:rPr>
-        <w:t xml:space="preserve">Sensor noise and numerical precision</w:t>
+        <w:t xml:space="preserve">S5 Sensor noise and numerical precision</w:t>
       </w:r>
     </w:p>
     <w:p>
@@ -7120,7 +9996,7 @@
           <w:sz w:val="21"/>
           <w:szCs w:val="21"/>
         </w:rPr>
-        <w:t xml:space="preserve">To test sensitivity to measurement errors, Gaussian noise was added to the measured currents (0.5%), voltages (0.5%) and irradiance input (2%) on the nine shading patterns, and the efficiency was scored on the true values (Table S6). The scan-based controllers still solve every pattern, but their efficiency drops by about 0.6 points (hybrid 99.32% to 98.70%, Scan+P&amp;O 99.36% to 98.75%, tree-based variant 99.37% to 98.67%). The DNN scan-only variant, which has no P&amp;O stage, is unaffected (99.30% to 99.31%), and the sensor-less trackers change little (P&amp;O 80.41% to 80.25%), so the loss comes from P&amp;O dithering on noisy power readings and not from the network. PSO loses its perfect success rate (97.8%).</w:t>
+        <w:t xml:space="preserve">To test sensitivity to measurement errors, Gaussian noise was added to the measured currents (0.5%), voltages (0.5%) and irradiance input (2%) on the nine shading patterns, and the efficiency was scored on the true values (Table S8). The scan-based controllers still solve every pattern, but their efficiency drops by about 0.6 points (hybrid 99.32% to 98.70%, Scan+P&amp;O 99.36% to 98.75%, tree-based variant 99.37% to 98.67%). The DNN scan-only variant, which has no P&amp;O stage, is unaffected (99.30% to 99.31%), and the sensor-less trackers change little (P&amp;O 80.41% to 80.25%), so the loss comes from P&amp;O dithering on noisy power readings and not from the network. PSO loses its perfect success rate (97.8%).</w:t>
       </w:r>
     </w:p>
     <w:p>
@@ -7137,7 +10013,7 @@
           <w:sz w:val="18"/>
           <w:szCs w:val="18"/>
         </w:rPr>
-        <w:t xml:space="preserve">Table S6</w:t>
+        <w:t xml:space="preserve">Table S8</w:t>
       </w:r>
       <w:r>
         <w:rPr>
@@ -8310,7 +11186,7 @@
           <w:sz w:val="21"/>
           <w:szCs w:val="21"/>
         </w:rPr>
-        <w:t xml:space="preserve">Storing the weights in half precision halves the model size (108,036 to 54,660 bytes) and leaves the estimate essentially unchanged (largest deviation from float32 0.049 V, no change in closed-loop efficiency; Table S7). Post-training int8 quantization (emulated in numpy, not run on a microcontroller) gives 27,972 bytes but raises the RMSE from 0.78 to 1.98 V and the wrong-peak rate from 2.1% to 7.7%, with single outliers of up to 22 V; the closed-loop shading efficiency nevertheless stays at 99.32%, because the P&amp;O stage corrects the hand-off. A naive int8 conversion is therefore not recommended without calibration or quantization-aware training, which was not studied here.</w:t>
+        <w:t xml:space="preserve">Storing the weights in half precision halves the model size (108,036 to 54,660 bytes) and leaves the estimate essentially unchanged (largest deviation from float32 0.049 V, no change in closed-loop efficiency; Table S9). Post-training int8 quantization (emulated in numpy, not run on a microcontroller) gives 27,972 bytes but raises the RMSE from 0.78 to 1.98 V and the wrong-peak rate from 2.1% to 7.7%, with single outliers of up to 22 V; the closed-loop shading efficiency nevertheless stays at 99.32%, because the P&amp;O stage corrects the hand-off. A naive int8 conversion is therefore not recommended without calibration or quantization-aware training, which was not studied here.</w:t>
       </w:r>
     </w:p>
     <w:p>
@@ -8327,7 +11203,7 @@
           <w:sz w:val="18"/>
           <w:szCs w:val="18"/>
         </w:rPr>
-        <w:t xml:space="preserve">Table S7</w:t>
+        <w:t xml:space="preserve">Table S9</w:t>
       </w:r>
       <w:r>
         <w:rPr>

</xml_diff>

<commit_message>
Update manuscript: numbered sections, dataset excerpts in the supplement (#5)
</commit_message>
<xml_diff>
--- a/manuscript/Supplementary_material.docx
+++ b/manuscript/Supplementary_material.docx
@@ -33,16 +33,27 @@
       <w:r>
         <w:rPr>
           <w:rFonts w:asciiTheme="majorBidi" w:hAnsiTheme="majorBidi" w:cstheme="majorBidi"/>
+          <w:b/>
+          <w:bCs/>
           <w:sz w:val="21"/>
           <w:szCs w:val="21"/>
         </w:rPr>
-        <w:t xml:space="preserve">This document accompanies the manuscript “Isolating the Contribution of Deep Neural Networks in Hybrid Scan-Based MPPT Controllers Under Partial Shading”. It contains the statistical-robustness, design-ablation, boost-converter and sensor-noise/quantization studies summarized in the section “Robustness studies” of the main text. Table and figure numbers without the prefix S refer to the main text.</w:t>
+        <w:t xml:space="preserve">Article:</w:t>
+      </w:r>
+      <w:r>
+        <w:rPr>
+          <w:rFonts w:asciiTheme="majorBidi" w:hAnsiTheme="majorBidi" w:cstheme="majorBidi"/>
+          <w:sz w:val="21"/>
+          <w:szCs w:val="21"/>
+        </w:rPr>
+        <w:t xml:space="preserve"> Isolating the Contribution of Deep Neural Networks in Hybrid Scan-Based MPPT Controllers Under Partial Shading</w:t>
       </w:r>
     </w:p>
     <w:p>
       <w:pPr>
-        <w:keepNext/>
-        <w:spacing w:before="200" w:after="80"/>
+        <w:spacing w:after="80" w:line="252" w:lineRule="auto"/>
+        <w:ind w:firstLine="284"/>
+        <w:jc w:val="both"/>
       </w:pPr>
       <w:r>
         <w:rPr>
@@ -52,22 +63,2887 @@
           <w:sz w:val="21"/>
           <w:szCs w:val="21"/>
         </w:rPr>
-        <w:t xml:space="preserve">Statistical robustness</w:t>
+        <w:t xml:space="preserve">Journal:</w:t>
       </w:r>
-    </w:p>
-    <w:p>
-      <w:pPr>
-        <w:spacing w:after="80" w:line="252" w:lineRule="auto"/>
-        <w:ind w:firstLine="284"/>
-        <w:jc w:val="both"/>
-      </w:pPr>
       <w:r>
         <w:rPr>
           <w:rFonts w:asciiTheme="majorBidi" w:hAnsiTheme="majorBidi" w:cstheme="majorBidi"/>
           <w:sz w:val="21"/>
           <w:szCs w:val="21"/>
         </w:rPr>
-        <w:t xml:space="preserve">To separate real differences from seed noise, the scenario suites were repeated with 10 scenario seeds (which vary the cloud-noise stream, the step instant and the cloud phase), and the stage-1 DNN was retrained with five seeds (paired with the scenario seed modulo 5). Table S1 gives the mean ± standard deviation and Table S2 the paired Wilcoxon signed-rank tests; with only ten pairs, a difference can reach p &lt; 0.05 only if its sign is consistent across the seeds, so small but consistent differences are flagged even when they are practically irrelevant. The seed means differ slightly from the single deterministic runs of Table 11 (for example 99.36% against 99.32% for the hybrid on shading).</w:t>
+        <w:t xml:space="preserve"> The Journal of Supercomputing</w:t>
+      </w:r>
+    </w:p>
+    <w:p>
+      <w:pPr>
+        <w:spacing w:after="80" w:line="252" w:lineRule="auto"/>
+        <w:ind w:firstLine="284"/>
+        <w:jc w:val="both"/>
+      </w:pPr>
+      <w:r>
+        <w:rPr>
+          <w:rFonts w:asciiTheme="majorBidi" w:hAnsiTheme="majorBidi" w:cstheme="majorBidi"/>
+          <w:b/>
+          <w:bCs/>
+          <w:sz w:val="21"/>
+          <w:szCs w:val="21"/>
+        </w:rPr>
+        <w:t xml:space="preserve">Authors:</w:t>
+      </w:r>
+      <w:r>
+        <w:rPr>
+          <w:rFonts w:asciiTheme="majorBidi" w:hAnsiTheme="majorBidi" w:cstheme="majorBidi"/>
+          <w:sz w:val="21"/>
+          <w:szCs w:val="21"/>
+        </w:rPr>
+        <w:t xml:space="preserve"> Waleed Hameed and Kamil Dimililer</w:t>
+      </w:r>
+    </w:p>
+    <w:p>
+      <w:pPr>
+        <w:spacing w:after="80" w:line="252" w:lineRule="auto"/>
+        <w:ind w:firstLine="284"/>
+        <w:jc w:val="both"/>
+      </w:pPr>
+      <w:r>
+        <w:rPr>
+          <w:rFonts w:asciiTheme="majorBidi" w:hAnsiTheme="majorBidi" w:cstheme="majorBidi"/>
+          <w:b/>
+          <w:bCs/>
+          <w:sz w:val="21"/>
+          <w:szCs w:val="21"/>
+        </w:rPr>
+        <w:t xml:space="preserve">Corresponding author:</w:t>
+      </w:r>
+      <w:r>
+        <w:rPr>
+          <w:rFonts w:asciiTheme="majorBidi" w:hAnsiTheme="majorBidi" w:cstheme="majorBidi"/>
+          <w:sz w:val="21"/>
+          <w:szCs w:val="21"/>
+        </w:rPr>
+        <w:t xml:space="preserve"> Waleed Hameed, Department of Electrical Engineering Technologies, Al-Huda University College, Ramadi, Al Anbar, Iraq; waleed.hameed@uoalhuda.edu.iq</w:t>
+      </w:r>
+    </w:p>
+    <w:p>
+      <w:pPr>
+        <w:spacing w:after="80" w:line="252" w:lineRule="auto"/>
+        <w:ind w:firstLine="284"/>
+        <w:jc w:val="both"/>
+      </w:pPr>
+      <w:r>
+        <w:rPr>
+          <w:rFonts w:asciiTheme="majorBidi" w:hAnsiTheme="majorBidi" w:cstheme="majorBidi"/>
+          <w:sz w:val="21"/>
+          <w:szCs w:val="21"/>
+        </w:rPr>
+        <w:t xml:space="preserve">This document accompanies the article. It contains dataset excerpts and the statistical-robustness, design-ablation, boost-converter and sensor-noise/quantization studies summarized in Section 4.7 of the main text. Table and figure numbers without the prefix S refer to the main text.</w:t>
+      </w:r>
+    </w:p>
+    <w:p>
+      <w:pPr>
+        <w:keepNext/>
+        <w:spacing w:before="200" w:after="80"/>
+      </w:pPr>
+      <w:r>
+        <w:rPr>
+          <w:rFonts w:asciiTheme="majorBidi" w:hAnsiTheme="majorBidi" w:cstheme="majorBidi"/>
+          <w:b/>
+          <w:bCs/>
+          <w:sz w:val="21"/>
+          <w:szCs w:val="21"/>
+        </w:rPr>
+        <w:t xml:space="preserve">S1 Dataset excerpts</w:t>
+      </w:r>
+    </w:p>
+    <w:p>
+      <w:pPr>
+        <w:spacing w:before="60" w:after="140" w:line="240" w:lineRule="auto"/>
+        <w:jc w:val="both"/>
+      </w:pPr>
+      <w:r>
+        <w:rPr>
+          <w:rFonts w:asciiTheme="majorBidi" w:hAnsiTheme="majorBidi" w:cstheme="majorBidi"/>
+          <w:sz w:val="18"/>
+          <w:szCs w:val="18"/>
+        </w:rPr>
+        <w:t xml:space="preserve">Table S1 shows twelve rows of the PVGIS-SARAH3 hourly series used in the study and the module quantities computed from them, and Table S2 shows one partially shaded sample as the stage-1 DNN receives it.</w:t>
+      </w:r>
+    </w:p>
+    <w:p>
+      <w:pPr>
+        <w:keepNext/>
+        <w:spacing w:before="60" w:after="140" w:line="240" w:lineRule="auto"/>
+        <w:jc w:val="both"/>
+      </w:pPr>
+      <w:r>
+        <w:rPr>
+          <w:rFonts w:asciiTheme="majorBidi" w:hAnsiTheme="majorBidi" w:cstheme="majorBidi"/>
+          <w:b/>
+          <w:bCs/>
+          <w:sz w:val="18"/>
+          <w:szCs w:val="18"/>
+        </w:rPr>
+        <w:t xml:space="preserve">Table S1</w:t>
+      </w:r>
+      <w:r>
+        <w:rPr>
+          <w:rFonts w:asciiTheme="majorBidi" w:hAnsiTheme="majorBidi" w:cstheme="majorBidi"/>
+          <w:sz w:val="18"/>
+          <w:szCs w:val="18"/>
+        </w:rPr>
+        <w:t xml:space="preserve"> Excerpt of the PVGIS-SARAH3 hourly series (Ramadi, 24 June 2019, first 12 non-zero hours) and the module quantities computed from it. </w:t>
+      </w:r>
+      <w:r>
+        <w:rPr>
+          <w:rFonts w:asciiTheme="majorBidi" w:hAnsiTheme="majorBidi" w:cstheme="majorBidi"/>
+          <w:sz w:val="18"/>
+          <w:szCs w:val="18"/>
+        </w:rPr>
+        <w:t xml:space="preserve">T</w:t>
+      </w:r>
+      <w:r>
+        <w:rPr>
+          <w:rFonts w:asciiTheme="majorBidi" w:hAnsiTheme="majorBidi" w:cstheme="majorBidi"/>
+          <w:sz w:val="18"/>
+          <w:szCs w:val="18"/>
+          <w:vertAlign w:val="subscript"/>
+        </w:rPr>
+        <w:t xml:space="preserve">cell</w:t>
+      </w:r>
+      <w:r>
+        <w:rPr>
+          <w:rFonts w:asciiTheme="majorBidi" w:hAnsiTheme="majorBidi" w:cstheme="majorBidi"/>
+          <w:sz w:val="18"/>
+          <w:szCs w:val="18"/>
+        </w:rPr>
+        <w:t xml:space="preserve"> is the cell temperature from the NOCT relation, and </w:t>
+      </w:r>
+      <w:r>
+        <w:rPr>
+          <w:rFonts w:asciiTheme="majorBidi" w:hAnsiTheme="majorBidi" w:cstheme="majorBidi"/>
+          <w:sz w:val="18"/>
+          <w:szCs w:val="18"/>
+        </w:rPr>
+        <w:t xml:space="preserve">V</w:t>
+      </w:r>
+      <w:r>
+        <w:rPr>
+          <w:rFonts w:asciiTheme="majorBidi" w:hAnsiTheme="majorBidi" w:cstheme="majorBidi"/>
+          <w:sz w:val="18"/>
+          <w:szCs w:val="18"/>
+          <w:vertAlign w:val="subscript"/>
+        </w:rPr>
+        <w:t xml:space="preserve">mpp</w:t>
+      </w:r>
+      <w:r>
+        <w:rPr>
+          <w:rFonts w:asciiTheme="majorBidi" w:hAnsiTheme="majorBidi" w:cstheme="majorBidi"/>
+          <w:sz w:val="18"/>
+          <w:szCs w:val="18"/>
+        </w:rPr>
+        <w:t xml:space="preserve"> and </w:t>
+      </w:r>
+      <w:r>
+        <w:rPr>
+          <w:rFonts w:asciiTheme="majorBidi" w:hAnsiTheme="majorBidi" w:cstheme="majorBidi"/>
+          <w:sz w:val="18"/>
+          <w:szCs w:val="18"/>
+        </w:rPr>
+        <w:t xml:space="preserve">P</w:t>
+      </w:r>
+      <w:r>
+        <w:rPr>
+          <w:rFonts w:asciiTheme="majorBidi" w:hAnsiTheme="majorBidi" w:cstheme="majorBidi"/>
+          <w:sz w:val="18"/>
+          <w:szCs w:val="18"/>
+          <w:vertAlign w:val="subscript"/>
+        </w:rPr>
+        <w:t xml:space="preserve">mpp</w:t>
+      </w:r>
+      <w:r>
+        <w:rPr>
+          <w:rFonts w:asciiTheme="majorBidi" w:hAnsiTheme="majorBidi" w:cstheme="majorBidi"/>
+          <w:sz w:val="18"/>
+          <w:szCs w:val="18"/>
+        </w:rPr>
+        <w:t xml:space="preserve"> are the maximum-power voltage and power of the single-diode model at that G and </w:t>
+      </w:r>
+      <w:r>
+        <w:rPr>
+          <w:rFonts w:asciiTheme="majorBidi" w:hAnsiTheme="majorBidi" w:cstheme="majorBidi"/>
+          <w:sz w:val="18"/>
+          <w:szCs w:val="18"/>
+        </w:rPr>
+        <w:t xml:space="preserve">T</w:t>
+      </w:r>
+      <w:r>
+        <w:rPr>
+          <w:rFonts w:asciiTheme="majorBidi" w:hAnsiTheme="majorBidi" w:cstheme="majorBidi"/>
+          <w:sz w:val="18"/>
+          <w:szCs w:val="18"/>
+          <w:vertAlign w:val="subscript"/>
+        </w:rPr>
+        <w:t xml:space="preserve">cell</w:t>
+      </w:r>
+      <w:r>
+        <w:rPr>
+          <w:rFonts w:asciiTheme="majorBidi" w:hAnsiTheme="majorBidi" w:cstheme="majorBidi"/>
+          <w:sz w:val="18"/>
+          <w:szCs w:val="18"/>
+        </w:rPr>
+        <w:t xml:space="preserve">.</w:t>
+      </w:r>
+    </w:p>
+    <w:tbl>
+      <w:tblPr>
+        <w:tblW w:w="8497" w:type="dxa"/>
+        <w:jc w:val="center"/>
+        <w:tblBorders>
+          <w:top w:val="single" w:sz="8" w:space="0" w:color="000000"/>
+          <w:bottom w:val="single" w:sz="8" w:space="0" w:color="000000"/>
+          <w:insideH w:val="single" w:sz="2" w:space="0" w:color="BFBFBF"/>
+        </w:tblBorders>
+        <w:tblLayout w:type="fixed"/>
+        <w:tblCellMar>
+          <w:left w:w="60" w:type="dxa"/>
+          <w:right w:w="60" w:type="dxa"/>
+        </w:tblCellMar>
+      </w:tblPr>
+      <w:tblGrid>
+        <w:gridCol w:w="2441"/>
+        <w:gridCol w:w="931"/>
+        <w:gridCol w:w="1224"/>
+        <w:gridCol w:w="1405"/>
+        <w:gridCol w:w="1224"/>
+        <w:gridCol w:w="1272"/>
+      </w:tblGrid>
+      <w:tr>
+        <w:trPr>
+          <w:tblHeader/>
+        </w:trPr>
+        <w:tc>
+          <w:tcPr>
+            <w:tcW w:w="2441" w:type="dxa"/>
+            <w:shd w:val="clear" w:color="auto" w:fill="F2F2F2"/>
+            <w:vAlign w:val="center"/>
+          </w:tcPr>
+          <w:p>
+            <w:pPr>
+              <w:spacing w:before="20" w:after="20" w:line="240" w:lineRule="auto"/>
+              <w:jc w:val="left"/>
+            </w:pPr>
+            <w:r>
+              <w:rPr>
+                <w:rFonts w:asciiTheme="majorBidi" w:hAnsiTheme="majorBidi" w:cstheme="majorBidi"/>
+                <w:b/>
+                <w:bCs/>
+                <w:sz w:val="17"/>
+                <w:szCs w:val="17"/>
+              </w:rPr>
+              <w:t xml:space="preserve">Time (UTC)</w:t>
+            </w:r>
+          </w:p>
+        </w:tc>
+        <w:tc>
+          <w:tcPr>
+            <w:tcW w:w="931" w:type="dxa"/>
+            <w:shd w:val="clear" w:color="auto" w:fill="F2F2F2"/>
+            <w:vAlign w:val="center"/>
+          </w:tcPr>
+          <w:p>
+            <w:pPr>
+              <w:spacing w:before="20" w:after="20" w:line="240" w:lineRule="auto"/>
+              <w:jc w:val="center"/>
+            </w:pPr>
+            <w:r>
+              <w:rPr>
+                <w:rFonts w:asciiTheme="majorBidi" w:hAnsiTheme="majorBidi" w:cstheme="majorBidi"/>
+                <w:b/>
+                <w:bCs/>
+                <w:sz w:val="17"/>
+                <w:szCs w:val="17"/>
+              </w:rPr>
+              <w:t xml:space="preserve">G (W/m²)</w:t>
+            </w:r>
+          </w:p>
+        </w:tc>
+        <w:tc>
+          <w:tcPr>
+            <w:tcW w:w="1224" w:type="dxa"/>
+            <w:shd w:val="clear" w:color="auto" w:fill="F2F2F2"/>
+            <w:vAlign w:val="center"/>
+          </w:tcPr>
+          <w:p>
+            <w:pPr>
+              <w:spacing w:before="20" w:after="20" w:line="240" w:lineRule="auto"/>
+              <w:jc w:val="center"/>
+            </w:pPr>
+            <w:r>
+              <w:rPr>
+                <w:rFonts w:asciiTheme="majorBidi" w:hAnsiTheme="majorBidi" w:cstheme="majorBidi"/>
+                <w:b/>
+                <w:bCs/>
+                <w:sz w:val="17"/>
+                <w:szCs w:val="17"/>
+              </w:rPr>
+              <w:t xml:space="preserve">T</w:t>
+            </w:r>
+            <w:r>
+              <w:rPr>
+                <w:rFonts w:asciiTheme="majorBidi" w:hAnsiTheme="majorBidi" w:cstheme="majorBidi"/>
+                <w:b/>
+                <w:bCs/>
+                <w:sz w:val="17"/>
+                <w:szCs w:val="17"/>
+                <w:vertAlign w:val="subscript"/>
+              </w:rPr>
+              <w:t xml:space="preserve">2m</w:t>
+            </w:r>
+            <w:r>
+              <w:rPr>
+                <w:rFonts w:asciiTheme="majorBidi" w:hAnsiTheme="majorBidi" w:cstheme="majorBidi"/>
+                <w:b/>
+                <w:bCs/>
+                <w:sz w:val="17"/>
+                <w:szCs w:val="17"/>
+              </w:rPr>
+              <w:t xml:space="preserve"> (°C)</w:t>
+            </w:r>
+          </w:p>
+        </w:tc>
+        <w:tc>
+          <w:tcPr>
+            <w:tcW w:w="1405" w:type="dxa"/>
+            <w:shd w:val="clear" w:color="auto" w:fill="F2F2F2"/>
+            <w:vAlign w:val="center"/>
+          </w:tcPr>
+          <w:p>
+            <w:pPr>
+              <w:spacing w:before="20" w:after="20" w:line="240" w:lineRule="auto"/>
+              <w:jc w:val="center"/>
+            </w:pPr>
+            <w:r>
+              <w:rPr>
+                <w:rFonts w:asciiTheme="majorBidi" w:hAnsiTheme="majorBidi" w:cstheme="majorBidi"/>
+                <w:b/>
+                <w:bCs/>
+                <w:sz w:val="17"/>
+                <w:szCs w:val="17"/>
+              </w:rPr>
+              <w:t xml:space="preserve">T</w:t>
+            </w:r>
+            <w:r>
+              <w:rPr>
+                <w:rFonts w:asciiTheme="majorBidi" w:hAnsiTheme="majorBidi" w:cstheme="majorBidi"/>
+                <w:b/>
+                <w:bCs/>
+                <w:sz w:val="17"/>
+                <w:szCs w:val="17"/>
+                <w:vertAlign w:val="subscript"/>
+              </w:rPr>
+              <w:t xml:space="preserve">cell</w:t>
+            </w:r>
+            <w:r>
+              <w:rPr>
+                <w:rFonts w:asciiTheme="majorBidi" w:hAnsiTheme="majorBidi" w:cstheme="majorBidi"/>
+                <w:b/>
+                <w:bCs/>
+                <w:sz w:val="17"/>
+                <w:szCs w:val="17"/>
+              </w:rPr>
+              <w:t xml:space="preserve"> (°C)</w:t>
+            </w:r>
+          </w:p>
+        </w:tc>
+        <w:tc>
+          <w:tcPr>
+            <w:tcW w:w="1224" w:type="dxa"/>
+            <w:shd w:val="clear" w:color="auto" w:fill="F2F2F2"/>
+            <w:vAlign w:val="center"/>
+          </w:tcPr>
+          <w:p>
+            <w:pPr>
+              <w:spacing w:before="20" w:after="20" w:line="240" w:lineRule="auto"/>
+              <w:jc w:val="center"/>
+            </w:pPr>
+            <w:r>
+              <w:rPr>
+                <w:rFonts w:asciiTheme="majorBidi" w:hAnsiTheme="majorBidi" w:cstheme="majorBidi"/>
+                <w:b/>
+                <w:bCs/>
+                <w:sz w:val="17"/>
+                <w:szCs w:val="17"/>
+              </w:rPr>
+              <w:t xml:space="preserve">V</w:t>
+            </w:r>
+            <w:r>
+              <w:rPr>
+                <w:rFonts w:asciiTheme="majorBidi" w:hAnsiTheme="majorBidi" w:cstheme="majorBidi"/>
+                <w:b/>
+                <w:bCs/>
+                <w:sz w:val="17"/>
+                <w:szCs w:val="17"/>
+                <w:vertAlign w:val="subscript"/>
+              </w:rPr>
+              <w:t xml:space="preserve">mpp</w:t>
+            </w:r>
+            <w:r>
+              <w:rPr>
+                <w:rFonts w:asciiTheme="majorBidi" w:hAnsiTheme="majorBidi" w:cstheme="majorBidi"/>
+                <w:b/>
+                <w:bCs/>
+                <w:sz w:val="17"/>
+                <w:szCs w:val="17"/>
+              </w:rPr>
+              <w:t xml:space="preserve"> (V)</w:t>
+            </w:r>
+          </w:p>
+        </w:tc>
+        <w:tc>
+          <w:tcPr>
+            <w:tcW w:w="1272" w:type="dxa"/>
+            <w:shd w:val="clear" w:color="auto" w:fill="F2F2F2"/>
+            <w:vAlign w:val="center"/>
+          </w:tcPr>
+          <w:p>
+            <w:pPr>
+              <w:spacing w:before="20" w:after="20" w:line="240" w:lineRule="auto"/>
+              <w:jc w:val="center"/>
+            </w:pPr>
+            <w:r>
+              <w:rPr>
+                <w:rFonts w:asciiTheme="majorBidi" w:hAnsiTheme="majorBidi" w:cstheme="majorBidi"/>
+                <w:b/>
+                <w:bCs/>
+                <w:sz w:val="17"/>
+                <w:szCs w:val="17"/>
+              </w:rPr>
+              <w:t xml:space="preserve">P</w:t>
+            </w:r>
+            <w:r>
+              <w:rPr>
+                <w:rFonts w:asciiTheme="majorBidi" w:hAnsiTheme="majorBidi" w:cstheme="majorBidi"/>
+                <w:b/>
+                <w:bCs/>
+                <w:sz w:val="17"/>
+                <w:szCs w:val="17"/>
+                <w:vertAlign w:val="subscript"/>
+              </w:rPr>
+              <w:t xml:space="preserve">mpp</w:t>
+            </w:r>
+            <w:r>
+              <w:rPr>
+                <w:rFonts w:asciiTheme="majorBidi" w:hAnsiTheme="majorBidi" w:cstheme="majorBidi"/>
+                <w:b/>
+                <w:bCs/>
+                <w:sz w:val="17"/>
+                <w:szCs w:val="17"/>
+              </w:rPr>
+              <w:t xml:space="preserve"> (W)</w:t>
+            </w:r>
+          </w:p>
+        </w:tc>
+      </w:tr>
+      <w:tr>
+        <w:trPr/>
+        <w:tc>
+          <w:tcPr>
+            <w:tcW w:w="2441" w:type="dxa"/>
+            <w:vAlign w:val="center"/>
+          </w:tcPr>
+          <w:p>
+            <w:pPr>
+              <w:spacing w:before="20" w:after="20" w:line="240" w:lineRule="auto"/>
+              <w:jc w:val="left"/>
+            </w:pPr>
+            <w:r>
+              <w:rPr>
+                <w:rFonts w:asciiTheme="majorBidi" w:hAnsiTheme="majorBidi" w:cstheme="majorBidi"/>
+                <w:sz w:val="17"/>
+                <w:szCs w:val="17"/>
+              </w:rPr>
+              <w:t xml:space="preserve">2019-06-24 03:09</w:t>
+            </w:r>
+          </w:p>
+        </w:tc>
+        <w:tc>
+          <w:tcPr>
+            <w:tcW w:w="931" w:type="dxa"/>
+            <w:vAlign w:val="center"/>
+          </w:tcPr>
+          <w:p>
+            <w:pPr>
+              <w:spacing w:before="20" w:after="20" w:line="240" w:lineRule="auto"/>
+              <w:jc w:val="center"/>
+            </w:pPr>
+            <w:r>
+              <w:rPr>
+                <w:rFonts w:asciiTheme="majorBidi" w:hAnsiTheme="majorBidi" w:cstheme="majorBidi"/>
+                <w:sz w:val="17"/>
+                <w:szCs w:val="17"/>
+              </w:rPr>
+              <w:t xml:space="preserve">162</w:t>
+            </w:r>
+          </w:p>
+        </w:tc>
+        <w:tc>
+          <w:tcPr>
+            <w:tcW w:w="1224" w:type="dxa"/>
+            <w:vAlign w:val="center"/>
+          </w:tcPr>
+          <w:p>
+            <w:pPr>
+              <w:spacing w:before="20" w:after="20" w:line="240" w:lineRule="auto"/>
+              <w:jc w:val="center"/>
+            </w:pPr>
+            <w:r>
+              <w:rPr>
+                <w:rFonts w:asciiTheme="majorBidi" w:hAnsiTheme="majorBidi" w:cstheme="majorBidi"/>
+                <w:sz w:val="17"/>
+                <w:szCs w:val="17"/>
+              </w:rPr>
+              <w:t xml:space="preserve">29.06</w:t>
+            </w:r>
+          </w:p>
+        </w:tc>
+        <w:tc>
+          <w:tcPr>
+            <w:tcW w:w="1405" w:type="dxa"/>
+            <w:vAlign w:val="center"/>
+          </w:tcPr>
+          <w:p>
+            <w:pPr>
+              <w:spacing w:before="20" w:after="20" w:line="240" w:lineRule="auto"/>
+              <w:jc w:val="center"/>
+            </w:pPr>
+            <w:r>
+              <w:rPr>
+                <w:rFonts w:asciiTheme="majorBidi" w:hAnsiTheme="majorBidi" w:cstheme="majorBidi"/>
+                <w:sz w:val="17"/>
+                <w:szCs w:val="17"/>
+              </w:rPr>
+              <w:t xml:space="preserve">34.12</w:t>
+            </w:r>
+          </w:p>
+        </w:tc>
+        <w:tc>
+          <w:tcPr>
+            <w:tcW w:w="1224" w:type="dxa"/>
+            <w:vAlign w:val="center"/>
+          </w:tcPr>
+          <w:p>
+            <w:pPr>
+              <w:spacing w:before="20" w:after="20" w:line="240" w:lineRule="auto"/>
+              <w:jc w:val="center"/>
+            </w:pPr>
+            <w:r>
+              <w:rPr>
+                <w:rFonts w:asciiTheme="majorBidi" w:hAnsiTheme="majorBidi" w:cstheme="majorBidi"/>
+                <w:sz w:val="17"/>
+                <w:szCs w:val="17"/>
+              </w:rPr>
+              <w:t xml:space="preserve">23.89</w:t>
+            </w:r>
+          </w:p>
+        </w:tc>
+        <w:tc>
+          <w:tcPr>
+            <w:tcW w:w="1272" w:type="dxa"/>
+            <w:vAlign w:val="center"/>
+          </w:tcPr>
+          <w:p>
+            <w:pPr>
+              <w:spacing w:before="20" w:after="20" w:line="240" w:lineRule="auto"/>
+              <w:jc w:val="center"/>
+            </w:pPr>
+            <w:r>
+              <w:rPr>
+                <w:rFonts w:asciiTheme="majorBidi" w:hAnsiTheme="majorBidi" w:cstheme="majorBidi"/>
+                <w:sz w:val="17"/>
+                <w:szCs w:val="17"/>
+              </w:rPr>
+              <w:t xml:space="preserve">35.62</w:t>
+            </w:r>
+          </w:p>
+        </w:tc>
+      </w:tr>
+      <w:tr>
+        <w:trPr/>
+        <w:tc>
+          <w:tcPr>
+            <w:tcW w:w="2441" w:type="dxa"/>
+            <w:vAlign w:val="center"/>
+          </w:tcPr>
+          <w:p>
+            <w:pPr>
+              <w:spacing w:before="20" w:after="20" w:line="240" w:lineRule="auto"/>
+              <w:jc w:val="left"/>
+            </w:pPr>
+            <w:r>
+              <w:rPr>
+                <w:rFonts w:asciiTheme="majorBidi" w:hAnsiTheme="majorBidi" w:cstheme="majorBidi"/>
+                <w:sz w:val="17"/>
+                <w:szCs w:val="17"/>
+              </w:rPr>
+              <w:t xml:space="preserve">2019-06-24 04:09</w:t>
+            </w:r>
+          </w:p>
+        </w:tc>
+        <w:tc>
+          <w:tcPr>
+            <w:tcW w:w="931" w:type="dxa"/>
+            <w:vAlign w:val="center"/>
+          </w:tcPr>
+          <w:p>
+            <w:pPr>
+              <w:spacing w:before="20" w:after="20" w:line="240" w:lineRule="auto"/>
+              <w:jc w:val="center"/>
+            </w:pPr>
+            <w:r>
+              <w:rPr>
+                <w:rFonts w:asciiTheme="majorBidi" w:hAnsiTheme="majorBidi" w:cstheme="majorBidi"/>
+                <w:sz w:val="17"/>
+                <w:szCs w:val="17"/>
+              </w:rPr>
+              <w:t xml:space="preserve">378</w:t>
+            </w:r>
+          </w:p>
+        </w:tc>
+        <w:tc>
+          <w:tcPr>
+            <w:tcW w:w="1224" w:type="dxa"/>
+            <w:vAlign w:val="center"/>
+          </w:tcPr>
+          <w:p>
+            <w:pPr>
+              <w:spacing w:before="20" w:after="20" w:line="240" w:lineRule="auto"/>
+              <w:jc w:val="center"/>
+            </w:pPr>
+            <w:r>
+              <w:rPr>
+                <w:rFonts w:asciiTheme="majorBidi" w:hAnsiTheme="majorBidi" w:cstheme="majorBidi"/>
+                <w:sz w:val="17"/>
+                <w:szCs w:val="17"/>
+              </w:rPr>
+              <w:t xml:space="preserve">31.02</w:t>
+            </w:r>
+          </w:p>
+        </w:tc>
+        <w:tc>
+          <w:tcPr>
+            <w:tcW w:w="1405" w:type="dxa"/>
+            <w:vAlign w:val="center"/>
+          </w:tcPr>
+          <w:p>
+            <w:pPr>
+              <w:spacing w:before="20" w:after="20" w:line="240" w:lineRule="auto"/>
+              <w:jc w:val="center"/>
+            </w:pPr>
+            <w:r>
+              <w:rPr>
+                <w:rFonts w:asciiTheme="majorBidi" w:hAnsiTheme="majorBidi" w:cstheme="majorBidi"/>
+                <w:sz w:val="17"/>
+                <w:szCs w:val="17"/>
+              </w:rPr>
+              <w:t xml:space="preserve">42.83</w:t>
+            </w:r>
+          </w:p>
+        </w:tc>
+        <w:tc>
+          <w:tcPr>
+            <w:tcW w:w="1224" w:type="dxa"/>
+            <w:vAlign w:val="center"/>
+          </w:tcPr>
+          <w:p>
+            <w:pPr>
+              <w:spacing w:before="20" w:after="20" w:line="240" w:lineRule="auto"/>
+              <w:jc w:val="center"/>
+            </w:pPr>
+            <w:r>
+              <w:rPr>
+                <w:rFonts w:asciiTheme="majorBidi" w:hAnsiTheme="majorBidi" w:cstheme="majorBidi"/>
+                <w:sz w:val="17"/>
+                <w:szCs w:val="17"/>
+              </w:rPr>
+              <w:t xml:space="preserve">23.92</w:t>
+            </w:r>
+          </w:p>
+        </w:tc>
+        <w:tc>
+          <w:tcPr>
+            <w:tcW w:w="1272" w:type="dxa"/>
+            <w:vAlign w:val="center"/>
+          </w:tcPr>
+          <w:p>
+            <w:pPr>
+              <w:spacing w:before="20" w:after="20" w:line="240" w:lineRule="auto"/>
+              <w:jc w:val="center"/>
+            </w:pPr>
+            <w:r>
+              <w:rPr>
+                <w:rFonts w:asciiTheme="majorBidi" w:hAnsiTheme="majorBidi" w:cstheme="majorBidi"/>
+                <w:sz w:val="17"/>
+                <w:szCs w:val="17"/>
+              </w:rPr>
+              <w:t xml:space="preserve">83.40</w:t>
+            </w:r>
+          </w:p>
+        </w:tc>
+      </w:tr>
+      <w:tr>
+        <w:trPr/>
+        <w:tc>
+          <w:tcPr>
+            <w:tcW w:w="2441" w:type="dxa"/>
+            <w:vAlign w:val="center"/>
+          </w:tcPr>
+          <w:p>
+            <w:pPr>
+              <w:spacing w:before="20" w:after="20" w:line="240" w:lineRule="auto"/>
+              <w:jc w:val="left"/>
+            </w:pPr>
+            <w:r>
+              <w:rPr>
+                <w:rFonts w:asciiTheme="majorBidi" w:hAnsiTheme="majorBidi" w:cstheme="majorBidi"/>
+                <w:sz w:val="17"/>
+                <w:szCs w:val="17"/>
+              </w:rPr>
+              <w:t xml:space="preserve">2019-06-24 05:09</w:t>
+            </w:r>
+          </w:p>
+        </w:tc>
+        <w:tc>
+          <w:tcPr>
+            <w:tcW w:w="931" w:type="dxa"/>
+            <w:vAlign w:val="center"/>
+          </w:tcPr>
+          <w:p>
+            <w:pPr>
+              <w:spacing w:before="20" w:after="20" w:line="240" w:lineRule="auto"/>
+              <w:jc w:val="center"/>
+            </w:pPr>
+            <w:r>
+              <w:rPr>
+                <w:rFonts w:asciiTheme="majorBidi" w:hAnsiTheme="majorBidi" w:cstheme="majorBidi"/>
+                <w:sz w:val="17"/>
+                <w:szCs w:val="17"/>
+              </w:rPr>
+              <w:t xml:space="preserve">589</w:t>
+            </w:r>
+          </w:p>
+        </w:tc>
+        <w:tc>
+          <w:tcPr>
+            <w:tcW w:w="1224" w:type="dxa"/>
+            <w:vAlign w:val="center"/>
+          </w:tcPr>
+          <w:p>
+            <w:pPr>
+              <w:spacing w:before="20" w:after="20" w:line="240" w:lineRule="auto"/>
+              <w:jc w:val="center"/>
+            </w:pPr>
+            <w:r>
+              <w:rPr>
+                <w:rFonts w:asciiTheme="majorBidi" w:hAnsiTheme="majorBidi" w:cstheme="majorBidi"/>
+                <w:sz w:val="17"/>
+                <w:szCs w:val="17"/>
+              </w:rPr>
+              <w:t xml:space="preserve">33.71</w:t>
+            </w:r>
+          </w:p>
+        </w:tc>
+        <w:tc>
+          <w:tcPr>
+            <w:tcW w:w="1405" w:type="dxa"/>
+            <w:vAlign w:val="center"/>
+          </w:tcPr>
+          <w:p>
+            <w:pPr>
+              <w:spacing w:before="20" w:after="20" w:line="240" w:lineRule="auto"/>
+              <w:jc w:val="center"/>
+            </w:pPr>
+            <w:r>
+              <w:rPr>
+                <w:rFonts w:asciiTheme="majorBidi" w:hAnsiTheme="majorBidi" w:cstheme="majorBidi"/>
+                <w:sz w:val="17"/>
+                <w:szCs w:val="17"/>
+              </w:rPr>
+              <w:t xml:space="preserve">52.12</w:t>
+            </w:r>
+          </w:p>
+        </w:tc>
+        <w:tc>
+          <w:tcPr>
+            <w:tcW w:w="1224" w:type="dxa"/>
+            <w:vAlign w:val="center"/>
+          </w:tcPr>
+          <w:p>
+            <w:pPr>
+              <w:spacing w:before="20" w:after="20" w:line="240" w:lineRule="auto"/>
+              <w:jc w:val="center"/>
+            </w:pPr>
+            <w:r>
+              <w:rPr>
+                <w:rFonts w:asciiTheme="majorBidi" w:hAnsiTheme="majorBidi" w:cstheme="majorBidi"/>
+                <w:sz w:val="17"/>
+                <w:szCs w:val="17"/>
+              </w:rPr>
+              <w:t xml:space="preserve">23.29</w:t>
+            </w:r>
+          </w:p>
+        </w:tc>
+        <w:tc>
+          <w:tcPr>
+            <w:tcW w:w="1272" w:type="dxa"/>
+            <w:vAlign w:val="center"/>
+          </w:tcPr>
+          <w:p>
+            <w:pPr>
+              <w:spacing w:before="20" w:after="20" w:line="240" w:lineRule="auto"/>
+              <w:jc w:val="center"/>
+            </w:pPr>
+            <w:r>
+              <w:rPr>
+                <w:rFonts w:asciiTheme="majorBidi" w:hAnsiTheme="majorBidi" w:cstheme="majorBidi"/>
+                <w:sz w:val="17"/>
+                <w:szCs w:val="17"/>
+              </w:rPr>
+              <w:t xml:space="preserve">126.57</w:t>
+            </w:r>
+          </w:p>
+        </w:tc>
+      </w:tr>
+      <w:tr>
+        <w:trPr/>
+        <w:tc>
+          <w:tcPr>
+            <w:tcW w:w="2441" w:type="dxa"/>
+            <w:vAlign w:val="center"/>
+          </w:tcPr>
+          <w:p>
+            <w:pPr>
+              <w:spacing w:before="20" w:after="20" w:line="240" w:lineRule="auto"/>
+              <w:jc w:val="left"/>
+            </w:pPr>
+            <w:r>
+              <w:rPr>
+                <w:rFonts w:asciiTheme="majorBidi" w:hAnsiTheme="majorBidi" w:cstheme="majorBidi"/>
+                <w:sz w:val="17"/>
+                <w:szCs w:val="17"/>
+              </w:rPr>
+              <w:t xml:space="preserve">2019-06-24 06:09</w:t>
+            </w:r>
+          </w:p>
+        </w:tc>
+        <w:tc>
+          <w:tcPr>
+            <w:tcW w:w="931" w:type="dxa"/>
+            <w:vAlign w:val="center"/>
+          </w:tcPr>
+          <w:p>
+            <w:pPr>
+              <w:spacing w:before="20" w:after="20" w:line="240" w:lineRule="auto"/>
+              <w:jc w:val="center"/>
+            </w:pPr>
+            <w:r>
+              <w:rPr>
+                <w:rFonts w:asciiTheme="majorBidi" w:hAnsiTheme="majorBidi" w:cstheme="majorBidi"/>
+                <w:sz w:val="17"/>
+                <w:szCs w:val="17"/>
+              </w:rPr>
+              <w:t xml:space="preserve">777</w:t>
+            </w:r>
+          </w:p>
+        </w:tc>
+        <w:tc>
+          <w:tcPr>
+            <w:tcW w:w="1224" w:type="dxa"/>
+            <w:vAlign w:val="center"/>
+          </w:tcPr>
+          <w:p>
+            <w:pPr>
+              <w:spacing w:before="20" w:after="20" w:line="240" w:lineRule="auto"/>
+              <w:jc w:val="center"/>
+            </w:pPr>
+            <w:r>
+              <w:rPr>
+                <w:rFonts w:asciiTheme="majorBidi" w:hAnsiTheme="majorBidi" w:cstheme="majorBidi"/>
+                <w:sz w:val="17"/>
+                <w:szCs w:val="17"/>
+              </w:rPr>
+              <w:t xml:space="preserve">36.11</w:t>
+            </w:r>
+          </w:p>
+        </w:tc>
+        <w:tc>
+          <w:tcPr>
+            <w:tcW w:w="1405" w:type="dxa"/>
+            <w:vAlign w:val="center"/>
+          </w:tcPr>
+          <w:p>
+            <w:pPr>
+              <w:spacing w:before="20" w:after="20" w:line="240" w:lineRule="auto"/>
+              <w:jc w:val="center"/>
+            </w:pPr>
+            <w:r>
+              <w:rPr>
+                <w:rFonts w:asciiTheme="majorBidi" w:hAnsiTheme="majorBidi" w:cstheme="majorBidi"/>
+                <w:sz w:val="17"/>
+                <w:szCs w:val="17"/>
+              </w:rPr>
+              <w:t xml:space="preserve">60.39</w:t>
+            </w:r>
+          </w:p>
+        </w:tc>
+        <w:tc>
+          <w:tcPr>
+            <w:tcW w:w="1224" w:type="dxa"/>
+            <w:vAlign w:val="center"/>
+          </w:tcPr>
+          <w:p>
+            <w:pPr>
+              <w:spacing w:before="20" w:after="20" w:line="240" w:lineRule="auto"/>
+              <w:jc w:val="center"/>
+            </w:pPr>
+            <w:r>
+              <w:rPr>
+                <w:rFonts w:asciiTheme="majorBidi" w:hAnsiTheme="majorBidi" w:cstheme="majorBidi"/>
+                <w:sz w:val="17"/>
+                <w:szCs w:val="17"/>
+              </w:rPr>
+              <w:t xml:space="preserve">22.56</w:t>
+            </w:r>
+          </w:p>
+        </w:tc>
+        <w:tc>
+          <w:tcPr>
+            <w:tcW w:w="1272" w:type="dxa"/>
+            <w:vAlign w:val="center"/>
+          </w:tcPr>
+          <w:p>
+            <w:pPr>
+              <w:spacing w:before="20" w:after="20" w:line="240" w:lineRule="auto"/>
+              <w:jc w:val="center"/>
+            </w:pPr>
+            <w:r>
+              <w:rPr>
+                <w:rFonts w:asciiTheme="majorBidi" w:hAnsiTheme="majorBidi" w:cstheme="majorBidi"/>
+                <w:sz w:val="17"/>
+                <w:szCs w:val="17"/>
+              </w:rPr>
+              <w:t xml:space="preserve">161.65</w:t>
+            </w:r>
+          </w:p>
+        </w:tc>
+      </w:tr>
+      <w:tr>
+        <w:trPr/>
+        <w:tc>
+          <w:tcPr>
+            <w:tcW w:w="2441" w:type="dxa"/>
+            <w:vAlign w:val="center"/>
+          </w:tcPr>
+          <w:p>
+            <w:pPr>
+              <w:spacing w:before="20" w:after="20" w:line="240" w:lineRule="auto"/>
+              <w:jc w:val="left"/>
+            </w:pPr>
+            <w:r>
+              <w:rPr>
+                <w:rFonts w:asciiTheme="majorBidi" w:hAnsiTheme="majorBidi" w:cstheme="majorBidi"/>
+                <w:sz w:val="17"/>
+                <w:szCs w:val="17"/>
+              </w:rPr>
+              <w:t xml:space="preserve">2019-06-24 07:09</w:t>
+            </w:r>
+          </w:p>
+        </w:tc>
+        <w:tc>
+          <w:tcPr>
+            <w:tcW w:w="931" w:type="dxa"/>
+            <w:vAlign w:val="center"/>
+          </w:tcPr>
+          <w:p>
+            <w:pPr>
+              <w:spacing w:before="20" w:after="20" w:line="240" w:lineRule="auto"/>
+              <w:jc w:val="center"/>
+            </w:pPr>
+            <w:r>
+              <w:rPr>
+                <w:rFonts w:asciiTheme="majorBidi" w:hAnsiTheme="majorBidi" w:cstheme="majorBidi"/>
+                <w:sz w:val="17"/>
+                <w:szCs w:val="17"/>
+              </w:rPr>
+              <w:t xml:space="preserve">923</w:t>
+            </w:r>
+          </w:p>
+        </w:tc>
+        <w:tc>
+          <w:tcPr>
+            <w:tcW w:w="1224" w:type="dxa"/>
+            <w:vAlign w:val="center"/>
+          </w:tcPr>
+          <w:p>
+            <w:pPr>
+              <w:spacing w:before="20" w:after="20" w:line="240" w:lineRule="auto"/>
+              <w:jc w:val="center"/>
+            </w:pPr>
+            <w:r>
+              <w:rPr>
+                <w:rFonts w:asciiTheme="majorBidi" w:hAnsiTheme="majorBidi" w:cstheme="majorBidi"/>
+                <w:sz w:val="17"/>
+                <w:szCs w:val="17"/>
+              </w:rPr>
+              <w:t xml:space="preserve">38.94</w:t>
+            </w:r>
+          </w:p>
+        </w:tc>
+        <w:tc>
+          <w:tcPr>
+            <w:tcW w:w="1405" w:type="dxa"/>
+            <w:vAlign w:val="center"/>
+          </w:tcPr>
+          <w:p>
+            <w:pPr>
+              <w:spacing w:before="20" w:after="20" w:line="240" w:lineRule="auto"/>
+              <w:jc w:val="center"/>
+            </w:pPr>
+            <w:r>
+              <w:rPr>
+                <w:rFonts w:asciiTheme="majorBidi" w:hAnsiTheme="majorBidi" w:cstheme="majorBidi"/>
+                <w:sz w:val="17"/>
+                <w:szCs w:val="17"/>
+              </w:rPr>
+              <w:t xml:space="preserve">67.78</w:t>
+            </w:r>
+          </w:p>
+        </w:tc>
+        <w:tc>
+          <w:tcPr>
+            <w:tcW w:w="1224" w:type="dxa"/>
+            <w:vAlign w:val="center"/>
+          </w:tcPr>
+          <w:p>
+            <w:pPr>
+              <w:spacing w:before="20" w:after="20" w:line="240" w:lineRule="auto"/>
+              <w:jc w:val="center"/>
+            </w:pPr>
+            <w:r>
+              <w:rPr>
+                <w:rFonts w:asciiTheme="majorBidi" w:hAnsiTheme="majorBidi" w:cstheme="majorBidi"/>
+                <w:sz w:val="17"/>
+                <w:szCs w:val="17"/>
+              </w:rPr>
+              <w:t xml:space="preserve">21.84</w:t>
+            </w:r>
+          </w:p>
+        </w:tc>
+        <w:tc>
+          <w:tcPr>
+            <w:tcW w:w="1272" w:type="dxa"/>
+            <w:vAlign w:val="center"/>
+          </w:tcPr>
+          <w:p>
+            <w:pPr>
+              <w:spacing w:before="20" w:after="20" w:line="240" w:lineRule="auto"/>
+              <w:jc w:val="center"/>
+            </w:pPr>
+            <w:r>
+              <w:rPr>
+                <w:rFonts w:asciiTheme="majorBidi" w:hAnsiTheme="majorBidi" w:cstheme="majorBidi"/>
+                <w:sz w:val="17"/>
+                <w:szCs w:val="17"/>
+              </w:rPr>
+              <w:t xml:space="preserve">185.63</w:t>
+            </w:r>
+          </w:p>
+        </w:tc>
+      </w:tr>
+      <w:tr>
+        <w:trPr/>
+        <w:tc>
+          <w:tcPr>
+            <w:tcW w:w="2441" w:type="dxa"/>
+            <w:vAlign w:val="center"/>
+          </w:tcPr>
+          <w:p>
+            <w:pPr>
+              <w:spacing w:before="20" w:after="20" w:line="240" w:lineRule="auto"/>
+              <w:jc w:val="left"/>
+            </w:pPr>
+            <w:r>
+              <w:rPr>
+                <w:rFonts w:asciiTheme="majorBidi" w:hAnsiTheme="majorBidi" w:cstheme="majorBidi"/>
+                <w:sz w:val="17"/>
+                <w:szCs w:val="17"/>
+              </w:rPr>
+              <w:t xml:space="preserve">2019-06-24 08:09</w:t>
+            </w:r>
+          </w:p>
+        </w:tc>
+        <w:tc>
+          <w:tcPr>
+            <w:tcW w:w="931" w:type="dxa"/>
+            <w:vAlign w:val="center"/>
+          </w:tcPr>
+          <w:p>
+            <w:pPr>
+              <w:spacing w:before="20" w:after="20" w:line="240" w:lineRule="auto"/>
+              <w:jc w:val="center"/>
+            </w:pPr>
+            <w:r>
+              <w:rPr>
+                <w:rFonts w:asciiTheme="majorBidi" w:hAnsiTheme="majorBidi" w:cstheme="majorBidi"/>
+                <w:sz w:val="17"/>
+                <w:szCs w:val="17"/>
+              </w:rPr>
+              <w:t xml:space="preserve">1018</w:t>
+            </w:r>
+          </w:p>
+        </w:tc>
+        <w:tc>
+          <w:tcPr>
+            <w:tcW w:w="1224" w:type="dxa"/>
+            <w:vAlign w:val="center"/>
+          </w:tcPr>
+          <w:p>
+            <w:pPr>
+              <w:spacing w:before="20" w:after="20" w:line="240" w:lineRule="auto"/>
+              <w:jc w:val="center"/>
+            </w:pPr>
+            <w:r>
+              <w:rPr>
+                <w:rFonts w:asciiTheme="majorBidi" w:hAnsiTheme="majorBidi" w:cstheme="majorBidi"/>
+                <w:sz w:val="17"/>
+                <w:szCs w:val="17"/>
+              </w:rPr>
+              <w:t xml:space="preserve">40.67</w:t>
+            </w:r>
+          </w:p>
+        </w:tc>
+        <w:tc>
+          <w:tcPr>
+            <w:tcW w:w="1405" w:type="dxa"/>
+            <w:vAlign w:val="center"/>
+          </w:tcPr>
+          <w:p>
+            <w:pPr>
+              <w:spacing w:before="20" w:after="20" w:line="240" w:lineRule="auto"/>
+              <w:jc w:val="center"/>
+            </w:pPr>
+            <w:r>
+              <w:rPr>
+                <w:rFonts w:asciiTheme="majorBidi" w:hAnsiTheme="majorBidi" w:cstheme="majorBidi"/>
+                <w:sz w:val="17"/>
+                <w:szCs w:val="17"/>
+              </w:rPr>
+              <w:t xml:space="preserve">72.48</w:t>
+            </w:r>
+          </w:p>
+        </w:tc>
+        <w:tc>
+          <w:tcPr>
+            <w:tcW w:w="1224" w:type="dxa"/>
+            <w:vAlign w:val="center"/>
+          </w:tcPr>
+          <w:p>
+            <w:pPr>
+              <w:spacing w:before="20" w:after="20" w:line="240" w:lineRule="auto"/>
+              <w:jc w:val="center"/>
+            </w:pPr>
+            <w:r>
+              <w:rPr>
+                <w:rFonts w:asciiTheme="majorBidi" w:hAnsiTheme="majorBidi" w:cstheme="majorBidi"/>
+                <w:sz w:val="17"/>
+                <w:szCs w:val="17"/>
+              </w:rPr>
+              <w:t xml:space="preserve">21.36</w:t>
+            </w:r>
+          </w:p>
+        </w:tc>
+        <w:tc>
+          <w:tcPr>
+            <w:tcW w:w="1272" w:type="dxa"/>
+            <w:vAlign w:val="center"/>
+          </w:tcPr>
+          <w:p>
+            <w:pPr>
+              <w:spacing w:before="20" w:after="20" w:line="240" w:lineRule="auto"/>
+              <w:jc w:val="center"/>
+            </w:pPr>
+            <w:r>
+              <w:rPr>
+                <w:rFonts w:asciiTheme="majorBidi" w:hAnsiTheme="majorBidi" w:cstheme="majorBidi"/>
+                <w:sz w:val="17"/>
+                <w:szCs w:val="17"/>
+              </w:rPr>
+              <w:t xml:space="preserve">200.07</w:t>
+            </w:r>
+          </w:p>
+        </w:tc>
+      </w:tr>
+      <w:tr>
+        <w:trPr/>
+        <w:tc>
+          <w:tcPr>
+            <w:tcW w:w="2441" w:type="dxa"/>
+            <w:vAlign w:val="center"/>
+          </w:tcPr>
+          <w:p>
+            <w:pPr>
+              <w:spacing w:before="20" w:after="20" w:line="240" w:lineRule="auto"/>
+              <w:jc w:val="left"/>
+            </w:pPr>
+            <w:r>
+              <w:rPr>
+                <w:rFonts w:asciiTheme="majorBidi" w:hAnsiTheme="majorBidi" w:cstheme="majorBidi"/>
+                <w:sz w:val="17"/>
+                <w:szCs w:val="17"/>
+              </w:rPr>
+              <w:t xml:space="preserve">2019-06-24 09:09</w:t>
+            </w:r>
+          </w:p>
+        </w:tc>
+        <w:tc>
+          <w:tcPr>
+            <w:tcW w:w="931" w:type="dxa"/>
+            <w:vAlign w:val="center"/>
+          </w:tcPr>
+          <w:p>
+            <w:pPr>
+              <w:spacing w:before="20" w:after="20" w:line="240" w:lineRule="auto"/>
+              <w:jc w:val="center"/>
+            </w:pPr>
+            <w:r>
+              <w:rPr>
+                <w:rFonts w:asciiTheme="majorBidi" w:hAnsiTheme="majorBidi" w:cstheme="majorBidi"/>
+                <w:sz w:val="17"/>
+                <w:szCs w:val="17"/>
+              </w:rPr>
+              <w:t xml:space="preserve">1051</w:t>
+            </w:r>
+          </w:p>
+        </w:tc>
+        <w:tc>
+          <w:tcPr>
+            <w:tcW w:w="1224" w:type="dxa"/>
+            <w:vAlign w:val="center"/>
+          </w:tcPr>
+          <w:p>
+            <w:pPr>
+              <w:spacing w:before="20" w:after="20" w:line="240" w:lineRule="auto"/>
+              <w:jc w:val="center"/>
+            </w:pPr>
+            <w:r>
+              <w:rPr>
+                <w:rFonts w:asciiTheme="majorBidi" w:hAnsiTheme="majorBidi" w:cstheme="majorBidi"/>
+                <w:sz w:val="17"/>
+                <w:szCs w:val="17"/>
+              </w:rPr>
+              <w:t xml:space="preserve">41.74</w:t>
+            </w:r>
+          </w:p>
+        </w:tc>
+        <w:tc>
+          <w:tcPr>
+            <w:tcW w:w="1405" w:type="dxa"/>
+            <w:vAlign w:val="center"/>
+          </w:tcPr>
+          <w:p>
+            <w:pPr>
+              <w:spacing w:before="20" w:after="20" w:line="240" w:lineRule="auto"/>
+              <w:jc w:val="center"/>
+            </w:pPr>
+            <w:r>
+              <w:rPr>
+                <w:rFonts w:asciiTheme="majorBidi" w:hAnsiTheme="majorBidi" w:cstheme="majorBidi"/>
+                <w:sz w:val="17"/>
+                <w:szCs w:val="17"/>
+              </w:rPr>
+              <w:t xml:space="preserve">74.58</w:t>
+            </w:r>
+          </w:p>
+        </w:tc>
+        <w:tc>
+          <w:tcPr>
+            <w:tcW w:w="1224" w:type="dxa"/>
+            <w:vAlign w:val="center"/>
+          </w:tcPr>
+          <w:p>
+            <w:pPr>
+              <w:spacing w:before="20" w:after="20" w:line="240" w:lineRule="auto"/>
+              <w:jc w:val="center"/>
+            </w:pPr>
+            <w:r>
+              <w:rPr>
+                <w:rFonts w:asciiTheme="majorBidi" w:hAnsiTheme="majorBidi" w:cstheme="majorBidi"/>
+                <w:sz w:val="17"/>
+                <w:szCs w:val="17"/>
+              </w:rPr>
+              <w:t xml:space="preserve">21.15</w:t>
+            </w:r>
+          </w:p>
+        </w:tc>
+        <w:tc>
+          <w:tcPr>
+            <w:tcW w:w="1272" w:type="dxa"/>
+            <w:vAlign w:val="center"/>
+          </w:tcPr>
+          <w:p>
+            <w:pPr>
+              <w:spacing w:before="20" w:after="20" w:line="240" w:lineRule="auto"/>
+              <w:jc w:val="center"/>
+            </w:pPr>
+            <w:r>
+              <w:rPr>
+                <w:rFonts w:asciiTheme="majorBidi" w:hAnsiTheme="majorBidi" w:cstheme="majorBidi"/>
+                <w:sz w:val="17"/>
+                <w:szCs w:val="17"/>
+              </w:rPr>
+              <w:t xml:space="preserve">204.34</w:t>
+            </w:r>
+          </w:p>
+        </w:tc>
+      </w:tr>
+      <w:tr>
+        <w:trPr/>
+        <w:tc>
+          <w:tcPr>
+            <w:tcW w:w="2441" w:type="dxa"/>
+            <w:vAlign w:val="center"/>
+          </w:tcPr>
+          <w:p>
+            <w:pPr>
+              <w:spacing w:before="20" w:after="20" w:line="240" w:lineRule="auto"/>
+              <w:jc w:val="left"/>
+            </w:pPr>
+            <w:r>
+              <w:rPr>
+                <w:rFonts w:asciiTheme="majorBidi" w:hAnsiTheme="majorBidi" w:cstheme="majorBidi"/>
+                <w:sz w:val="17"/>
+                <w:szCs w:val="17"/>
+              </w:rPr>
+              <w:t xml:space="preserve">2019-06-24 10:09</w:t>
+            </w:r>
+          </w:p>
+        </w:tc>
+        <w:tc>
+          <w:tcPr>
+            <w:tcW w:w="931" w:type="dxa"/>
+            <w:vAlign w:val="center"/>
+          </w:tcPr>
+          <w:p>
+            <w:pPr>
+              <w:spacing w:before="20" w:after="20" w:line="240" w:lineRule="auto"/>
+              <w:jc w:val="center"/>
+            </w:pPr>
+            <w:r>
+              <w:rPr>
+                <w:rFonts w:asciiTheme="majorBidi" w:hAnsiTheme="majorBidi" w:cstheme="majorBidi"/>
+                <w:sz w:val="17"/>
+                <w:szCs w:val="17"/>
+              </w:rPr>
+              <w:t xml:space="preserve">1022</w:t>
+            </w:r>
+          </w:p>
+        </w:tc>
+        <w:tc>
+          <w:tcPr>
+            <w:tcW w:w="1224" w:type="dxa"/>
+            <w:vAlign w:val="center"/>
+          </w:tcPr>
+          <w:p>
+            <w:pPr>
+              <w:spacing w:before="20" w:after="20" w:line="240" w:lineRule="auto"/>
+              <w:jc w:val="center"/>
+            </w:pPr>
+            <w:r>
+              <w:rPr>
+                <w:rFonts w:asciiTheme="majorBidi" w:hAnsiTheme="majorBidi" w:cstheme="majorBidi"/>
+                <w:sz w:val="17"/>
+                <w:szCs w:val="17"/>
+              </w:rPr>
+              <w:t xml:space="preserve">42.57</w:t>
+            </w:r>
+          </w:p>
+        </w:tc>
+        <w:tc>
+          <w:tcPr>
+            <w:tcW w:w="1405" w:type="dxa"/>
+            <w:vAlign w:val="center"/>
+          </w:tcPr>
+          <w:p>
+            <w:pPr>
+              <w:spacing w:before="20" w:after="20" w:line="240" w:lineRule="auto"/>
+              <w:jc w:val="center"/>
+            </w:pPr>
+            <w:r>
+              <w:rPr>
+                <w:rFonts w:asciiTheme="majorBidi" w:hAnsiTheme="majorBidi" w:cstheme="majorBidi"/>
+                <w:sz w:val="17"/>
+                <w:szCs w:val="17"/>
+              </w:rPr>
+              <w:t xml:space="preserve">74.51</w:t>
+            </w:r>
+          </w:p>
+        </w:tc>
+        <w:tc>
+          <w:tcPr>
+            <w:tcW w:w="1224" w:type="dxa"/>
+            <w:vAlign w:val="center"/>
+          </w:tcPr>
+          <w:p>
+            <w:pPr>
+              <w:spacing w:before="20" w:after="20" w:line="240" w:lineRule="auto"/>
+              <w:jc w:val="center"/>
+            </w:pPr>
+            <w:r>
+              <w:rPr>
+                <w:rFonts w:asciiTheme="majorBidi" w:hAnsiTheme="majorBidi" w:cstheme="majorBidi"/>
+                <w:sz w:val="17"/>
+                <w:szCs w:val="17"/>
+              </w:rPr>
+              <w:t xml:space="preserve">21.14</w:t>
+            </w:r>
+          </w:p>
+        </w:tc>
+        <w:tc>
+          <w:tcPr>
+            <w:tcW w:w="1272" w:type="dxa"/>
+            <w:vAlign w:val="center"/>
+          </w:tcPr>
+          <w:p>
+            <w:pPr>
+              <w:spacing w:before="20" w:after="20" w:line="240" w:lineRule="auto"/>
+              <w:jc w:val="center"/>
+            </w:pPr>
+            <w:r>
+              <w:rPr>
+                <w:rFonts w:asciiTheme="majorBidi" w:hAnsiTheme="majorBidi" w:cstheme="majorBidi"/>
+                <w:sz w:val="17"/>
+                <w:szCs w:val="17"/>
+              </w:rPr>
+              <w:t xml:space="preserve">198.73</w:t>
+            </w:r>
+          </w:p>
+        </w:tc>
+      </w:tr>
+      <w:tr>
+        <w:trPr/>
+        <w:tc>
+          <w:tcPr>
+            <w:tcW w:w="2441" w:type="dxa"/>
+            <w:vAlign w:val="center"/>
+          </w:tcPr>
+          <w:p>
+            <w:pPr>
+              <w:spacing w:before="20" w:after="20" w:line="240" w:lineRule="auto"/>
+              <w:jc w:val="left"/>
+            </w:pPr>
+            <w:r>
+              <w:rPr>
+                <w:rFonts w:asciiTheme="majorBidi" w:hAnsiTheme="majorBidi" w:cstheme="majorBidi"/>
+                <w:sz w:val="17"/>
+                <w:szCs w:val="17"/>
+              </w:rPr>
+              <w:t xml:space="preserve">2019-06-24 11:09</w:t>
+            </w:r>
+          </w:p>
+        </w:tc>
+        <w:tc>
+          <w:tcPr>
+            <w:tcW w:w="931" w:type="dxa"/>
+            <w:vAlign w:val="center"/>
+          </w:tcPr>
+          <w:p>
+            <w:pPr>
+              <w:spacing w:before="20" w:after="20" w:line="240" w:lineRule="auto"/>
+              <w:jc w:val="center"/>
+            </w:pPr>
+            <w:r>
+              <w:rPr>
+                <w:rFonts w:asciiTheme="majorBidi" w:hAnsiTheme="majorBidi" w:cstheme="majorBidi"/>
+                <w:sz w:val="17"/>
+                <w:szCs w:val="17"/>
+              </w:rPr>
+              <w:t xml:space="preserve">915</w:t>
+            </w:r>
+          </w:p>
+        </w:tc>
+        <w:tc>
+          <w:tcPr>
+            <w:tcW w:w="1224" w:type="dxa"/>
+            <w:vAlign w:val="center"/>
+          </w:tcPr>
+          <w:p>
+            <w:pPr>
+              <w:spacing w:before="20" w:after="20" w:line="240" w:lineRule="auto"/>
+              <w:jc w:val="center"/>
+            </w:pPr>
+            <w:r>
+              <w:rPr>
+                <w:rFonts w:asciiTheme="majorBidi" w:hAnsiTheme="majorBidi" w:cstheme="majorBidi"/>
+                <w:sz w:val="17"/>
+                <w:szCs w:val="17"/>
+              </w:rPr>
+              <w:t xml:space="preserve">43.19</w:t>
+            </w:r>
+          </w:p>
+        </w:tc>
+        <w:tc>
+          <w:tcPr>
+            <w:tcW w:w="1405" w:type="dxa"/>
+            <w:vAlign w:val="center"/>
+          </w:tcPr>
+          <w:p>
+            <w:pPr>
+              <w:spacing w:before="20" w:after="20" w:line="240" w:lineRule="auto"/>
+              <w:jc w:val="center"/>
+            </w:pPr>
+            <w:r>
+              <w:rPr>
+                <w:rFonts w:asciiTheme="majorBidi" w:hAnsiTheme="majorBidi" w:cstheme="majorBidi"/>
+                <w:sz w:val="17"/>
+                <w:szCs w:val="17"/>
+              </w:rPr>
+              <w:t xml:space="preserve">71.78</w:t>
+            </w:r>
+          </w:p>
+        </w:tc>
+        <w:tc>
+          <w:tcPr>
+            <w:tcW w:w="1224" w:type="dxa"/>
+            <w:vAlign w:val="center"/>
+          </w:tcPr>
+          <w:p>
+            <w:pPr>
+              <w:spacing w:before="20" w:after="20" w:line="240" w:lineRule="auto"/>
+              <w:jc w:val="center"/>
+            </w:pPr>
+            <w:r>
+              <w:rPr>
+                <w:rFonts w:asciiTheme="majorBidi" w:hAnsiTheme="majorBidi" w:cstheme="majorBidi"/>
+                <w:sz w:val="17"/>
+                <w:szCs w:val="17"/>
+              </w:rPr>
+              <w:t xml:space="preserve">21.39</w:t>
+            </w:r>
+          </w:p>
+        </w:tc>
+        <w:tc>
+          <w:tcPr>
+            <w:tcW w:w="1272" w:type="dxa"/>
+            <w:vAlign w:val="center"/>
+          </w:tcPr>
+          <w:p>
+            <w:pPr>
+              <w:spacing w:before="20" w:after="20" w:line="240" w:lineRule="auto"/>
+              <w:jc w:val="center"/>
+            </w:pPr>
+            <w:r>
+              <w:rPr>
+                <w:rFonts w:asciiTheme="majorBidi" w:hAnsiTheme="majorBidi" w:cstheme="majorBidi"/>
+                <w:sz w:val="17"/>
+                <w:szCs w:val="17"/>
+              </w:rPr>
+              <w:t xml:space="preserve">180.21</w:t>
+            </w:r>
+          </w:p>
+        </w:tc>
+      </w:tr>
+      <w:tr>
+        <w:trPr/>
+        <w:tc>
+          <w:tcPr>
+            <w:tcW w:w="2441" w:type="dxa"/>
+            <w:vAlign w:val="center"/>
+          </w:tcPr>
+          <w:p>
+            <w:pPr>
+              <w:spacing w:before="20" w:after="20" w:line="240" w:lineRule="auto"/>
+              <w:jc w:val="left"/>
+            </w:pPr>
+            <w:r>
+              <w:rPr>
+                <w:rFonts w:asciiTheme="majorBidi" w:hAnsiTheme="majorBidi" w:cstheme="majorBidi"/>
+                <w:sz w:val="17"/>
+                <w:szCs w:val="17"/>
+              </w:rPr>
+              <w:t xml:space="preserve">2019-06-24 12:09</w:t>
+            </w:r>
+          </w:p>
+        </w:tc>
+        <w:tc>
+          <w:tcPr>
+            <w:tcW w:w="931" w:type="dxa"/>
+            <w:vAlign w:val="center"/>
+          </w:tcPr>
+          <w:p>
+            <w:pPr>
+              <w:spacing w:before="20" w:after="20" w:line="240" w:lineRule="auto"/>
+              <w:jc w:val="center"/>
+            </w:pPr>
+            <w:r>
+              <w:rPr>
+                <w:rFonts w:asciiTheme="majorBidi" w:hAnsiTheme="majorBidi" w:cstheme="majorBidi"/>
+                <w:sz w:val="17"/>
+                <w:szCs w:val="17"/>
+              </w:rPr>
+              <w:t xml:space="preserve">757</w:t>
+            </w:r>
+          </w:p>
+        </w:tc>
+        <w:tc>
+          <w:tcPr>
+            <w:tcW w:w="1224" w:type="dxa"/>
+            <w:vAlign w:val="center"/>
+          </w:tcPr>
+          <w:p>
+            <w:pPr>
+              <w:spacing w:before="20" w:after="20" w:line="240" w:lineRule="auto"/>
+              <w:jc w:val="center"/>
+            </w:pPr>
+            <w:r>
+              <w:rPr>
+                <w:rFonts w:asciiTheme="majorBidi" w:hAnsiTheme="majorBidi" w:cstheme="majorBidi"/>
+                <w:sz w:val="17"/>
+                <w:szCs w:val="17"/>
+              </w:rPr>
+              <w:t xml:space="preserve">43.53</w:t>
+            </w:r>
+          </w:p>
+        </w:tc>
+        <w:tc>
+          <w:tcPr>
+            <w:tcW w:w="1405" w:type="dxa"/>
+            <w:vAlign w:val="center"/>
+          </w:tcPr>
+          <w:p>
+            <w:pPr>
+              <w:spacing w:before="20" w:after="20" w:line="240" w:lineRule="auto"/>
+              <w:jc w:val="center"/>
+            </w:pPr>
+            <w:r>
+              <w:rPr>
+                <w:rFonts w:asciiTheme="majorBidi" w:hAnsiTheme="majorBidi" w:cstheme="majorBidi"/>
+                <w:sz w:val="17"/>
+                <w:szCs w:val="17"/>
+              </w:rPr>
+              <w:t xml:space="preserve">67.19</w:t>
+            </w:r>
+          </w:p>
+        </w:tc>
+        <w:tc>
+          <w:tcPr>
+            <w:tcW w:w="1224" w:type="dxa"/>
+            <w:vAlign w:val="center"/>
+          </w:tcPr>
+          <w:p>
+            <w:pPr>
+              <w:spacing w:before="20" w:after="20" w:line="240" w:lineRule="auto"/>
+              <w:jc w:val="center"/>
+            </w:pPr>
+            <w:r>
+              <w:rPr>
+                <w:rFonts w:asciiTheme="majorBidi" w:hAnsiTheme="majorBidi" w:cstheme="majorBidi"/>
+                <w:sz w:val="17"/>
+                <w:szCs w:val="17"/>
+              </w:rPr>
+              <w:t xml:space="preserve">21.79</w:t>
+            </w:r>
+          </w:p>
+        </w:tc>
+        <w:tc>
+          <w:tcPr>
+            <w:tcW w:w="1272" w:type="dxa"/>
+            <w:vAlign w:val="center"/>
+          </w:tcPr>
+          <w:p>
+            <w:pPr>
+              <w:spacing w:before="20" w:after="20" w:line="240" w:lineRule="auto"/>
+              <w:jc w:val="center"/>
+            </w:pPr>
+            <w:r>
+              <w:rPr>
+                <w:rFonts w:asciiTheme="majorBidi" w:hAnsiTheme="majorBidi" w:cstheme="majorBidi"/>
+                <w:sz w:val="17"/>
+                <w:szCs w:val="17"/>
+              </w:rPr>
+              <w:t xml:space="preserve">152.04</w:t>
+            </w:r>
+          </w:p>
+        </w:tc>
+      </w:tr>
+      <w:tr>
+        <w:trPr/>
+        <w:tc>
+          <w:tcPr>
+            <w:tcW w:w="2441" w:type="dxa"/>
+            <w:vAlign w:val="center"/>
+          </w:tcPr>
+          <w:p>
+            <w:pPr>
+              <w:spacing w:before="20" w:after="20" w:line="240" w:lineRule="auto"/>
+              <w:jc w:val="left"/>
+            </w:pPr>
+            <w:r>
+              <w:rPr>
+                <w:rFonts w:asciiTheme="majorBidi" w:hAnsiTheme="majorBidi" w:cstheme="majorBidi"/>
+                <w:sz w:val="17"/>
+                <w:szCs w:val="17"/>
+              </w:rPr>
+              <w:t xml:space="preserve">2019-06-24 13:09</w:t>
+            </w:r>
+          </w:p>
+        </w:tc>
+        <w:tc>
+          <w:tcPr>
+            <w:tcW w:w="931" w:type="dxa"/>
+            <w:vAlign w:val="center"/>
+          </w:tcPr>
+          <w:p>
+            <w:pPr>
+              <w:spacing w:before="20" w:after="20" w:line="240" w:lineRule="auto"/>
+              <w:jc w:val="center"/>
+            </w:pPr>
+            <w:r>
+              <w:rPr>
+                <w:rFonts w:asciiTheme="majorBidi" w:hAnsiTheme="majorBidi" w:cstheme="majorBidi"/>
+                <w:sz w:val="17"/>
+                <w:szCs w:val="17"/>
+              </w:rPr>
+              <w:t xml:space="preserve">584</w:t>
+            </w:r>
+          </w:p>
+        </w:tc>
+        <w:tc>
+          <w:tcPr>
+            <w:tcW w:w="1224" w:type="dxa"/>
+            <w:vAlign w:val="center"/>
+          </w:tcPr>
+          <w:p>
+            <w:pPr>
+              <w:spacing w:before="20" w:after="20" w:line="240" w:lineRule="auto"/>
+              <w:jc w:val="center"/>
+            </w:pPr>
+            <w:r>
+              <w:rPr>
+                <w:rFonts w:asciiTheme="majorBidi" w:hAnsiTheme="majorBidi" w:cstheme="majorBidi"/>
+                <w:sz w:val="17"/>
+                <w:szCs w:val="17"/>
+              </w:rPr>
+              <w:t xml:space="preserve">43.56</w:t>
+            </w:r>
+          </w:p>
+        </w:tc>
+        <w:tc>
+          <w:tcPr>
+            <w:tcW w:w="1405" w:type="dxa"/>
+            <w:vAlign w:val="center"/>
+          </w:tcPr>
+          <w:p>
+            <w:pPr>
+              <w:spacing w:before="20" w:after="20" w:line="240" w:lineRule="auto"/>
+              <w:jc w:val="center"/>
+            </w:pPr>
+            <w:r>
+              <w:rPr>
+                <w:rFonts w:asciiTheme="majorBidi" w:hAnsiTheme="majorBidi" w:cstheme="majorBidi"/>
+                <w:sz w:val="17"/>
+                <w:szCs w:val="17"/>
+              </w:rPr>
+              <w:t xml:space="preserve">61.81</w:t>
+            </w:r>
+          </w:p>
+        </w:tc>
+        <w:tc>
+          <w:tcPr>
+            <w:tcW w:w="1224" w:type="dxa"/>
+            <w:vAlign w:val="center"/>
+          </w:tcPr>
+          <w:p>
+            <w:pPr>
+              <w:spacing w:before="20" w:after="20" w:line="240" w:lineRule="auto"/>
+              <w:jc w:val="center"/>
+            </w:pPr>
+            <w:r>
+              <w:rPr>
+                <w:rFonts w:asciiTheme="majorBidi" w:hAnsiTheme="majorBidi" w:cstheme="majorBidi"/>
+                <w:sz w:val="17"/>
+                <w:szCs w:val="17"/>
+              </w:rPr>
+              <w:t xml:space="preserve">22.18</w:t>
+            </w:r>
+          </w:p>
+        </w:tc>
+        <w:tc>
+          <w:tcPr>
+            <w:tcW w:w="1272" w:type="dxa"/>
+            <w:vAlign w:val="center"/>
+          </w:tcPr>
+          <w:p>
+            <w:pPr>
+              <w:spacing w:before="20" w:after="20" w:line="240" w:lineRule="auto"/>
+              <w:jc w:val="center"/>
+            </w:pPr>
+            <w:r>
+              <w:rPr>
+                <w:rFonts w:asciiTheme="majorBidi" w:hAnsiTheme="majorBidi" w:cstheme="majorBidi"/>
+                <w:sz w:val="17"/>
+                <w:szCs w:val="17"/>
+              </w:rPr>
+              <w:t xml:space="preserve">119.52</w:t>
+            </w:r>
+          </w:p>
+        </w:tc>
+      </w:tr>
+      <w:tr>
+        <w:trPr/>
+        <w:tc>
+          <w:tcPr>
+            <w:tcW w:w="2441" w:type="dxa"/>
+            <w:vAlign w:val="center"/>
+          </w:tcPr>
+          <w:p>
+            <w:pPr>
+              <w:spacing w:before="20" w:after="20" w:line="240" w:lineRule="auto"/>
+              <w:jc w:val="left"/>
+            </w:pPr>
+            <w:r>
+              <w:rPr>
+                <w:rFonts w:asciiTheme="majorBidi" w:hAnsiTheme="majorBidi" w:cstheme="majorBidi"/>
+                <w:sz w:val="17"/>
+                <w:szCs w:val="17"/>
+              </w:rPr>
+              <w:t xml:space="preserve">2019-06-24 14:09</w:t>
+            </w:r>
+          </w:p>
+        </w:tc>
+        <w:tc>
+          <w:tcPr>
+            <w:tcW w:w="931" w:type="dxa"/>
+            <w:vAlign w:val="center"/>
+          </w:tcPr>
+          <w:p>
+            <w:pPr>
+              <w:spacing w:before="20" w:after="20" w:line="240" w:lineRule="auto"/>
+              <w:jc w:val="center"/>
+            </w:pPr>
+            <w:r>
+              <w:rPr>
+                <w:rFonts w:asciiTheme="majorBidi" w:hAnsiTheme="majorBidi" w:cstheme="majorBidi"/>
+                <w:sz w:val="17"/>
+                <w:szCs w:val="17"/>
+              </w:rPr>
+              <w:t xml:space="preserve">365</w:t>
+            </w:r>
+          </w:p>
+        </w:tc>
+        <w:tc>
+          <w:tcPr>
+            <w:tcW w:w="1224" w:type="dxa"/>
+            <w:vAlign w:val="center"/>
+          </w:tcPr>
+          <w:p>
+            <w:pPr>
+              <w:spacing w:before="20" w:after="20" w:line="240" w:lineRule="auto"/>
+              <w:jc w:val="center"/>
+            </w:pPr>
+            <w:r>
+              <w:rPr>
+                <w:rFonts w:asciiTheme="majorBidi" w:hAnsiTheme="majorBidi" w:cstheme="majorBidi"/>
+                <w:sz w:val="17"/>
+                <w:szCs w:val="17"/>
+              </w:rPr>
+              <w:t xml:space="preserve">43.24</w:t>
+            </w:r>
+          </w:p>
+        </w:tc>
+        <w:tc>
+          <w:tcPr>
+            <w:tcW w:w="1405" w:type="dxa"/>
+            <w:vAlign w:val="center"/>
+          </w:tcPr>
+          <w:p>
+            <w:pPr>
+              <w:spacing w:before="20" w:after="20" w:line="240" w:lineRule="auto"/>
+              <w:jc w:val="center"/>
+            </w:pPr>
+            <w:r>
+              <w:rPr>
+                <w:rFonts w:asciiTheme="majorBidi" w:hAnsiTheme="majorBidi" w:cstheme="majorBidi"/>
+                <w:sz w:val="17"/>
+                <w:szCs w:val="17"/>
+              </w:rPr>
+              <w:t xml:space="preserve">54.65</w:t>
+            </w:r>
+          </w:p>
+        </w:tc>
+        <w:tc>
+          <w:tcPr>
+            <w:tcW w:w="1224" w:type="dxa"/>
+            <w:vAlign w:val="center"/>
+          </w:tcPr>
+          <w:p>
+            <w:pPr>
+              <w:spacing w:before="20" w:after="20" w:line="240" w:lineRule="auto"/>
+              <w:jc w:val="center"/>
+            </w:pPr>
+            <w:r>
+              <w:rPr>
+                <w:rFonts w:asciiTheme="majorBidi" w:hAnsiTheme="majorBidi" w:cstheme="majorBidi"/>
+                <w:sz w:val="17"/>
+                <w:szCs w:val="17"/>
+              </w:rPr>
+              <w:t xml:space="preserve">22.51</w:t>
+            </w:r>
+          </w:p>
+        </w:tc>
+        <w:tc>
+          <w:tcPr>
+            <w:tcW w:w="1272" w:type="dxa"/>
+            <w:vAlign w:val="center"/>
+          </w:tcPr>
+          <w:p>
+            <w:pPr>
+              <w:spacing w:before="20" w:after="20" w:line="240" w:lineRule="auto"/>
+              <w:jc w:val="center"/>
+            </w:pPr>
+            <w:r>
+              <w:rPr>
+                <w:rFonts w:asciiTheme="majorBidi" w:hAnsiTheme="majorBidi" w:cstheme="majorBidi"/>
+                <w:sz w:val="17"/>
+                <w:szCs w:val="17"/>
+              </w:rPr>
+              <w:t xml:space="preserve">75.80</w:t>
+            </w:r>
+          </w:p>
+        </w:tc>
+      </w:tr>
+    </w:tbl>
+    <w:p>
+      <w:pPr>
+        <w:spacing w:after="120"/>
+      </w:pPr>
+    </w:p>
+    <w:p>
+      <w:pPr>
+        <w:keepNext/>
+        <w:spacing w:before="60" w:after="140" w:line="240" w:lineRule="auto"/>
+        <w:jc w:val="both"/>
+      </w:pPr>
+      <w:r>
+        <w:rPr>
+          <w:rFonts w:asciiTheme="majorBidi" w:hAnsiTheme="majorBidi" w:cstheme="majorBidi"/>
+          <w:b/>
+          <w:bCs/>
+          <w:sz w:val="18"/>
+          <w:szCs w:val="18"/>
+        </w:rPr>
+        <w:t xml:space="preserve">Table S2</w:t>
+      </w:r>
+      <w:r>
+        <w:rPr>
+          <w:rFonts w:asciiTheme="majorBidi" w:hAnsiTheme="majorBidi" w:cstheme="majorBidi"/>
+          <w:sz w:val="18"/>
+          <w:szCs w:val="18"/>
+        </w:rPr>
+        <w:t xml:space="preserve"> One partially shaded sample (nominal plant, test-year conditions: </w:t>
+      </w:r>
+      <w:r>
+        <w:rPr>
+          <w:rFonts w:asciiTheme="majorBidi" w:hAnsiTheme="majorBidi" w:cstheme="majorBidi"/>
+          <w:sz w:val="18"/>
+          <w:szCs w:val="18"/>
+        </w:rPr>
+        <w:t xml:space="preserve">G</w:t>
+      </w:r>
+      <w:r>
+        <w:rPr>
+          <w:rFonts w:asciiTheme="majorBidi" w:hAnsiTheme="majorBidi" w:cstheme="majorBidi"/>
+          <w:sz w:val="18"/>
+          <w:szCs w:val="18"/>
+          <w:vertAlign w:val="subscript"/>
+        </w:rPr>
+        <w:t xml:space="preserve">in</w:t>
+      </w:r>
+      <w:r>
+        <w:rPr>
+          <w:rFonts w:asciiTheme="majorBidi" w:hAnsiTheme="majorBidi" w:cstheme="majorBidi"/>
+          <w:sz w:val="18"/>
+          <w:szCs w:val="18"/>
+        </w:rPr>
+        <w:t xml:space="preserve"> = 93 W/m², T = 19.2 °C, true global-maximum voltage </w:t>
+      </w:r>
+      <w:r>
+        <w:rPr>
+          <w:rFonts w:asciiTheme="majorBidi" w:hAnsiTheme="majorBidi" w:cstheme="majorBidi"/>
+          <w:sz w:val="18"/>
+          <w:szCs w:val="18"/>
+        </w:rPr>
+        <w:t xml:space="preserve">V</w:t>
+      </w:r>
+      <w:r>
+        <w:rPr>
+          <w:rFonts w:asciiTheme="majorBidi" w:hAnsiTheme="majorBidi" w:cstheme="majorBidi"/>
+          <w:sz w:val="18"/>
+          <w:szCs w:val="18"/>
+          <w:vertAlign w:val="subscript"/>
+        </w:rPr>
+        <w:t xml:space="preserve">gmpp</w:t>
+      </w:r>
+      <w:r>
+        <w:rPr>
+          <w:rFonts w:asciiTheme="majorBidi" w:hAnsiTheme="majorBidi" w:cstheme="majorBidi"/>
+          <w:sz w:val="18"/>
+          <w:szCs w:val="18"/>
+        </w:rPr>
+        <w:t xml:space="preserve"> = 15.88 V). The 14 currents </w:t>
+      </w:r>
+      <w:r>
+        <w:rPr>
+          <w:rFonts w:asciiTheme="majorBidi" w:hAnsiTheme="majorBidi" w:cstheme="majorBidi"/>
+          <w:sz w:val="18"/>
+          <w:szCs w:val="18"/>
+        </w:rPr>
+        <w:t xml:space="preserve">I</w:t>
+      </w:r>
+      <w:r>
+        <w:rPr>
+          <w:rFonts w:asciiTheme="majorBidi" w:hAnsiTheme="majorBidi" w:cstheme="majorBidi"/>
+          <w:sz w:val="18"/>
+          <w:szCs w:val="18"/>
+          <w:vertAlign w:val="subscript"/>
+        </w:rPr>
+        <w:t xml:space="preserve">k</w:t>
+      </w:r>
+      <w:r>
+        <w:rPr>
+          <w:rFonts w:asciiTheme="majorBidi" w:hAnsiTheme="majorBidi" w:cstheme="majorBidi"/>
+          <w:sz w:val="18"/>
+          <w:szCs w:val="18"/>
+        </w:rPr>
+        <w:t xml:space="preserve"> measured at the probe voltages </w:t>
+      </w:r>
+      <w:r>
+        <w:rPr>
+          <w:rFonts w:asciiTheme="majorBidi" w:hAnsiTheme="majorBidi" w:cstheme="majorBidi"/>
+          <w:sz w:val="18"/>
+          <w:szCs w:val="18"/>
+        </w:rPr>
+        <w:t xml:space="preserve">V</w:t>
+      </w:r>
+      <w:r>
+        <w:rPr>
+          <w:rFonts w:asciiTheme="majorBidi" w:hAnsiTheme="majorBidi" w:cstheme="majorBidi"/>
+          <w:sz w:val="18"/>
+          <w:szCs w:val="18"/>
+          <w:vertAlign w:val="subscript"/>
+        </w:rPr>
+        <w:t xml:space="preserve">k</w:t>
+      </w:r>
+      <w:r>
+        <w:rPr>
+          <w:rFonts w:asciiTheme="majorBidi" w:hAnsiTheme="majorBidi" w:cstheme="majorBidi"/>
+          <w:sz w:val="18"/>
+          <w:szCs w:val="18"/>
+        </w:rPr>
+        <w:t xml:space="preserve"> form the input of the DNN together with </w:t>
+      </w:r>
+      <w:r>
+        <w:rPr>
+          <w:rFonts w:asciiTheme="majorBidi" w:hAnsiTheme="majorBidi" w:cstheme="majorBidi"/>
+          <w:sz w:val="18"/>
+          <w:szCs w:val="18"/>
+        </w:rPr>
+        <w:t xml:space="preserve">G</w:t>
+      </w:r>
+      <w:r>
+        <w:rPr>
+          <w:rFonts w:asciiTheme="majorBidi" w:hAnsiTheme="majorBidi" w:cstheme="majorBidi"/>
+          <w:sz w:val="18"/>
+          <w:szCs w:val="18"/>
+          <w:vertAlign w:val="subscript"/>
+        </w:rPr>
+        <w:t xml:space="preserve">in</w:t>
+      </w:r>
+      <w:r>
+        <w:rPr>
+          <w:rFonts w:asciiTheme="majorBidi" w:hAnsiTheme="majorBidi" w:cstheme="majorBidi"/>
+          <w:sz w:val="18"/>
+          <w:szCs w:val="18"/>
+        </w:rPr>
+        <w:t xml:space="preserve"> and T.</w:t>
+      </w:r>
+    </w:p>
+    <w:tbl>
+      <w:tblPr>
+        <w:tblW w:w="8491" w:type="dxa"/>
+        <w:jc w:val="center"/>
+        <w:tblBorders>
+          <w:top w:val="single" w:sz="8" w:space="0" w:color="000000"/>
+          <w:bottom w:val="single" w:sz="8" w:space="0" w:color="000000"/>
+          <w:insideH w:val="single" w:sz="2" w:space="0" w:color="BFBFBF"/>
+        </w:tblBorders>
+        <w:tblLayout w:type="fixed"/>
+        <w:tblCellMar>
+          <w:left w:w="60" w:type="dxa"/>
+          <w:right w:w="60" w:type="dxa"/>
+        </w:tblCellMar>
+      </w:tblPr>
+      <w:tblGrid>
+        <w:gridCol w:w="1113"/>
+        <w:gridCol w:w="527"/>
+        <w:gridCol w:w="527"/>
+        <w:gridCol w:w="527"/>
+        <w:gridCol w:w="527"/>
+        <w:gridCol w:w="527"/>
+        <w:gridCol w:w="527"/>
+        <w:gridCol w:w="527"/>
+        <w:gridCol w:w="527"/>
+        <w:gridCol w:w="527"/>
+        <w:gridCol w:w="527"/>
+        <w:gridCol w:w="527"/>
+        <w:gridCol w:w="527"/>
+        <w:gridCol w:w="527"/>
+        <w:gridCol w:w="527"/>
+      </w:tblGrid>
+      <w:tr>
+        <w:trPr>
+          <w:tblHeader/>
+        </w:trPr>
+        <w:tc>
+          <w:tcPr>
+            <w:tcW w:w="1113" w:type="dxa"/>
+            <w:shd w:val="clear" w:color="auto" w:fill="F2F2F2"/>
+            <w:vAlign w:val="center"/>
+          </w:tcPr>
+          <w:p>
+            <w:pPr>
+              <w:spacing w:before="20" w:after="20" w:line="240" w:lineRule="auto"/>
+              <w:jc w:val="left"/>
+            </w:pPr>
+            <w:r>
+              <w:rPr>
+                <w:rFonts w:asciiTheme="majorBidi" w:hAnsiTheme="majorBidi" w:cstheme="majorBidi"/>
+                <w:b/>
+                <w:bCs/>
+                <w:sz w:val="16"/>
+                <w:szCs w:val="16"/>
+              </w:rPr>
+              <w:t xml:space="preserve">Probe </w:t>
+            </w:r>
+            <w:r>
+              <w:rPr>
+                <w:rFonts w:asciiTheme="majorBidi" w:hAnsiTheme="majorBidi" w:cstheme="majorBidi"/>
+                <w:b/>
+                <w:bCs/>
+                <w:sz w:val="16"/>
+                <w:szCs w:val="16"/>
+              </w:rPr>
+              <w:t xml:space="preserve">V</w:t>
+            </w:r>
+            <w:r>
+              <w:rPr>
+                <w:rFonts w:asciiTheme="majorBidi" w:hAnsiTheme="majorBidi" w:cstheme="majorBidi"/>
+                <w:b/>
+                <w:bCs/>
+                <w:sz w:val="16"/>
+                <w:szCs w:val="16"/>
+                <w:vertAlign w:val="subscript"/>
+              </w:rPr>
+              <w:t xml:space="preserve">k</w:t>
+            </w:r>
+            <w:r>
+              <w:rPr>
+                <w:rFonts w:asciiTheme="majorBidi" w:hAnsiTheme="majorBidi" w:cstheme="majorBidi"/>
+                <w:b/>
+                <w:bCs/>
+                <w:sz w:val="16"/>
+                <w:szCs w:val="16"/>
+              </w:rPr>
+              <w:t xml:space="preserve"> (V)</w:t>
+            </w:r>
+          </w:p>
+        </w:tc>
+        <w:tc>
+          <w:tcPr>
+            <w:tcW w:w="527" w:type="dxa"/>
+            <w:shd w:val="clear" w:color="auto" w:fill="F2F2F2"/>
+            <w:vAlign w:val="center"/>
+          </w:tcPr>
+          <w:p>
+            <w:pPr>
+              <w:spacing w:before="20" w:after="20" w:line="240" w:lineRule="auto"/>
+              <w:jc w:val="center"/>
+            </w:pPr>
+            <w:r>
+              <w:rPr>
+                <w:rFonts w:asciiTheme="majorBidi" w:hAnsiTheme="majorBidi" w:cstheme="majorBidi"/>
+                <w:b/>
+                <w:bCs/>
+                <w:sz w:val="16"/>
+                <w:szCs w:val="16"/>
+              </w:rPr>
+              <w:t xml:space="preserve">8.00</w:t>
+            </w:r>
+          </w:p>
+        </w:tc>
+        <w:tc>
+          <w:tcPr>
+            <w:tcW w:w="527" w:type="dxa"/>
+            <w:shd w:val="clear" w:color="auto" w:fill="F2F2F2"/>
+            <w:vAlign w:val="center"/>
+          </w:tcPr>
+          <w:p>
+            <w:pPr>
+              <w:spacing w:before="20" w:after="20" w:line="240" w:lineRule="auto"/>
+              <w:jc w:val="center"/>
+            </w:pPr>
+            <w:r>
+              <w:rPr>
+                <w:rFonts w:asciiTheme="majorBidi" w:hAnsiTheme="majorBidi" w:cstheme="majorBidi"/>
+                <w:b/>
+                <w:bCs/>
+                <w:sz w:val="16"/>
+                <w:szCs w:val="16"/>
+              </w:rPr>
+              <w:t xml:space="preserve">10.08</w:t>
+            </w:r>
+          </w:p>
+        </w:tc>
+        <w:tc>
+          <w:tcPr>
+            <w:tcW w:w="527" w:type="dxa"/>
+            <w:shd w:val="clear" w:color="auto" w:fill="F2F2F2"/>
+            <w:vAlign w:val="center"/>
+          </w:tcPr>
+          <w:p>
+            <w:pPr>
+              <w:spacing w:before="20" w:after="20" w:line="240" w:lineRule="auto"/>
+              <w:jc w:val="center"/>
+            </w:pPr>
+            <w:r>
+              <w:rPr>
+                <w:rFonts w:asciiTheme="majorBidi" w:hAnsiTheme="majorBidi" w:cstheme="majorBidi"/>
+                <w:b/>
+                <w:bCs/>
+                <w:sz w:val="16"/>
+                <w:szCs w:val="16"/>
+              </w:rPr>
+              <w:t xml:space="preserve">12.15</w:t>
+            </w:r>
+          </w:p>
+        </w:tc>
+        <w:tc>
+          <w:tcPr>
+            <w:tcW w:w="527" w:type="dxa"/>
+            <w:shd w:val="clear" w:color="auto" w:fill="F2F2F2"/>
+            <w:vAlign w:val="center"/>
+          </w:tcPr>
+          <w:p>
+            <w:pPr>
+              <w:spacing w:before="20" w:after="20" w:line="240" w:lineRule="auto"/>
+              <w:jc w:val="center"/>
+            </w:pPr>
+            <w:r>
+              <w:rPr>
+                <w:rFonts w:asciiTheme="majorBidi" w:hAnsiTheme="majorBidi" w:cstheme="majorBidi"/>
+                <w:b/>
+                <w:bCs/>
+                <w:sz w:val="16"/>
+                <w:szCs w:val="16"/>
+              </w:rPr>
+              <w:t xml:space="preserve">14.23</w:t>
+            </w:r>
+          </w:p>
+        </w:tc>
+        <w:tc>
+          <w:tcPr>
+            <w:tcW w:w="527" w:type="dxa"/>
+            <w:shd w:val="clear" w:color="auto" w:fill="F2F2F2"/>
+            <w:vAlign w:val="center"/>
+          </w:tcPr>
+          <w:p>
+            <w:pPr>
+              <w:spacing w:before="20" w:after="20" w:line="240" w:lineRule="auto"/>
+              <w:jc w:val="center"/>
+            </w:pPr>
+            <w:r>
+              <w:rPr>
+                <w:rFonts w:asciiTheme="majorBidi" w:hAnsiTheme="majorBidi" w:cstheme="majorBidi"/>
+                <w:b/>
+                <w:bCs/>
+                <w:sz w:val="16"/>
+                <w:szCs w:val="16"/>
+              </w:rPr>
+              <w:t xml:space="preserve">16.31</w:t>
+            </w:r>
+          </w:p>
+        </w:tc>
+        <w:tc>
+          <w:tcPr>
+            <w:tcW w:w="527" w:type="dxa"/>
+            <w:shd w:val="clear" w:color="auto" w:fill="F2F2F2"/>
+            <w:vAlign w:val="center"/>
+          </w:tcPr>
+          <w:p>
+            <w:pPr>
+              <w:spacing w:before="20" w:after="20" w:line="240" w:lineRule="auto"/>
+              <w:jc w:val="center"/>
+            </w:pPr>
+            <w:r>
+              <w:rPr>
+                <w:rFonts w:asciiTheme="majorBidi" w:hAnsiTheme="majorBidi" w:cstheme="majorBidi"/>
+                <w:b/>
+                <w:bCs/>
+                <w:sz w:val="16"/>
+                <w:szCs w:val="16"/>
+              </w:rPr>
+              <w:t xml:space="preserve">18.38</w:t>
+            </w:r>
+          </w:p>
+        </w:tc>
+        <w:tc>
+          <w:tcPr>
+            <w:tcW w:w="527" w:type="dxa"/>
+            <w:shd w:val="clear" w:color="auto" w:fill="F2F2F2"/>
+            <w:vAlign w:val="center"/>
+          </w:tcPr>
+          <w:p>
+            <w:pPr>
+              <w:spacing w:before="20" w:after="20" w:line="240" w:lineRule="auto"/>
+              <w:jc w:val="center"/>
+            </w:pPr>
+            <w:r>
+              <w:rPr>
+                <w:rFonts w:asciiTheme="majorBidi" w:hAnsiTheme="majorBidi" w:cstheme="majorBidi"/>
+                <w:b/>
+                <w:bCs/>
+                <w:sz w:val="16"/>
+                <w:szCs w:val="16"/>
+              </w:rPr>
+              <w:t xml:space="preserve">20.46</w:t>
+            </w:r>
+          </w:p>
+        </w:tc>
+        <w:tc>
+          <w:tcPr>
+            <w:tcW w:w="527" w:type="dxa"/>
+            <w:shd w:val="clear" w:color="auto" w:fill="F2F2F2"/>
+            <w:vAlign w:val="center"/>
+          </w:tcPr>
+          <w:p>
+            <w:pPr>
+              <w:spacing w:before="20" w:after="20" w:line="240" w:lineRule="auto"/>
+              <w:jc w:val="center"/>
+            </w:pPr>
+            <w:r>
+              <w:rPr>
+                <w:rFonts w:asciiTheme="majorBidi" w:hAnsiTheme="majorBidi" w:cstheme="majorBidi"/>
+                <w:b/>
+                <w:bCs/>
+                <w:sz w:val="16"/>
+                <w:szCs w:val="16"/>
+              </w:rPr>
+              <w:t xml:space="preserve">22.54</w:t>
+            </w:r>
+          </w:p>
+        </w:tc>
+        <w:tc>
+          <w:tcPr>
+            <w:tcW w:w="527" w:type="dxa"/>
+            <w:shd w:val="clear" w:color="auto" w:fill="F2F2F2"/>
+            <w:vAlign w:val="center"/>
+          </w:tcPr>
+          <w:p>
+            <w:pPr>
+              <w:spacing w:before="20" w:after="20" w:line="240" w:lineRule="auto"/>
+              <w:jc w:val="center"/>
+            </w:pPr>
+            <w:r>
+              <w:rPr>
+                <w:rFonts w:asciiTheme="majorBidi" w:hAnsiTheme="majorBidi" w:cstheme="majorBidi"/>
+                <w:b/>
+                <w:bCs/>
+                <w:sz w:val="16"/>
+                <w:szCs w:val="16"/>
+              </w:rPr>
+              <w:t xml:space="preserve">24.62</w:t>
+            </w:r>
+          </w:p>
+        </w:tc>
+        <w:tc>
+          <w:tcPr>
+            <w:tcW w:w="527" w:type="dxa"/>
+            <w:shd w:val="clear" w:color="auto" w:fill="F2F2F2"/>
+            <w:vAlign w:val="center"/>
+          </w:tcPr>
+          <w:p>
+            <w:pPr>
+              <w:spacing w:before="20" w:after="20" w:line="240" w:lineRule="auto"/>
+              <w:jc w:val="center"/>
+            </w:pPr>
+            <w:r>
+              <w:rPr>
+                <w:rFonts w:asciiTheme="majorBidi" w:hAnsiTheme="majorBidi" w:cstheme="majorBidi"/>
+                <w:b/>
+                <w:bCs/>
+                <w:sz w:val="16"/>
+                <w:szCs w:val="16"/>
+              </w:rPr>
+              <w:t xml:space="preserve">26.69</w:t>
+            </w:r>
+          </w:p>
+        </w:tc>
+        <w:tc>
+          <w:tcPr>
+            <w:tcW w:w="527" w:type="dxa"/>
+            <w:shd w:val="clear" w:color="auto" w:fill="F2F2F2"/>
+            <w:vAlign w:val="center"/>
+          </w:tcPr>
+          <w:p>
+            <w:pPr>
+              <w:spacing w:before="20" w:after="20" w:line="240" w:lineRule="auto"/>
+              <w:jc w:val="center"/>
+            </w:pPr>
+            <w:r>
+              <w:rPr>
+                <w:rFonts w:asciiTheme="majorBidi" w:hAnsiTheme="majorBidi" w:cstheme="majorBidi"/>
+                <w:b/>
+                <w:bCs/>
+                <w:sz w:val="16"/>
+                <w:szCs w:val="16"/>
+              </w:rPr>
+              <w:t xml:space="preserve">28.77</w:t>
+            </w:r>
+          </w:p>
+        </w:tc>
+        <w:tc>
+          <w:tcPr>
+            <w:tcW w:w="527" w:type="dxa"/>
+            <w:shd w:val="clear" w:color="auto" w:fill="F2F2F2"/>
+            <w:vAlign w:val="center"/>
+          </w:tcPr>
+          <w:p>
+            <w:pPr>
+              <w:spacing w:before="20" w:after="20" w:line="240" w:lineRule="auto"/>
+              <w:jc w:val="center"/>
+            </w:pPr>
+            <w:r>
+              <w:rPr>
+                <w:rFonts w:asciiTheme="majorBidi" w:hAnsiTheme="majorBidi" w:cstheme="majorBidi"/>
+                <w:b/>
+                <w:bCs/>
+                <w:sz w:val="16"/>
+                <w:szCs w:val="16"/>
+              </w:rPr>
+              <w:t xml:space="preserve">30.85</w:t>
+            </w:r>
+          </w:p>
+        </w:tc>
+        <w:tc>
+          <w:tcPr>
+            <w:tcW w:w="527" w:type="dxa"/>
+            <w:shd w:val="clear" w:color="auto" w:fill="F2F2F2"/>
+            <w:vAlign w:val="center"/>
+          </w:tcPr>
+          <w:p>
+            <w:pPr>
+              <w:spacing w:before="20" w:after="20" w:line="240" w:lineRule="auto"/>
+              <w:jc w:val="center"/>
+            </w:pPr>
+            <w:r>
+              <w:rPr>
+                <w:rFonts w:asciiTheme="majorBidi" w:hAnsiTheme="majorBidi" w:cstheme="majorBidi"/>
+                <w:b/>
+                <w:bCs/>
+                <w:sz w:val="16"/>
+                <w:szCs w:val="16"/>
+              </w:rPr>
+              <w:t xml:space="preserve">32.92</w:t>
+            </w:r>
+          </w:p>
+        </w:tc>
+        <w:tc>
+          <w:tcPr>
+            <w:tcW w:w="527" w:type="dxa"/>
+            <w:shd w:val="clear" w:color="auto" w:fill="F2F2F2"/>
+            <w:vAlign w:val="center"/>
+          </w:tcPr>
+          <w:p>
+            <w:pPr>
+              <w:spacing w:before="20" w:after="20" w:line="240" w:lineRule="auto"/>
+              <w:jc w:val="center"/>
+            </w:pPr>
+            <w:r>
+              <w:rPr>
+                <w:rFonts w:asciiTheme="majorBidi" w:hAnsiTheme="majorBidi" w:cstheme="majorBidi"/>
+                <w:b/>
+                <w:bCs/>
+                <w:sz w:val="16"/>
+                <w:szCs w:val="16"/>
+              </w:rPr>
+              <w:t xml:space="preserve">35.00</w:t>
+            </w:r>
+          </w:p>
+        </w:tc>
+      </w:tr>
+      <w:tr>
+        <w:trPr/>
+        <w:tc>
+          <w:tcPr>
+            <w:tcW w:w="1113" w:type="dxa"/>
+            <w:vAlign w:val="center"/>
+          </w:tcPr>
+          <w:p>
+            <w:pPr>
+              <w:spacing w:before="20" w:after="20" w:line="240" w:lineRule="auto"/>
+              <w:jc w:val="left"/>
+            </w:pPr>
+            <w:r>
+              <w:rPr>
+                <w:rFonts w:asciiTheme="majorBidi" w:hAnsiTheme="majorBidi" w:cstheme="majorBidi"/>
+                <w:sz w:val="16"/>
+                <w:szCs w:val="16"/>
+              </w:rPr>
+              <w:t xml:space="preserve">I</w:t>
+            </w:r>
+            <w:r>
+              <w:rPr>
+                <w:rFonts w:asciiTheme="majorBidi" w:hAnsiTheme="majorBidi" w:cstheme="majorBidi"/>
+                <w:sz w:val="16"/>
+                <w:szCs w:val="16"/>
+                <w:vertAlign w:val="subscript"/>
+              </w:rPr>
+              <w:t xml:space="preserve">k</w:t>
+            </w:r>
+            <w:r>
+              <w:rPr>
+                <w:rFonts w:asciiTheme="majorBidi" w:hAnsiTheme="majorBidi" w:cstheme="majorBidi"/>
+                <w:sz w:val="16"/>
+                <w:szCs w:val="16"/>
+              </w:rPr>
+              <w:t xml:space="preserve"> (A)</w:t>
+            </w:r>
+          </w:p>
+        </w:tc>
+        <w:tc>
+          <w:tcPr>
+            <w:tcW w:w="527" w:type="dxa"/>
+            <w:vAlign w:val="center"/>
+          </w:tcPr>
+          <w:p>
+            <w:pPr>
+              <w:spacing w:before="20" w:after="20" w:line="240" w:lineRule="auto"/>
+              <w:jc w:val="center"/>
+            </w:pPr>
+            <w:r>
+              <w:rPr>
+                <w:rFonts w:asciiTheme="majorBidi" w:hAnsiTheme="majorBidi" w:cstheme="majorBidi"/>
+                <w:sz w:val="16"/>
+                <w:szCs w:val="16"/>
+              </w:rPr>
+              <w:t xml:space="preserve">1.140</w:t>
+            </w:r>
+          </w:p>
+        </w:tc>
+        <w:tc>
+          <w:tcPr>
+            <w:tcW w:w="527" w:type="dxa"/>
+            <w:vAlign w:val="center"/>
+          </w:tcPr>
+          <w:p>
+            <w:pPr>
+              <w:spacing w:before="20" w:after="20" w:line="240" w:lineRule="auto"/>
+              <w:jc w:val="center"/>
+            </w:pPr>
+            <w:r>
+              <w:rPr>
+                <w:rFonts w:asciiTheme="majorBidi" w:hAnsiTheme="majorBidi" w:cstheme="majorBidi"/>
+                <w:sz w:val="16"/>
+                <w:szCs w:val="16"/>
+              </w:rPr>
+              <w:t xml:space="preserve">1.139</w:t>
+            </w:r>
+          </w:p>
+        </w:tc>
+        <w:tc>
+          <w:tcPr>
+            <w:tcW w:w="527" w:type="dxa"/>
+            <w:vAlign w:val="center"/>
+          </w:tcPr>
+          <w:p>
+            <w:pPr>
+              <w:spacing w:before="20" w:after="20" w:line="240" w:lineRule="auto"/>
+              <w:jc w:val="center"/>
+            </w:pPr>
+            <w:r>
+              <w:rPr>
+                <w:rFonts w:asciiTheme="majorBidi" w:hAnsiTheme="majorBidi" w:cstheme="majorBidi"/>
+                <w:sz w:val="16"/>
+                <w:szCs w:val="16"/>
+              </w:rPr>
+              <w:t xml:space="preserve">1.136</w:t>
+            </w:r>
+          </w:p>
+        </w:tc>
+        <w:tc>
+          <w:tcPr>
+            <w:tcW w:w="527" w:type="dxa"/>
+            <w:vAlign w:val="center"/>
+          </w:tcPr>
+          <w:p>
+            <w:pPr>
+              <w:spacing w:before="20" w:after="20" w:line="240" w:lineRule="auto"/>
+              <w:jc w:val="center"/>
+            </w:pPr>
+            <w:r>
+              <w:rPr>
+                <w:rFonts w:asciiTheme="majorBidi" w:hAnsiTheme="majorBidi" w:cstheme="majorBidi"/>
+                <w:sz w:val="16"/>
+                <w:szCs w:val="16"/>
+              </w:rPr>
+              <w:t xml:space="preserve">1.121</w:t>
+            </w:r>
+          </w:p>
+        </w:tc>
+        <w:tc>
+          <w:tcPr>
+            <w:tcW w:w="527" w:type="dxa"/>
+            <w:vAlign w:val="center"/>
+          </w:tcPr>
+          <w:p>
+            <w:pPr>
+              <w:spacing w:before="20" w:after="20" w:line="240" w:lineRule="auto"/>
+              <w:jc w:val="center"/>
+            </w:pPr>
+            <w:r>
+              <w:rPr>
+                <w:rFonts w:asciiTheme="majorBidi" w:hAnsiTheme="majorBidi" w:cstheme="majorBidi"/>
+                <w:sz w:val="16"/>
+                <w:szCs w:val="16"/>
+              </w:rPr>
+              <w:t xml:space="preserve">1.028</w:t>
+            </w:r>
+          </w:p>
+        </w:tc>
+        <w:tc>
+          <w:tcPr>
+            <w:tcW w:w="527" w:type="dxa"/>
+            <w:vAlign w:val="center"/>
+          </w:tcPr>
+          <w:p>
+            <w:pPr>
+              <w:spacing w:before="20" w:after="20" w:line="240" w:lineRule="auto"/>
+              <w:jc w:val="center"/>
+            </w:pPr>
+            <w:r>
+              <w:rPr>
+                <w:rFonts w:asciiTheme="majorBidi" w:hAnsiTheme="majorBidi" w:cstheme="majorBidi"/>
+                <w:sz w:val="16"/>
+                <w:szCs w:val="16"/>
+              </w:rPr>
+              <w:t xml:space="preserve">0.463</w:t>
+            </w:r>
+          </w:p>
+        </w:tc>
+        <w:tc>
+          <w:tcPr>
+            <w:tcW w:w="527" w:type="dxa"/>
+            <w:vAlign w:val="center"/>
+          </w:tcPr>
+          <w:p>
+            <w:pPr>
+              <w:spacing w:before="20" w:after="20" w:line="240" w:lineRule="auto"/>
+              <w:jc w:val="center"/>
+            </w:pPr>
+            <w:r>
+              <w:rPr>
+                <w:rFonts w:asciiTheme="majorBidi" w:hAnsiTheme="majorBidi" w:cstheme="majorBidi"/>
+                <w:sz w:val="16"/>
+                <w:szCs w:val="16"/>
+              </w:rPr>
+              <w:t xml:space="preserve">0.456</w:t>
+            </w:r>
+          </w:p>
+        </w:tc>
+        <w:tc>
+          <w:tcPr>
+            <w:tcW w:w="527" w:type="dxa"/>
+            <w:vAlign w:val="center"/>
+          </w:tcPr>
+          <w:p>
+            <w:pPr>
+              <w:spacing w:before="20" w:after="20" w:line="240" w:lineRule="auto"/>
+              <w:jc w:val="center"/>
+            </w:pPr>
+            <w:r>
+              <w:rPr>
+                <w:rFonts w:asciiTheme="majorBidi" w:hAnsiTheme="majorBidi" w:cstheme="majorBidi"/>
+                <w:sz w:val="16"/>
+                <w:szCs w:val="16"/>
+              </w:rPr>
+              <w:t xml:space="preserve">0.455</w:t>
+            </w:r>
+          </w:p>
+        </w:tc>
+        <w:tc>
+          <w:tcPr>
+            <w:tcW w:w="527" w:type="dxa"/>
+            <w:vAlign w:val="center"/>
+          </w:tcPr>
+          <w:p>
+            <w:pPr>
+              <w:spacing w:before="20" w:after="20" w:line="240" w:lineRule="auto"/>
+              <w:jc w:val="center"/>
+            </w:pPr>
+            <w:r>
+              <w:rPr>
+                <w:rFonts w:asciiTheme="majorBidi" w:hAnsiTheme="majorBidi" w:cstheme="majorBidi"/>
+                <w:sz w:val="16"/>
+                <w:szCs w:val="16"/>
+              </w:rPr>
+              <w:t xml:space="preserve">0.454</w:t>
+            </w:r>
+          </w:p>
+        </w:tc>
+        <w:tc>
+          <w:tcPr>
+            <w:tcW w:w="527" w:type="dxa"/>
+            <w:vAlign w:val="center"/>
+          </w:tcPr>
+          <w:p>
+            <w:pPr>
+              <w:spacing w:before="20" w:after="20" w:line="240" w:lineRule="auto"/>
+              <w:jc w:val="center"/>
+            </w:pPr>
+            <w:r>
+              <w:rPr>
+                <w:rFonts w:asciiTheme="majorBidi" w:hAnsiTheme="majorBidi" w:cstheme="majorBidi"/>
+                <w:sz w:val="16"/>
+                <w:szCs w:val="16"/>
+              </w:rPr>
+              <w:t xml:space="preserve">0.439</w:t>
+            </w:r>
+          </w:p>
+        </w:tc>
+        <w:tc>
+          <w:tcPr>
+            <w:tcW w:w="527" w:type="dxa"/>
+            <w:vAlign w:val="center"/>
+          </w:tcPr>
+          <w:p>
+            <w:pPr>
+              <w:spacing w:before="20" w:after="20" w:line="240" w:lineRule="auto"/>
+              <w:jc w:val="center"/>
+            </w:pPr>
+            <w:r>
+              <w:rPr>
+                <w:rFonts w:asciiTheme="majorBidi" w:hAnsiTheme="majorBidi" w:cstheme="majorBidi"/>
+                <w:sz w:val="16"/>
+                <w:szCs w:val="16"/>
+              </w:rPr>
+              <w:t xml:space="preserve">0.147</w:t>
+            </w:r>
+          </w:p>
+        </w:tc>
+        <w:tc>
+          <w:tcPr>
+            <w:tcW w:w="527" w:type="dxa"/>
+            <w:vAlign w:val="center"/>
+          </w:tcPr>
+          <w:p>
+            <w:pPr>
+              <w:spacing w:before="20" w:after="20" w:line="240" w:lineRule="auto"/>
+              <w:jc w:val="center"/>
+            </w:pPr>
+            <w:r>
+              <w:rPr>
+                <w:rFonts w:asciiTheme="majorBidi" w:hAnsiTheme="majorBidi" w:cstheme="majorBidi"/>
+                <w:sz w:val="16"/>
+                <w:szCs w:val="16"/>
+              </w:rPr>
+              <w:t xml:space="preserve">0</w:t>
+            </w:r>
+          </w:p>
+        </w:tc>
+        <w:tc>
+          <w:tcPr>
+            <w:tcW w:w="527" w:type="dxa"/>
+            <w:vAlign w:val="center"/>
+          </w:tcPr>
+          <w:p>
+            <w:pPr>
+              <w:spacing w:before="20" w:after="20" w:line="240" w:lineRule="auto"/>
+              <w:jc w:val="center"/>
+            </w:pPr>
+            <w:r>
+              <w:rPr>
+                <w:rFonts w:asciiTheme="majorBidi" w:hAnsiTheme="majorBidi" w:cstheme="majorBidi"/>
+                <w:sz w:val="16"/>
+                <w:szCs w:val="16"/>
+              </w:rPr>
+              <w:t xml:space="preserve">0</w:t>
+            </w:r>
+          </w:p>
+        </w:tc>
+        <w:tc>
+          <w:tcPr>
+            <w:tcW w:w="527" w:type="dxa"/>
+            <w:vAlign w:val="center"/>
+          </w:tcPr>
+          <w:p>
+            <w:pPr>
+              <w:spacing w:before="20" w:after="20" w:line="240" w:lineRule="auto"/>
+              <w:jc w:val="center"/>
+            </w:pPr>
+            <w:r>
+              <w:rPr>
+                <w:rFonts w:asciiTheme="majorBidi" w:hAnsiTheme="majorBidi" w:cstheme="majorBidi"/>
+                <w:sz w:val="16"/>
+                <w:szCs w:val="16"/>
+              </w:rPr>
+              <w:t xml:space="preserve">0</w:t>
+            </w:r>
+          </w:p>
+        </w:tc>
+      </w:tr>
+    </w:tbl>
+    <w:p>
+      <w:pPr>
+        <w:spacing w:after="120"/>
+      </w:pPr>
+    </w:p>
+    <w:p>
+      <w:pPr>
+        <w:keepNext/>
+        <w:spacing w:before="200" w:after="80"/>
+      </w:pPr>
+      <w:r>
+        <w:rPr>
+          <w:rFonts w:asciiTheme="majorBidi" w:hAnsiTheme="majorBidi" w:cstheme="majorBidi"/>
+          <w:b/>
+          <w:bCs/>
+          <w:sz w:val="21"/>
+          <w:szCs w:val="21"/>
+        </w:rPr>
+        <w:t xml:space="preserve">S2 Statistical robustness</w:t>
+      </w:r>
+    </w:p>
+    <w:p>
+      <w:pPr>
+        <w:spacing w:after="80" w:line="252" w:lineRule="auto"/>
+        <w:ind w:firstLine="284"/>
+        <w:jc w:val="both"/>
+      </w:pPr>
+      <w:r>
+        <w:rPr>
+          <w:rFonts w:asciiTheme="majorBidi" w:hAnsiTheme="majorBidi" w:cstheme="majorBidi"/>
+          <w:sz w:val="21"/>
+          <w:szCs w:val="21"/>
+        </w:rPr>
+        <w:t xml:space="preserve">To separate real differences from seed noise, the scenario suites were repeated with 10 scenario seeds (which vary the cloud-noise stream, the step instant and the cloud phase), and the stage-1 DNN was retrained with five seeds (paired with the scenario seed modulo 5). Table S3 gives the mean ± standard deviation and Table S4 the paired Wilcoxon signed-rank tests; with only ten pairs, a difference can reach p &lt; 0.05 only if its sign is consistent across the seeds, so small but consistent differences are flagged even when they are practically irrelevant. The seed means differ slightly from the single deterministic runs of Table 11 (for example 99.36% against 99.32% for the hybrid on shading).</w:t>
       </w:r>
     </w:p>
     <w:p>
@@ -92,7 +2968,7 @@
           <w:sz w:val="21"/>
           <w:szCs w:val="21"/>
         </w:rPr>
-        <w:t xml:space="preserve">Table S2</w:t>
+        <w:t xml:space="preserve">Table S4</w:t>
       </w:r>
       <w:r>
         <w:rPr>
@@ -117,7 +2993,7 @@
           <w:sz w:val="18"/>
           <w:szCs w:val="18"/>
         </w:rPr>
-        <w:t xml:space="preserve">Table S1</w:t>
+        <w:t xml:space="preserve">Table S3</w:t>
       </w:r>
       <w:r>
         <w:rPr>
@@ -1625,7 +4501,7 @@
           <w:sz w:val="18"/>
           <w:szCs w:val="18"/>
         </w:rPr>
-        <w:t xml:space="preserve">Table S2</w:t>
+        <w:t xml:space="preserve">Table S4</w:t>
       </w:r>
       <w:r>
         <w:rPr>
@@ -3174,7 +6050,7 @@
           <w:sz w:val="21"/>
           <w:szCs w:val="21"/>
         </w:rPr>
-        <w:t xml:space="preserve">Design ablation of the stage-1 estimator</w:t>
+        <w:t xml:space="preserve">S3 Design ablation of the stage-1 estimator</w:t>
       </w:r>
     </w:p>
     <w:p>
@@ -3189,7 +6065,7 @@
           <w:sz w:val="21"/>
           <w:szCs w:val="21"/>
         </w:rPr>
-        <w:t xml:space="preserve">To test whether the network design matters, the stage-1 estimator was replaced by smaller and larger networks, by regularized variants, by a linear regressor on the same 16 inputs, and by a network that sees only G and T (Table S3). The architecture used in the other experiments was chosen a priori and was not tuned on the test years (there was no hyper-parameter search); the training years, the early-stopping years (2015–2016) and the test years (2019–2020) are disjoint. All neural variants with the 16 inputs end up within 0.02 points of each other in closed-loop shading efficiency (99.33–99.35%), although their offline RMSE ranges from 0.75 to 0.94 V and their size from 1,633 to 103,169 parameters; the differences are of the order of the seed-to-seed spread. A network with only 1,633 parameters and 1,568 multiply–accumulate operations therefore performs as well in the closed loop as the 27,009-parameter network. The information content of the scan, not the network capacity, is what matters. A linear regressor on the scan currents already reaches 97.79% (success 88.9%), and a network that sees only G and T, without the scan currents, falls to 80.18% with the success rate of P&amp;O (33.3%). This result shows that the benefit comes from the scan and that the DNN is one of several adequate estimators; a smaller network or a tree-based estimator would do equally well in this setting.</w:t>
+        <w:t xml:space="preserve">To test whether the network design matters, the stage-1 estimator was replaced by smaller and larger networks, by regularized variants, by a linear regressor on the same 16 inputs, and by a network that sees only G and T (Table S5). The architecture used in the other experiments was chosen a priori and was not tuned on the test years (there was no hyper-parameter search); the training years, the early-stopping years (2015–2016) and the test years (2019–2020) are disjoint. All neural variants with the 16 inputs end up within 0.02 points of each other in closed-loop shading efficiency (99.33–99.35%), although their offline RMSE ranges from 0.75 to 0.94 V and their size from 1,633 to 103,169 parameters; the differences are of the order of the seed-to-seed spread. A network with only 1,633 parameters and 1,568 multiply–accumulate operations therefore performs as well in the closed loop as the 27,009-parameter network. The information content of the scan, not the network capacity, is what matters. A linear regressor on the scan currents already reaches 97.79% (success 88.9%), and a network that sees only G and T, without the scan currents, falls to 80.18% with the success rate of P&amp;O (33.3%). This result shows that the benefit comes from the scan and that the DNN is one of several adequate estimators; a smaller network or a tree-based estimator would do equally well in this setting.</w:t>
       </w:r>
     </w:p>
     <w:p>
@@ -3206,7 +6082,7 @@
           <w:sz w:val="18"/>
           <w:szCs w:val="18"/>
         </w:rPr>
-        <w:t xml:space="preserve">Table S3</w:t>
+        <w:t xml:space="preserve">Table S5</w:t>
       </w:r>
       <w:r>
         <w:rPr>
@@ -5121,7 +7997,7 @@
           <w:sz w:val="21"/>
           <w:szCs w:val="21"/>
         </w:rPr>
-        <w:t xml:space="preserve">Boost-converter plant</w:t>
+        <w:t xml:space="preserve">S4 Boost-converter plant</w:t>
       </w:r>
     </w:p>
     <w:p>
@@ -5154,7 +8030,7 @@
           <w:sz w:val="21"/>
           <w:szCs w:val="21"/>
         </w:rPr>
-        <w:t xml:space="preserve"> shows the irradiance step on this plant, with power, PV voltage, duty cycle and inductor current. The averaged continuous-conduction model was compared with a switching-level model (PWM with 100 steps per period, diode with discontinuous-conduction clamp) driven by the same command sequence (Table S4). For the irradiance step and for the shading pattern outside the large scan jumps, the largest deviation is 0.049 V and 0.10% of the rated power. During the 14 large jumps of a scan (probe voltages up to 18 V away from the present voltage), the deviation reaches 1.45 V and 4.7% of the rated power because neither model has settled within the window, so the averaged model should not be trusted for the detailed shape of the scan transients. Both models were implemented in this study and were not compared with a hardware converter.</w:t>
+        <w:t xml:space="preserve"> shows the irradiance step on this plant, with power, PV voltage, duty cycle and inductor current. The averaged continuous-conduction model was compared with a switching-level model (PWM with 100 steps per period, diode with discontinuous-conduction clamp) driven by the same command sequence (Table S6). For the irradiance step and for the shading pattern outside the large scan jumps, the largest deviation is 0.049 V and 0.10% of the rated power. During the 14 large jumps of a scan (probe voltages up to 18 V away from the present voltage), the deviation reaches 1.45 V and 4.7% of the rated power because neither model has settled within the window, so the averaged model should not be trusted for the detailed shape of the scan transients. Both models were implemented in this study and were not compared with a hardware converter.</w:t>
       </w:r>
     </w:p>
     <w:p>
@@ -5171,7 +8047,7 @@
           <w:sz w:val="18"/>
           <w:szCs w:val="18"/>
         </w:rPr>
-        <w:t xml:space="preserve">Table S4</w:t>
+        <w:t xml:space="preserve">Table S6</w:t>
       </w:r>
       <w:r>
         <w:rPr>
@@ -5819,7 +8695,7 @@
           <w:sz w:val="21"/>
           <w:szCs w:val="21"/>
         </w:rPr>
-        <w:t xml:space="preserve">The converter dynamics change the efficiency of the controllers by little (Table S5). The largest change is −0.58 points, for the plain ANN under partial shading; P&amp;O and IncCond change by −0.13 and −0.14 points under shading and by −0.09 and −0.10 points on the comprehensive scenario, and the hybrid by −0.10 points on the comprehensive scenario and −0.004 points under shading. On the step, cloud and ramp scenarios no controller changes by more than 0.06 points. The ranking of the controllers is unchanged.</w:t>
+        <w:t xml:space="preserve">The converter dynamics change the efficiency of the controllers by little (Table S7). The largest change is −0.58 points, for the plain ANN under partial shading; P&amp;O and IncCond change by −0.13 and −0.14 points under shading and by −0.09 and −0.10 points on the comprehensive scenario, and the hybrid by −0.10 points on the comprehensive scenario and −0.004 points under shading. On the step, cloud and ramp scenarios no controller changes by more than 0.06 points. The ranking of the controllers is unchanged.</w:t>
       </w:r>
     </w:p>
     <w:p>
@@ -5836,7 +8712,7 @@
           <w:sz w:val="18"/>
           <w:szCs w:val="18"/>
         </w:rPr>
-        <w:t xml:space="preserve">Table S5</w:t>
+        <w:t xml:space="preserve">Table S7</w:t>
       </w:r>
       <w:r>
         <w:rPr>
@@ -7105,7 +9981,7 @@
           <w:sz w:val="21"/>
           <w:szCs w:val="21"/>
         </w:rPr>
-        <w:t xml:space="preserve">Sensor noise and numerical precision</w:t>
+        <w:t xml:space="preserve">S5 Sensor noise and numerical precision</w:t>
       </w:r>
     </w:p>
     <w:p>
@@ -7120,7 +9996,7 @@
           <w:sz w:val="21"/>
           <w:szCs w:val="21"/>
         </w:rPr>
-        <w:t xml:space="preserve">To test sensitivity to measurement errors, Gaussian noise was added to the measured currents (0.5%), voltages (0.5%) and irradiance input (2%) on the nine shading patterns, and the efficiency was scored on the true values (Table S6). The scan-based controllers still solve every pattern, but their efficiency drops by about 0.6 points (hybrid 99.32% to 98.70%, Scan+P&amp;O 99.36% to 98.75%, tree-based variant 99.37% to 98.67%). The DNN scan-only variant, which has no P&amp;O stage, is unaffected (99.30% to 99.31%), and the sensor-less trackers change little (P&amp;O 80.41% to 80.25%), so the loss comes from P&amp;O dithering on noisy power readings and not from the network. PSO loses its perfect success rate (97.8%).</w:t>
+        <w:t xml:space="preserve">To test sensitivity to measurement errors, Gaussian noise was added to the measured currents (0.5%), voltages (0.5%) and irradiance input (2%) on the nine shading patterns, and the efficiency was scored on the true values (Table S8). The scan-based controllers still solve every pattern, but their efficiency drops by about 0.6 points (hybrid 99.32% to 98.70%, Scan+P&amp;O 99.36% to 98.75%, tree-based variant 99.37% to 98.67%). The DNN scan-only variant, which has no P&amp;O stage, is unaffected (99.30% to 99.31%), and the sensor-less trackers change little (P&amp;O 80.41% to 80.25%), so the loss comes from P&amp;O dithering on noisy power readings and not from the network. PSO loses its perfect success rate (97.8%).</w:t>
       </w:r>
     </w:p>
     <w:p>
@@ -7137,7 +10013,7 @@
           <w:sz w:val="18"/>
           <w:szCs w:val="18"/>
         </w:rPr>
-        <w:t xml:space="preserve">Table S6</w:t>
+        <w:t xml:space="preserve">Table S8</w:t>
       </w:r>
       <w:r>
         <w:rPr>
@@ -8310,7 +11186,7 @@
           <w:sz w:val="21"/>
           <w:szCs w:val="21"/>
         </w:rPr>
-        <w:t xml:space="preserve">Storing the weights in half precision halves the model size (108,036 to 54,660 bytes) and leaves the estimate essentially unchanged (largest deviation from float32 0.049 V, no change in closed-loop efficiency; Table S7). Post-training int8 quantization (emulated in numpy, not run on a microcontroller) gives 27,972 bytes but raises the RMSE from 0.78 to 1.98 V and the wrong-peak rate from 2.1% to 7.7%, with single outliers of up to 22 V; the closed-loop shading efficiency nevertheless stays at 99.32%, because the P&amp;O stage corrects the hand-off. A naive int8 conversion is therefore not recommended without calibration or quantization-aware training, which was not studied here.</w:t>
+        <w:t xml:space="preserve">Storing the weights in half precision halves the model size (108,036 to 54,660 bytes) and leaves the estimate essentially unchanged (largest deviation from float32 0.049 V, no change in closed-loop efficiency; Table S9). Post-training int8 quantization (emulated in numpy, not run on a microcontroller) gives 27,972 bytes but raises the RMSE from 0.78 to 1.98 V and the wrong-peak rate from 2.1% to 7.7%, with single outliers of up to 22 V; the closed-loop shading efficiency nevertheless stays at 99.32%, because the P&amp;O stage corrects the hand-off. A naive int8 conversion is therefore not recommended without calibration or quantization-aware training, which was not studied here.</w:t>
       </w:r>
     </w:p>
     <w:p>
@@ -8327,7 +11203,7 @@
           <w:sz w:val="18"/>
           <w:szCs w:val="18"/>
         </w:rPr>
-        <w:t xml:space="preserve">Table S7</w:t>
+        <w:t xml:space="preserve">Table S9</w:t>
       </w:r>
       <w:r>
         <w:rPr>

</xml_diff>